<commit_message>
SI: add Table S11 (validation vs experimental scatter); renumber old Table S11 to S12; update workbook
Co-Authored-By: Claude Sonnet 5.5 <noreply@anthropic.com>
Claude-Session: https://claude.ai/code/session_01Y1g9vByMLTE8eGJ9K81zt6
</commit_message>
<xml_diff>
--- a/Supplementary_original_order.docx
+++ b/Supplementary_original_order.docx
@@ -675,7 +675,7 @@
                 <w:sz w:val="20"/>
                 <w:szCs w:val="20"/>
               </w:rPr>
-              <w:t>Figure S7</w:t>
+              <w:t>Table S11; Figure S7</w:t>
             </w:r>
           </w:p>
         </w:tc>
@@ -743,7 +743,7 @@
                 <w:sz w:val="20"/>
                 <w:szCs w:val="20"/>
               </w:rPr>
-              <w:t>Table S11; Figures S8–S10</w:t>
+              <w:t>Table S12; Figures S8–S10</w:t>
             </w:r>
           </w:p>
         </w:tc>
@@ -20011,6 +20011,1137 @@
     </w:p>
     <w:p>
       <w:pPr>
+        <w:pStyle w:val="BodyText"/>
+        <w:spacing w:before="0" w:after="120" w:line="360" w:lineRule="auto"/>
+        <w:ind w:firstLine="0"/>
+        <w:jc w:val="both"/>
+      </w:pPr>
+      <w:r>
+        <w:t xml:space="preserve">Table S11 compares the simulated mass loss with the HBSS validation measurements and their experimental scatter.</w:t>
+      </w:r>
+    </w:p>
+    <w:p>
+      <w:pPr>
+        <w:pStyle w:val="Captions"/>
+        <w:keepNext/>
+        <w:spacing w:line="240" w:lineRule="auto" w:before="360" w:after="80"/>
+        <w:ind w:firstLine="0"/>
+        <w:jc w:val="both"/>
+      </w:pPr>
+      <w:r>
+        <w:rPr>
+          <w:b/>
+          <w:bCs/>
+          <w:sz w:val="20"/>
+          <w:szCs w:val="20"/>
+        </w:rPr>
+        <w:t xml:space="preserve">Table </w:t>
+      </w:r>
+      <w:r>
+        <w:rPr>
+          <w:b/>
+          <w:bCs/>
+          <w:sz w:val="20"/>
+          <w:szCs w:val="20"/>
+        </w:rPr>
+        <w:t>S</w:t>
+      </w:r>
+      <w:r>
+        <w:rPr>
+          <w:b/>
+          <w:bCs/>
+          <w:sz w:val="20"/>
+          <w:szCs w:val="20"/>
+        </w:rPr>
+        <w:fldChar w:fldCharType="begin"/>
+      </w:r>
+      <w:r>
+        <w:rPr>
+          <w:b/>
+          <w:bCs/>
+          <w:sz w:val="20"/>
+          <w:szCs w:val="20"/>
+        </w:rPr>
+        <w:instrText xml:space="preserve"> SEQ Table \* ARABIC </w:instrText>
+      </w:r>
+      <w:r>
+        <w:rPr>
+          <w:b/>
+          <w:bCs/>
+          <w:sz w:val="20"/>
+          <w:szCs w:val="20"/>
+        </w:rPr>
+        <w:fldChar w:fldCharType="separate"/>
+      </w:r>
+      <w:r>
+        <w:rPr>
+          <w:b/>
+          <w:bCs/>
+          <w:noProof/>
+          <w:sz w:val="20"/>
+          <w:szCs w:val="20"/>
+        </w:rPr>
+        <w:t>11</w:t>
+      </w:r>
+      <w:r>
+        <w:rPr>
+          <w:b/>
+          <w:bCs/>
+          <w:noProof/>
+          <w:sz w:val="20"/>
+          <w:szCs w:val="20"/>
+        </w:rPr>
+        <w:fldChar w:fldCharType="end"/>
+      </w:r>
+      <w:r>
+        <w:rPr>
+          <w:b/>
+          <w:bCs/>
+          <w:sz w:val="20"/>
+          <w:szCs w:val="20"/>
+        </w:rPr>
+        <w:t xml:space="preserve">.</w:t>
+      </w:r>
+      <w:r>
+        <w:rPr>
+          <w:b w:val="0"/>
+          <w:sz w:val="20"/>
+          <w:szCs w:val="20"/>
+        </w:rPr>
+        <w:t xml:space="preserve"> </w:t>
+      </w:r>
+      <w:r>
+        <w:rPr>
+          <w:b w:val="0"/>
+          <w:sz w:val="20"/>
+          <w:szCs w:val="20"/>
+        </w:rPr>
+        <w:t>Comparison of simulated and measured mass loss in HBSS (validation) with the experimental scatter. Experimental values are mean ± SD (n = 3); |Error|/SD is the absolute error divided by the SD at the same immersion time. The validation RMSE of 0.0159% (R² = 0.9734) corresponds to 8.6% of the mean measured mass loss (0.185%) and 5.1% of the 28-day value.</w:t>
+      </w:r>
+    </w:p>
+    <w:tbl>
+      <w:tblPr>
+        <w:tblW w:w="9026" w:type="dxa"/>
+        <w:jc w:val="center"/>
+        <w:tblBorders>
+          <w:top w:val="single" w:sz="12" w:space="0" w:color="000000"/>
+          <w:bottom w:val="single" w:sz="12" w:space="0" w:color="000000"/>
+        </w:tblBorders>
+        <w:tblLayout w:type="fixed"/>
+        <w:tblCellMar>
+          <w:top w:w="30" w:type="dxa"/>
+          <w:left w:w="90" w:type="dxa"/>
+          <w:bottom w:w="30" w:type="dxa"/>
+          <w:right w:w="90" w:type="dxa"/>
+        </w:tblCellMar>
+        <w:tblLook w:val="04A0" w:firstRow="1" w:lastRow="0" w:firstColumn="1" w:lastColumn="0" w:noHBand="0" w:noVBand="1"/>
+      </w:tblPr>
+      <w:tblGrid>
+        <w:gridCol w:w="1250"/>
+        <w:gridCol w:w="2400"/>
+        <w:gridCol w:w="1700"/>
+        <w:gridCol w:w="1700"/>
+        <w:gridCol w:w="1976"/>
+      </w:tblGrid>
+      <w:tr>
+        <w:trPr>
+          <w:cantSplit/>
+          <w:tblHeader/>
+        </w:trPr>
+        <w:tc>
+          <w:tcPr>
+            <w:tcW w:w="1250" w:type="dxa"/>
+            <w:tcBorders>
+              <w:bottom w:val="single" w:sz="6" w:space="0" w:color="000000"/>
+            </w:tcBorders>
+            <w:vAlign w:val="center"/>
+          </w:tcPr>
+          <w:p>
+            <w:pPr>
+              <w:keepNext/>
+              <w:spacing w:line="240" w:lineRule="auto" w:before="20" w:after="20"/>
+              <w:ind w:firstLine="0"/>
+              <w:jc w:val="left"/>
+              <w:rPr>
+                <w:rFonts w:cs="Times New Roman"/>
+                <w:b/>
+                <w:bCs/>
+                <w:color w:val="000000"/>
+                <w:sz w:val="20"/>
+                <w:szCs w:val="20"/>
+                <w:lang w:eastAsia="en-US"/>
+              </w:rPr>
+            </w:pPr>
+            <w:r>
+              <w:rPr>
+                <w:rFonts w:cs="Times New Roman"/>
+                <w:b/>
+                <w:bCs/>
+                <w:color w:val="000000"/>
+                <w:sz w:val="20"/>
+                <w:szCs w:val="20"/>
+                <w:lang w:eastAsia="en-US"/>
+              </w:rPr>
+              <w:t xml:space="preserve">Time (h)</w:t>
+            </w:r>
+          </w:p>
+        </w:tc>
+        <w:tc>
+          <w:tcPr>
+            <w:tcW w:w="2400" w:type="dxa"/>
+            <w:tcBorders>
+              <w:bottom w:val="single" w:sz="6" w:space="0" w:color="000000"/>
+            </w:tcBorders>
+            <w:vAlign w:val="center"/>
+          </w:tcPr>
+          <w:p>
+            <w:pPr>
+              <w:keepNext/>
+              <w:spacing w:line="240" w:lineRule="auto" w:before="20" w:after="20"/>
+              <w:ind w:firstLine="0"/>
+              <w:jc w:val="center"/>
+              <w:rPr>
+                <w:rFonts w:cs="Times New Roman"/>
+                <w:b/>
+                <w:bCs/>
+                <w:color w:val="000000"/>
+                <w:sz w:val="20"/>
+                <w:szCs w:val="20"/>
+                <w:lang w:eastAsia="en-US"/>
+              </w:rPr>
+            </w:pPr>
+            <w:r>
+              <w:rPr>
+                <w:rFonts w:cs="Times New Roman"/>
+                <w:b/>
+                <w:bCs/>
+                <w:color w:val="000000"/>
+                <w:sz w:val="20"/>
+                <w:szCs w:val="20"/>
+                <w:lang w:eastAsia="en-US"/>
+              </w:rPr>
+              <w:t xml:space="preserve">Experiment (%, mean ± SD)</w:t>
+            </w:r>
+          </w:p>
+        </w:tc>
+        <w:tc>
+          <w:tcPr>
+            <w:tcW w:w="1700" w:type="dxa"/>
+            <w:tcBorders>
+              <w:bottom w:val="single" w:sz="6" w:space="0" w:color="000000"/>
+            </w:tcBorders>
+            <w:vAlign w:val="center"/>
+          </w:tcPr>
+          <w:p>
+            <w:pPr>
+              <w:keepNext/>
+              <w:spacing w:line="240" w:lineRule="auto" w:before="20" w:after="20"/>
+              <w:ind w:firstLine="0"/>
+              <w:jc w:val="center"/>
+              <w:rPr>
+                <w:rFonts w:cs="Times New Roman"/>
+                <w:b/>
+                <w:bCs/>
+                <w:color w:val="000000"/>
+                <w:sz w:val="20"/>
+                <w:szCs w:val="20"/>
+                <w:lang w:eastAsia="en-US"/>
+              </w:rPr>
+            </w:pPr>
+            <w:r>
+              <w:rPr>
+                <w:rFonts w:cs="Times New Roman"/>
+                <w:b/>
+                <w:bCs/>
+                <w:color w:val="000000"/>
+                <w:sz w:val="20"/>
+                <w:szCs w:val="20"/>
+                <w:lang w:eastAsia="en-US"/>
+              </w:rPr>
+              <w:t xml:space="preserve">Simulation (%)</w:t>
+            </w:r>
+          </w:p>
+        </w:tc>
+        <w:tc>
+          <w:tcPr>
+            <w:tcW w:w="1700" w:type="dxa"/>
+            <w:tcBorders>
+              <w:bottom w:val="single" w:sz="6" w:space="0" w:color="000000"/>
+            </w:tcBorders>
+            <w:vAlign w:val="center"/>
+          </w:tcPr>
+          <w:p>
+            <w:pPr>
+              <w:keepNext/>
+              <w:spacing w:line="240" w:lineRule="auto" w:before="20" w:after="20"/>
+              <w:ind w:firstLine="0"/>
+              <w:jc w:val="center"/>
+              <w:rPr>
+                <w:rFonts w:cs="Times New Roman"/>
+                <w:b/>
+                <w:bCs/>
+                <w:color w:val="000000"/>
+                <w:sz w:val="20"/>
+                <w:szCs w:val="20"/>
+                <w:lang w:eastAsia="en-US"/>
+              </w:rPr>
+            </w:pPr>
+            <w:r>
+              <w:rPr>
+                <w:rFonts w:cs="Times New Roman"/>
+                <w:b/>
+                <w:bCs/>
+                <w:color w:val="000000"/>
+                <w:sz w:val="20"/>
+                <w:szCs w:val="20"/>
+                <w:lang w:eastAsia="en-US"/>
+              </w:rPr>
+              <w:t xml:space="preserve">Error (%)</w:t>
+            </w:r>
+          </w:p>
+        </w:tc>
+        <w:tc>
+          <w:tcPr>
+            <w:tcW w:w="1976" w:type="dxa"/>
+            <w:tcBorders>
+              <w:bottom w:val="single" w:sz="6" w:space="0" w:color="000000"/>
+            </w:tcBorders>
+            <w:vAlign w:val="center"/>
+          </w:tcPr>
+          <w:p>
+            <w:pPr>
+              <w:keepNext/>
+              <w:spacing w:line="240" w:lineRule="auto" w:before="20" w:after="20"/>
+              <w:ind w:firstLine="0"/>
+              <w:jc w:val="center"/>
+              <w:rPr>
+                <w:rFonts w:cs="Times New Roman"/>
+                <w:b/>
+                <w:bCs/>
+                <w:color w:val="000000"/>
+                <w:sz w:val="20"/>
+                <w:szCs w:val="20"/>
+                <w:lang w:eastAsia="en-US"/>
+              </w:rPr>
+            </w:pPr>
+            <w:r>
+              <w:rPr>
+                <w:rFonts w:cs="Times New Roman"/>
+                <w:b/>
+                <w:bCs/>
+                <w:color w:val="000000"/>
+                <w:sz w:val="20"/>
+                <w:szCs w:val="20"/>
+                <w:lang w:eastAsia="en-US"/>
+              </w:rPr>
+              <w:t xml:space="preserve">|Error|/SD</w:t>
+            </w:r>
+          </w:p>
+        </w:tc>
+      </w:tr>
+      <w:tr>
+        <w:trPr>
+          <w:cantSplit/>
+        </w:trPr>
+        <w:tc>
+          <w:tcPr>
+            <w:tcW w:w="1250" w:type="dxa"/>
+            <w:vAlign w:val="center"/>
+          </w:tcPr>
+          <w:p>
+            <w:pPr>
+              <w:keepNext/>
+              <w:spacing w:line="240" w:lineRule="auto" w:before="20" w:after="20"/>
+              <w:ind w:firstLine="0"/>
+              <w:jc w:val="left"/>
+              <w:rPr>
+                <w:rFonts w:cs="Times New Roman"/>
+                <w:color w:val="000000"/>
+                <w:sz w:val="20"/>
+                <w:szCs w:val="20"/>
+                <w:lang w:eastAsia="en-US"/>
+              </w:rPr>
+            </w:pPr>
+            <w:r>
+              <w:rPr>
+                <w:rFonts w:cs="Times New Roman"/>
+                <w:color w:val="000000"/>
+                <w:sz w:val="20"/>
+                <w:szCs w:val="20"/>
+                <w:lang w:eastAsia="en-US"/>
+              </w:rPr>
+              <w:t xml:space="preserve">24</w:t>
+            </w:r>
+          </w:p>
+        </w:tc>
+        <w:tc>
+          <w:tcPr>
+            <w:tcW w:w="2400" w:type="dxa"/>
+            <w:vAlign w:val="center"/>
+          </w:tcPr>
+          <w:p>
+            <w:pPr>
+              <w:keepNext/>
+              <w:spacing w:line="240" w:lineRule="auto" w:before="20" w:after="20"/>
+              <w:ind w:firstLine="0"/>
+              <w:jc w:val="center"/>
+              <w:rPr>
+                <w:rFonts w:cs="Times New Roman"/>
+                <w:color w:val="000000"/>
+                <w:sz w:val="20"/>
+                <w:szCs w:val="20"/>
+                <w:lang w:eastAsia="en-US"/>
+              </w:rPr>
+            </w:pPr>
+            <w:r>
+              <w:rPr>
+                <w:rFonts w:cs="Times New Roman"/>
+                <w:color w:val="000000"/>
+                <w:sz w:val="20"/>
+                <w:szCs w:val="20"/>
+                <w:lang w:eastAsia="en-US"/>
+              </w:rPr>
+              <w:t xml:space="preserve">0.045 ± 0.016</w:t>
+            </w:r>
+          </w:p>
+        </w:tc>
+        <w:tc>
+          <w:tcPr>
+            <w:tcW w:w="1700" w:type="dxa"/>
+            <w:vAlign w:val="center"/>
+          </w:tcPr>
+          <w:p>
+            <w:pPr>
+              <w:keepNext/>
+              <w:spacing w:line="240" w:lineRule="auto" w:before="20" w:after="20"/>
+              <w:ind w:firstLine="0"/>
+              <w:jc w:val="center"/>
+              <w:rPr>
+                <w:rFonts w:cs="Times New Roman"/>
+                <w:color w:val="000000"/>
+                <w:sz w:val="20"/>
+                <w:szCs w:val="20"/>
+                <w:lang w:eastAsia="en-US"/>
+              </w:rPr>
+            </w:pPr>
+            <w:r>
+              <w:rPr>
+                <w:rFonts w:cs="Times New Roman"/>
+                <w:color w:val="000000"/>
+                <w:sz w:val="20"/>
+                <w:szCs w:val="20"/>
+                <w:lang w:eastAsia="en-US"/>
+              </w:rPr>
+              <w:t xml:space="preserve">0.049</w:t>
+            </w:r>
+          </w:p>
+        </w:tc>
+        <w:tc>
+          <w:tcPr>
+            <w:tcW w:w="1700" w:type="dxa"/>
+            <w:vAlign w:val="center"/>
+          </w:tcPr>
+          <w:p>
+            <w:pPr>
+              <w:keepNext/>
+              <w:spacing w:line="240" w:lineRule="auto" w:before="20" w:after="20"/>
+              <w:ind w:firstLine="0"/>
+              <w:jc w:val="center"/>
+              <w:rPr>
+                <w:rFonts w:cs="Times New Roman"/>
+                <w:color w:val="000000"/>
+                <w:sz w:val="20"/>
+                <w:szCs w:val="20"/>
+                <w:lang w:eastAsia="en-US"/>
+              </w:rPr>
+            </w:pPr>
+            <w:r>
+              <w:rPr>
+                <w:rFonts w:cs="Times New Roman"/>
+                <w:color w:val="000000"/>
+                <w:sz w:val="20"/>
+                <w:szCs w:val="20"/>
+                <w:lang w:eastAsia="en-US"/>
+              </w:rPr>
+              <w:t xml:space="preserve">+0.004</w:t>
+            </w:r>
+          </w:p>
+        </w:tc>
+        <w:tc>
+          <w:tcPr>
+            <w:tcW w:w="1976" w:type="dxa"/>
+            <w:vAlign w:val="center"/>
+          </w:tcPr>
+          <w:p>
+            <w:pPr>
+              <w:keepNext/>
+              <w:spacing w:line="240" w:lineRule="auto" w:before="20" w:after="20"/>
+              <w:ind w:firstLine="0"/>
+              <w:jc w:val="center"/>
+              <w:rPr>
+                <w:rFonts w:cs="Times New Roman"/>
+                <w:color w:val="000000"/>
+                <w:sz w:val="20"/>
+                <w:szCs w:val="20"/>
+                <w:lang w:eastAsia="en-US"/>
+              </w:rPr>
+            </w:pPr>
+            <w:r>
+              <w:rPr>
+                <w:rFonts w:cs="Times New Roman"/>
+                <w:color w:val="000000"/>
+                <w:sz w:val="20"/>
+                <w:szCs w:val="20"/>
+                <w:lang w:eastAsia="en-US"/>
+              </w:rPr>
+              <w:t xml:space="preserve">0.28</w:t>
+            </w:r>
+          </w:p>
+        </w:tc>
+      </w:tr>
+      <w:tr>
+        <w:trPr>
+          <w:cantSplit/>
+        </w:trPr>
+        <w:tc>
+          <w:tcPr>
+            <w:tcW w:w="1250" w:type="dxa"/>
+            <w:vAlign w:val="center"/>
+          </w:tcPr>
+          <w:p>
+            <w:pPr>
+              <w:keepNext/>
+              <w:spacing w:line="240" w:lineRule="auto" w:before="20" w:after="20"/>
+              <w:ind w:firstLine="0"/>
+              <w:jc w:val="left"/>
+              <w:rPr>
+                <w:rFonts w:cs="Times New Roman"/>
+                <w:color w:val="000000"/>
+                <w:sz w:val="20"/>
+                <w:szCs w:val="20"/>
+                <w:lang w:eastAsia="en-US"/>
+              </w:rPr>
+            </w:pPr>
+            <w:r>
+              <w:rPr>
+                <w:rFonts w:cs="Times New Roman"/>
+                <w:color w:val="000000"/>
+                <w:sz w:val="20"/>
+                <w:szCs w:val="20"/>
+                <w:lang w:eastAsia="en-US"/>
+              </w:rPr>
+              <w:t xml:space="preserve">72</w:t>
+            </w:r>
+          </w:p>
+        </w:tc>
+        <w:tc>
+          <w:tcPr>
+            <w:tcW w:w="2400" w:type="dxa"/>
+            <w:vAlign w:val="center"/>
+          </w:tcPr>
+          <w:p>
+            <w:pPr>
+              <w:keepNext/>
+              <w:spacing w:line="240" w:lineRule="auto" w:before="20" w:after="20"/>
+              <w:ind w:firstLine="0"/>
+              <w:jc w:val="center"/>
+              <w:rPr>
+                <w:rFonts w:cs="Times New Roman"/>
+                <w:color w:val="000000"/>
+                <w:sz w:val="20"/>
+                <w:szCs w:val="20"/>
+                <w:lang w:eastAsia="en-US"/>
+              </w:rPr>
+            </w:pPr>
+            <w:r>
+              <w:rPr>
+                <w:rFonts w:cs="Times New Roman"/>
+                <w:color w:val="000000"/>
+                <w:sz w:val="20"/>
+                <w:szCs w:val="20"/>
+                <w:lang w:eastAsia="en-US"/>
+              </w:rPr>
+              <w:t xml:space="preserve">0.105 ± 0.036</w:t>
+            </w:r>
+          </w:p>
+        </w:tc>
+        <w:tc>
+          <w:tcPr>
+            <w:tcW w:w="1700" w:type="dxa"/>
+            <w:vAlign w:val="center"/>
+          </w:tcPr>
+          <w:p>
+            <w:pPr>
+              <w:keepNext/>
+              <w:spacing w:line="240" w:lineRule="auto" w:before="20" w:after="20"/>
+              <w:ind w:firstLine="0"/>
+              <w:jc w:val="center"/>
+              <w:rPr>
+                <w:rFonts w:cs="Times New Roman"/>
+                <w:color w:val="000000"/>
+                <w:sz w:val="20"/>
+                <w:szCs w:val="20"/>
+                <w:lang w:eastAsia="en-US"/>
+              </w:rPr>
+            </w:pPr>
+            <w:r>
+              <w:rPr>
+                <w:rFonts w:cs="Times New Roman"/>
+                <w:color w:val="000000"/>
+                <w:sz w:val="20"/>
+                <w:szCs w:val="20"/>
+                <w:lang w:eastAsia="en-US"/>
+              </w:rPr>
+              <w:t xml:space="preserve">0.114</w:t>
+            </w:r>
+          </w:p>
+        </w:tc>
+        <w:tc>
+          <w:tcPr>
+            <w:tcW w:w="1700" w:type="dxa"/>
+            <w:vAlign w:val="center"/>
+          </w:tcPr>
+          <w:p>
+            <w:pPr>
+              <w:keepNext/>
+              <w:spacing w:line="240" w:lineRule="auto" w:before="20" w:after="20"/>
+              <w:ind w:firstLine="0"/>
+              <w:jc w:val="center"/>
+              <w:rPr>
+                <w:rFonts w:cs="Times New Roman"/>
+                <w:color w:val="000000"/>
+                <w:sz w:val="20"/>
+                <w:szCs w:val="20"/>
+                <w:lang w:eastAsia="en-US"/>
+              </w:rPr>
+            </w:pPr>
+            <w:r>
+              <w:rPr>
+                <w:rFonts w:cs="Times New Roman"/>
+                <w:color w:val="000000"/>
+                <w:sz w:val="20"/>
+                <w:szCs w:val="20"/>
+                <w:lang w:eastAsia="en-US"/>
+              </w:rPr>
+              <w:t xml:space="preserve">+0.008</w:t>
+            </w:r>
+          </w:p>
+        </w:tc>
+        <w:tc>
+          <w:tcPr>
+            <w:tcW w:w="1976" w:type="dxa"/>
+            <w:vAlign w:val="center"/>
+          </w:tcPr>
+          <w:p>
+            <w:pPr>
+              <w:keepNext/>
+              <w:spacing w:line="240" w:lineRule="auto" w:before="20" w:after="20"/>
+              <w:ind w:firstLine="0"/>
+              <w:jc w:val="center"/>
+              <w:rPr>
+                <w:rFonts w:cs="Times New Roman"/>
+                <w:color w:val="000000"/>
+                <w:sz w:val="20"/>
+                <w:szCs w:val="20"/>
+                <w:lang w:eastAsia="en-US"/>
+              </w:rPr>
+            </w:pPr>
+            <w:r>
+              <w:rPr>
+                <w:rFonts w:cs="Times New Roman"/>
+                <w:color w:val="000000"/>
+                <w:sz w:val="20"/>
+                <w:szCs w:val="20"/>
+                <w:lang w:eastAsia="en-US"/>
+              </w:rPr>
+              <w:t xml:space="preserve">0.24</w:t>
+            </w:r>
+          </w:p>
+        </w:tc>
+      </w:tr>
+      <w:tr>
+        <w:trPr>
+          <w:cantSplit/>
+        </w:trPr>
+        <w:tc>
+          <w:tcPr>
+            <w:tcW w:w="1250" w:type="dxa"/>
+            <w:vAlign w:val="center"/>
+          </w:tcPr>
+          <w:p>
+            <w:pPr>
+              <w:keepNext/>
+              <w:spacing w:line="240" w:lineRule="auto" w:before="20" w:after="20"/>
+              <w:ind w:firstLine="0"/>
+              <w:jc w:val="left"/>
+              <w:rPr>
+                <w:rFonts w:cs="Times New Roman"/>
+                <w:color w:val="000000"/>
+                <w:sz w:val="20"/>
+                <w:szCs w:val="20"/>
+                <w:lang w:eastAsia="en-US"/>
+              </w:rPr>
+            </w:pPr>
+            <w:r>
+              <w:rPr>
+                <w:rFonts w:cs="Times New Roman"/>
+                <w:color w:val="000000"/>
+                <w:sz w:val="20"/>
+                <w:szCs w:val="20"/>
+                <w:lang w:eastAsia="en-US"/>
+              </w:rPr>
+              <w:t xml:space="preserve">168</w:t>
+            </w:r>
+          </w:p>
+        </w:tc>
+        <w:tc>
+          <w:tcPr>
+            <w:tcW w:w="2400" w:type="dxa"/>
+            <w:vAlign w:val="center"/>
+          </w:tcPr>
+          <w:p>
+            <w:pPr>
+              <w:keepNext/>
+              <w:spacing w:line="240" w:lineRule="auto" w:before="20" w:after="20"/>
+              <w:ind w:firstLine="0"/>
+              <w:jc w:val="center"/>
+              <w:rPr>
+                <w:rFonts w:cs="Times New Roman"/>
+                <w:color w:val="000000"/>
+                <w:sz w:val="20"/>
+                <w:szCs w:val="20"/>
+                <w:lang w:eastAsia="en-US"/>
+              </w:rPr>
+            </w:pPr>
+            <w:r>
+              <w:rPr>
+                <w:rFonts w:cs="Times New Roman"/>
+                <w:color w:val="000000"/>
+                <w:sz w:val="20"/>
+                <w:szCs w:val="20"/>
+                <w:lang w:eastAsia="en-US"/>
+              </w:rPr>
+              <w:t xml:space="preserve">0.209 ± 0.061</w:t>
+            </w:r>
+          </w:p>
+        </w:tc>
+        <w:tc>
+          <w:tcPr>
+            <w:tcW w:w="1700" w:type="dxa"/>
+            <w:vAlign w:val="center"/>
+          </w:tcPr>
+          <w:p>
+            <w:pPr>
+              <w:keepNext/>
+              <w:spacing w:line="240" w:lineRule="auto" w:before="20" w:after="20"/>
+              <w:ind w:firstLine="0"/>
+              <w:jc w:val="center"/>
+              <w:rPr>
+                <w:rFonts w:cs="Times New Roman"/>
+                <w:color w:val="000000"/>
+                <w:sz w:val="20"/>
+                <w:szCs w:val="20"/>
+                <w:lang w:eastAsia="en-US"/>
+              </w:rPr>
+            </w:pPr>
+            <w:r>
+              <w:rPr>
+                <w:rFonts w:cs="Times New Roman"/>
+                <w:color w:val="000000"/>
+                <w:sz w:val="20"/>
+                <w:szCs w:val="20"/>
+                <w:lang w:eastAsia="en-US"/>
+              </w:rPr>
+              <w:t xml:space="preserve">0.188</w:t>
+            </w:r>
+          </w:p>
+        </w:tc>
+        <w:tc>
+          <w:tcPr>
+            <w:tcW w:w="1700" w:type="dxa"/>
+            <w:vAlign w:val="center"/>
+          </w:tcPr>
+          <w:p>
+            <w:pPr>
+              <w:keepNext/>
+              <w:spacing w:line="240" w:lineRule="auto" w:before="20" w:after="20"/>
+              <w:ind w:firstLine="0"/>
+              <w:jc w:val="center"/>
+              <w:rPr>
+                <w:rFonts w:cs="Times New Roman"/>
+                <w:color w:val="000000"/>
+                <w:sz w:val="20"/>
+                <w:szCs w:val="20"/>
+                <w:lang w:eastAsia="en-US"/>
+              </w:rPr>
+            </w:pPr>
+            <w:r>
+              <w:rPr>
+                <w:rFonts w:cs="Times New Roman"/>
+                <w:color w:val="000000"/>
+                <w:sz w:val="20"/>
+                <w:szCs w:val="20"/>
+                <w:lang w:eastAsia="en-US"/>
+              </w:rPr>
+              <w:t xml:space="preserve">−0.021</w:t>
+            </w:r>
+          </w:p>
+        </w:tc>
+        <w:tc>
+          <w:tcPr>
+            <w:tcW w:w="1976" w:type="dxa"/>
+            <w:vAlign w:val="center"/>
+          </w:tcPr>
+          <w:p>
+            <w:pPr>
+              <w:keepNext/>
+              <w:spacing w:line="240" w:lineRule="auto" w:before="20" w:after="20"/>
+              <w:ind w:firstLine="0"/>
+              <w:jc w:val="center"/>
+              <w:rPr>
+                <w:rFonts w:cs="Times New Roman"/>
+                <w:color w:val="000000"/>
+                <w:sz w:val="20"/>
+                <w:szCs w:val="20"/>
+                <w:lang w:eastAsia="en-US"/>
+              </w:rPr>
+            </w:pPr>
+            <w:r>
+              <w:rPr>
+                <w:rFonts w:cs="Times New Roman"/>
+                <w:color w:val="000000"/>
+                <w:sz w:val="20"/>
+                <w:szCs w:val="20"/>
+                <w:lang w:eastAsia="en-US"/>
+              </w:rPr>
+              <w:t xml:space="preserve">0.34</w:t>
+            </w:r>
+          </w:p>
+        </w:tc>
+      </w:tr>
+      <w:tr>
+        <w:trPr>
+          <w:cantSplit/>
+        </w:trPr>
+        <w:tc>
+          <w:tcPr>
+            <w:tcW w:w="1250" w:type="dxa"/>
+            <w:vAlign w:val="center"/>
+          </w:tcPr>
+          <w:p>
+            <w:pPr>
+              <w:keepNext/>
+              <w:spacing w:line="240" w:lineRule="auto" w:before="20" w:after="20"/>
+              <w:ind w:firstLine="0"/>
+              <w:jc w:val="left"/>
+              <w:rPr>
+                <w:rFonts w:cs="Times New Roman"/>
+                <w:color w:val="000000"/>
+                <w:sz w:val="20"/>
+                <w:szCs w:val="20"/>
+                <w:lang w:eastAsia="en-US"/>
+              </w:rPr>
+            </w:pPr>
+            <w:r>
+              <w:rPr>
+                <w:rFonts w:cs="Times New Roman"/>
+                <w:color w:val="000000"/>
+                <w:sz w:val="20"/>
+                <w:szCs w:val="20"/>
+                <w:lang w:eastAsia="en-US"/>
+              </w:rPr>
+              <w:t xml:space="preserve">336</w:t>
+            </w:r>
+          </w:p>
+        </w:tc>
+        <w:tc>
+          <w:tcPr>
+            <w:tcW w:w="2400" w:type="dxa"/>
+            <w:vAlign w:val="center"/>
+          </w:tcPr>
+          <w:p>
+            <w:pPr>
+              <w:keepNext/>
+              <w:spacing w:line="240" w:lineRule="auto" w:before="20" w:after="20"/>
+              <w:ind w:firstLine="0"/>
+              <w:jc w:val="center"/>
+              <w:rPr>
+                <w:rFonts w:cs="Times New Roman"/>
+                <w:color w:val="000000"/>
+                <w:sz w:val="20"/>
+                <w:szCs w:val="20"/>
+                <w:lang w:eastAsia="en-US"/>
+              </w:rPr>
+            </w:pPr>
+            <w:r>
+              <w:rPr>
+                <w:rFonts w:cs="Times New Roman"/>
+                <w:color w:val="000000"/>
+                <w:sz w:val="20"/>
+                <w:szCs w:val="20"/>
+                <w:lang w:eastAsia="en-US"/>
+              </w:rPr>
+              <w:t xml:space="preserve">0.254 ± 0.061</w:t>
+            </w:r>
+          </w:p>
+        </w:tc>
+        <w:tc>
+          <w:tcPr>
+            <w:tcW w:w="1700" w:type="dxa"/>
+            <w:vAlign w:val="center"/>
+          </w:tcPr>
+          <w:p>
+            <w:pPr>
+              <w:keepNext/>
+              <w:spacing w:line="240" w:lineRule="auto" w:before="20" w:after="20"/>
+              <w:ind w:firstLine="0"/>
+              <w:jc w:val="center"/>
+              <w:rPr>
+                <w:rFonts w:cs="Times New Roman"/>
+                <w:color w:val="000000"/>
+                <w:sz w:val="20"/>
+                <w:szCs w:val="20"/>
+                <w:lang w:eastAsia="en-US"/>
+              </w:rPr>
+            </w:pPr>
+            <w:r>
+              <w:rPr>
+                <w:rFonts w:cs="Times New Roman"/>
+                <w:color w:val="000000"/>
+                <w:sz w:val="20"/>
+                <w:szCs w:val="20"/>
+                <w:lang w:eastAsia="en-US"/>
+              </w:rPr>
+              <w:t xml:space="preserve">0.240</w:t>
+            </w:r>
+          </w:p>
+        </w:tc>
+        <w:tc>
+          <w:tcPr>
+            <w:tcW w:w="1700" w:type="dxa"/>
+            <w:vAlign w:val="center"/>
+          </w:tcPr>
+          <w:p>
+            <w:pPr>
+              <w:keepNext/>
+              <w:spacing w:line="240" w:lineRule="auto" w:before="20" w:after="20"/>
+              <w:ind w:firstLine="0"/>
+              <w:jc w:val="center"/>
+              <w:rPr>
+                <w:rFonts w:cs="Times New Roman"/>
+                <w:color w:val="000000"/>
+                <w:sz w:val="20"/>
+                <w:szCs w:val="20"/>
+                <w:lang w:eastAsia="en-US"/>
+              </w:rPr>
+            </w:pPr>
+            <w:r>
+              <w:rPr>
+                <w:rFonts w:cs="Times New Roman"/>
+                <w:color w:val="000000"/>
+                <w:sz w:val="20"/>
+                <w:szCs w:val="20"/>
+                <w:lang w:eastAsia="en-US"/>
+              </w:rPr>
+              <w:t xml:space="preserve">−0.014</w:t>
+            </w:r>
+          </w:p>
+        </w:tc>
+        <w:tc>
+          <w:tcPr>
+            <w:tcW w:w="1976" w:type="dxa"/>
+            <w:vAlign w:val="center"/>
+          </w:tcPr>
+          <w:p>
+            <w:pPr>
+              <w:keepNext/>
+              <w:spacing w:line="240" w:lineRule="auto" w:before="20" w:after="20"/>
+              <w:ind w:firstLine="0"/>
+              <w:jc w:val="center"/>
+              <w:rPr>
+                <w:rFonts w:cs="Times New Roman"/>
+                <w:color w:val="000000"/>
+                <w:sz w:val="20"/>
+                <w:szCs w:val="20"/>
+                <w:lang w:eastAsia="en-US"/>
+              </w:rPr>
+            </w:pPr>
+            <w:r>
+              <w:rPr>
+                <w:rFonts w:cs="Times New Roman"/>
+                <w:color w:val="000000"/>
+                <w:sz w:val="20"/>
+                <w:szCs w:val="20"/>
+                <w:lang w:eastAsia="en-US"/>
+              </w:rPr>
+              <w:t xml:space="preserve">0.23</w:t>
+            </w:r>
+          </w:p>
+        </w:tc>
+      </w:tr>
+      <w:tr>
+        <w:trPr>
+          <w:cantSplit/>
+        </w:trPr>
+        <w:tc>
+          <w:tcPr>
+            <w:tcW w:w="1250" w:type="dxa"/>
+            <w:vAlign w:val="center"/>
+          </w:tcPr>
+          <w:p>
+            <w:pPr>
+              <w:keepNext/>
+              <w:spacing w:line="240" w:lineRule="auto" w:before="20" w:after="20"/>
+              <w:ind w:firstLine="0"/>
+              <w:jc w:val="left"/>
+              <w:rPr>
+                <w:rFonts w:cs="Times New Roman"/>
+                <w:color w:val="000000"/>
+                <w:sz w:val="20"/>
+                <w:szCs w:val="20"/>
+                <w:lang w:eastAsia="en-US"/>
+              </w:rPr>
+            </w:pPr>
+            <w:r>
+              <w:rPr>
+                <w:rFonts w:cs="Times New Roman"/>
+                <w:color w:val="000000"/>
+                <w:sz w:val="20"/>
+                <w:szCs w:val="20"/>
+                <w:lang w:eastAsia="en-US"/>
+              </w:rPr>
+              <w:t xml:space="preserve">672</w:t>
+            </w:r>
+          </w:p>
+        </w:tc>
+        <w:tc>
+          <w:tcPr>
+            <w:tcW w:w="2400" w:type="dxa"/>
+            <w:vAlign w:val="center"/>
+          </w:tcPr>
+          <w:p>
+            <w:pPr>
+              <w:keepNext/>
+              <w:spacing w:line="240" w:lineRule="auto" w:before="20" w:after="20"/>
+              <w:ind w:firstLine="0"/>
+              <w:jc w:val="center"/>
+              <w:rPr>
+                <w:rFonts w:cs="Times New Roman"/>
+                <w:color w:val="000000"/>
+                <w:sz w:val="20"/>
+                <w:szCs w:val="20"/>
+                <w:lang w:eastAsia="en-US"/>
+              </w:rPr>
+            </w:pPr>
+            <w:r>
+              <w:rPr>
+                <w:rFonts w:cs="Times New Roman"/>
+                <w:color w:val="000000"/>
+                <w:sz w:val="20"/>
+                <w:szCs w:val="20"/>
+                <w:lang w:eastAsia="en-US"/>
+              </w:rPr>
+              <w:t xml:space="preserve">0.311 ± 0.115</w:t>
+            </w:r>
+          </w:p>
+        </w:tc>
+        <w:tc>
+          <w:tcPr>
+            <w:tcW w:w="1700" w:type="dxa"/>
+            <w:vAlign w:val="center"/>
+          </w:tcPr>
+          <w:p>
+            <w:pPr>
+              <w:keepNext/>
+              <w:spacing w:line="240" w:lineRule="auto" w:before="20" w:after="20"/>
+              <w:ind w:firstLine="0"/>
+              <w:jc w:val="center"/>
+              <w:rPr>
+                <w:rFonts w:cs="Times New Roman"/>
+                <w:color w:val="000000"/>
+                <w:sz w:val="20"/>
+                <w:szCs w:val="20"/>
+                <w:lang w:eastAsia="en-US"/>
+              </w:rPr>
+            </w:pPr>
+            <w:r>
+              <w:rPr>
+                <w:rFonts w:cs="Times New Roman"/>
+                <w:color w:val="000000"/>
+                <w:sz w:val="20"/>
+                <w:szCs w:val="20"/>
+                <w:lang w:eastAsia="en-US"/>
+              </w:rPr>
+              <w:t xml:space="preserve">0.333</w:t>
+            </w:r>
+          </w:p>
+        </w:tc>
+        <w:tc>
+          <w:tcPr>
+            <w:tcW w:w="1700" w:type="dxa"/>
+            <w:vAlign w:val="center"/>
+          </w:tcPr>
+          <w:p>
+            <w:pPr>
+              <w:keepNext/>
+              <w:spacing w:line="240" w:lineRule="auto" w:before="20" w:after="20"/>
+              <w:ind w:firstLine="0"/>
+              <w:jc w:val="center"/>
+              <w:rPr>
+                <w:rFonts w:cs="Times New Roman"/>
+                <w:color w:val="000000"/>
+                <w:sz w:val="20"/>
+                <w:szCs w:val="20"/>
+                <w:lang w:eastAsia="en-US"/>
+              </w:rPr>
+            </w:pPr>
+            <w:r>
+              <w:rPr>
+                <w:rFonts w:cs="Times New Roman"/>
+                <w:color w:val="000000"/>
+                <w:sz w:val="20"/>
+                <w:szCs w:val="20"/>
+                <w:lang w:eastAsia="en-US"/>
+              </w:rPr>
+              <w:t xml:space="preserve">+0.022</w:t>
+            </w:r>
+          </w:p>
+        </w:tc>
+        <w:tc>
+          <w:tcPr>
+            <w:tcW w:w="1976" w:type="dxa"/>
+            <w:vAlign w:val="center"/>
+          </w:tcPr>
+          <w:p>
+            <w:pPr>
+              <w:keepNext/>
+              <w:spacing w:line="240" w:lineRule="auto" w:before="20" w:after="20"/>
+              <w:ind w:firstLine="0"/>
+              <w:jc w:val="center"/>
+              <w:rPr>
+                <w:rFonts w:cs="Times New Roman"/>
+                <w:color w:val="000000"/>
+                <w:sz w:val="20"/>
+                <w:szCs w:val="20"/>
+                <w:lang w:eastAsia="en-US"/>
+              </w:rPr>
+            </w:pPr>
+            <w:r>
+              <w:rPr>
+                <w:rFonts w:cs="Times New Roman"/>
+                <w:color w:val="000000"/>
+                <w:sz w:val="20"/>
+                <w:szCs w:val="20"/>
+                <w:lang w:eastAsia="en-US"/>
+              </w:rPr>
+              <w:t xml:space="preserve">0.19</w:t>
+            </w:r>
+          </w:p>
+        </w:tc>
+      </w:tr>
+    </w:tbl>
+    <w:p>
+      <w:pPr>
         <w:pStyle w:val="Heading1"/>
       </w:pPr>
       <w:r>
@@ -20025,7 +21156,7 @@
         <w:jc w:val="both"/>
       </w:pPr>
       <w:r>
-        <w:t>Figure S8 shows the spatial evolution of oxygen and film saturation in the stent. Table S11 and Figures S9 and S10 describe the controlled test structures and their results.</w:t>
+        <w:t xml:space="preserve">Figure S8 shows the spatial evolution of oxygen and film saturation in the stent. Table S12 and Figures S9 and S10 describe the controlled test structures and their results.</w:t>
       </w:r>
     </w:p>
     <w:p>
@@ -20281,7 +21412,7 @@
           <w:sz w:val="20"/>
           <w:szCs w:val="20"/>
         </w:rPr>
-        <w:t>11</w:t>
+        <w:t>12</w:t>
       </w:r>
       <w:r>
         <w:rPr>

</xml_diff>

<commit_message>
Table S4: stent surface area 19.46 mm2, SA/V 53.9 mm-1 (mesh-derived); update A6.1 response
Co-Authored-By: Claude Sonnet 5.5 <noreply@anthropic.com>
Claude-Session: https://claude.ai/code/session_01Y1g9vByMLTE8eGJ9K81zt6
</commit_message>
<xml_diff>
--- a/Supplementary_original_order.docx
+++ b/Supplementary_original_order.docx
@@ -7963,7 +7963,7 @@
                 <w:szCs w:val="20"/>
                 <w:lang w:eastAsia="en-US"/>
               </w:rPr>
-              <w:t>12.26 mm²</w:t>
+              <w:t>19.46 mm²</w:t>
             </w:r>
           </w:p>
         </w:tc>
@@ -8281,17 +8281,7 @@
                 <w:szCs w:val="20"/>
                 <w:lang w:eastAsia="en-US"/>
               </w:rPr>
-              <w:t>13.6</w:t>
-            </w:r>
-            <w:r>
-              <w:rPr>
-                <w:rFonts w:cs="Times New Roman"/>
-                <w:color w:val="000000"/>
-                <w:sz w:val="20"/>
-                <w:szCs w:val="20"/>
-                <w:lang w:eastAsia="en-US"/>
-              </w:rPr>
-              <w:t xml:space="preserve"> mm⁻¹</w:t>
+              <w:t>53.9 mm⁻¹</w:t>
             </w:r>
           </w:p>
         </w:tc>

</xml_diff>

<commit_message>
SI Tables S2/S3 mesh convergence and adaptive-vs-uniform updated; workbook
Co-Authored-By: Claude Sonnet 5.5 <noreply@anthropic.com>
Claude-Session: https://claude.ai/code/session_01Y1g9vByMLTE8eGJ9K81zt6
</commit_message>
<xml_diff>
--- a/Supplementary_original_order.docx
+++ b/Supplementary_original_order.docx
@@ -4202,7 +4202,7 @@
         <w:jc w:val="both"/>
       </w:pPr>
       <w:r>
-        <w:t>Table S2 and Figure S3 report the mesh convergence study, and Table S3 compares adaptive and uniform meshes of similar size.</w:t>
+        <w:t>Table S2 and Figure S3 report the mesh convergence study, and Table S3 compares an adaptive mesh with a uniform mesh. Because the uniform mesh has the same 1 mm size everywhere, it places far fewer elements at the Zn-electrolyte interface (1 mm vs 0.1 mm) and under-resolves the oxygen gradient and the receding surface. It therefore has a larger error than the adaptive mesh even with fewer elements, which is why adaptive refinement at the interface was used.</w:t>
       </w:r>
     </w:p>
     <w:p>
@@ -4425,7 +4425,7 @@
         <w:jc w:val="both"/>
       </w:pPr>
       <w:r>
-        <w:t>where MassLoss_Li is the predicted mass loss for mesh level Li and MassLoss_Reference is the predicted mass loss for the reference mesh (21.25 million elements).</w:t>
+        <w:t>where MassLoss_Li is the predicted mass loss for mesh level Li and MassLoss_Reference is the predicted mass loss for the fine mesh (18.9 million elements).</w:t>
       </w:r>
     </w:p>
     <w:p>
@@ -4443,7 +4443,7 @@
           <w:sz w:val="20"/>
           <w:szCs w:val="20"/>
         </w:rPr>
-        <w:t>Table S</w:t>
+        <w:t>Table S2. Mesh convergence study showing the effect of mesh resolution on predicted 7-day mass loss. Relative errors are calculated with respect to the fine mesh (18.9 million elements).</w:t>
       </w:r>
       <w:r>
         <w:rPr>
@@ -4452,7 +4452,6 @@
           <w:sz w:val="20"/>
           <w:szCs w:val="20"/>
         </w:rPr>
-        <w:fldChar w:fldCharType="begin"/>
       </w:r>
       <w:r>
         <w:rPr>
@@ -4461,7 +4460,6 @@
           <w:sz w:val="20"/>
           <w:szCs w:val="20"/>
         </w:rPr>
-        <w:instrText xml:space="preserve"> SEQ Table \* ARABIC </w:instrText>
       </w:r>
       <w:r>
         <w:rPr>
@@ -4470,7 +4468,6 @@
           <w:sz w:val="20"/>
           <w:szCs w:val="20"/>
         </w:rPr>
-        <w:fldChar w:fldCharType="separate"/>
       </w:r>
       <w:r>
         <w:rPr>
@@ -4480,7 +4477,6 @@
           <w:sz w:val="20"/>
           <w:szCs w:val="20"/>
         </w:rPr>
-        <w:t>2</w:t>
       </w:r>
       <w:r>
         <w:rPr>
@@ -4490,7 +4486,6 @@
           <w:sz w:val="20"/>
           <w:szCs w:val="20"/>
         </w:rPr>
-        <w:fldChar w:fldCharType="end"/>
       </w:r>
       <w:r>
         <w:rPr>
@@ -4499,7 +4494,6 @@
           <w:sz w:val="20"/>
           <w:szCs w:val="20"/>
         </w:rPr>
-        <w:t xml:space="preserve">.</w:t>
       </w:r>
       <w:r>
         <w:rPr>
@@ -4507,7 +4501,6 @@
           <w:sz w:val="20"/>
           <w:szCs w:val="20"/>
         </w:rPr>
-        <w:t xml:space="preserve"> </w:t>
       </w:r>
       <w:r>
         <w:rPr>
@@ -4515,7 +4508,6 @@
           <w:sz w:val="20"/>
           <w:szCs w:val="20"/>
         </w:rPr>
-        <w:t xml:space="preserve">Mesh convergence study showing the effect of mesh resolution on predicted </w:t>
       </w:r>
       <w:r>
         <w:rPr>
@@ -4523,7 +4515,6 @@
           <w:sz w:val="20"/>
           <w:szCs w:val="20"/>
         </w:rPr>
-        <w:t>7</w:t>
       </w:r>
       <w:r>
         <w:rPr>
@@ -4531,7 +4522,6 @@
           <w:sz w:val="20"/>
           <w:szCs w:val="20"/>
         </w:rPr>
-        <w:t>-day mass loss. Relative errors are calculated with respect to the reference mesh (21.25 million elements).</w:t>
       </w:r>
     </w:p>
     <w:tbl>
@@ -4797,7 +4787,7 @@
                 <w:szCs w:val="20"/>
                 <w:lang w:eastAsia="en-US"/>
               </w:rPr>
-              <w:t>1.439</w:t>
+              <w:t>0.0240</w:t>
             </w:r>
           </w:p>
         </w:tc>
@@ -4827,7 +4817,7 @@
                 <w:szCs w:val="20"/>
                 <w:lang w:eastAsia="en-US"/>
               </w:rPr>
-              <w:t xml:space="preserve">1465.8</w:t>
+              <w:t>-87.2</w:t>
             </w:r>
           </w:p>
         </w:tc>
@@ -4922,7 +4912,7 @@
                 <w:szCs w:val="20"/>
                 <w:lang w:eastAsia="en-US"/>
               </w:rPr>
-              <w:t>0.4977</w:t>
+              <w:t>0.1387</w:t>
             </w:r>
           </w:p>
         </w:tc>
@@ -4952,7 +4942,7 @@
                 <w:szCs w:val="20"/>
                 <w:lang w:eastAsia="en-US"/>
               </w:rPr>
-              <w:t xml:space="preserve">441.6</w:t>
+              <w:t>-26.2</w:t>
             </w:r>
           </w:p>
         </w:tc>
@@ -5047,7 +5037,7 @@
                 <w:szCs w:val="20"/>
                 <w:lang w:eastAsia="en-US"/>
               </w:rPr>
-              <w:t>0.1633</w:t>
+              <w:t>0.1794</w:t>
             </w:r>
           </w:p>
         </w:tc>
@@ -5077,7 +5067,7 @@
                 <w:szCs w:val="20"/>
                 <w:lang w:eastAsia="en-US"/>
               </w:rPr>
-              <w:t>77.7</w:t>
+              <w:t>-4.6</w:t>
             </w:r>
           </w:p>
         </w:tc>
@@ -5172,7 +5162,7 @@
                 <w:szCs w:val="20"/>
                 <w:lang w:eastAsia="en-US"/>
               </w:rPr>
-              <w:t>0.1208</w:t>
+              <w:t>0.1846</w:t>
             </w:r>
           </w:p>
         </w:tc>
@@ -5202,7 +5192,7 @@
                 <w:szCs w:val="20"/>
                 <w:lang w:eastAsia="en-US"/>
               </w:rPr>
-              <w:t>31.4</w:t>
+              <w:t>-1.8</w:t>
             </w:r>
           </w:p>
         </w:tc>
@@ -5297,7 +5287,7 @@
                 <w:szCs w:val="20"/>
                 <w:lang w:eastAsia="en-US"/>
               </w:rPr>
-              <w:t>0.1002</w:t>
+              <w:t>0.1871</w:t>
             </w:r>
           </w:p>
         </w:tc>
@@ -5327,7 +5317,7 @@
                 <w:szCs w:val="20"/>
                 <w:lang w:eastAsia="en-US"/>
               </w:rPr>
-              <w:t>9.0</w:t>
+              <w:t>-0.5</w:t>
             </w:r>
           </w:p>
         </w:tc>
@@ -5422,7 +5412,7 @@
                 <w:szCs w:val="20"/>
                 <w:lang w:eastAsia="en-US"/>
               </w:rPr>
-              <w:t>0.0927</w:t>
+              <w:t>0.1880</w:t>
             </w:r>
           </w:p>
         </w:tc>
@@ -5435,141 +5425,6 @@
           <w:p>
             <w:pPr>
               <w:keepNext/>
-              <w:spacing w:line="240" w:lineRule="auto" w:before="20" w:after="20"/>
-              <w:ind w:firstLine="0"/>
-              <w:jc w:val="center"/>
-              <w:rPr>
-                <w:rFonts w:cs="Times New Roman"/>
-                <w:sz w:val="22"/>
-                <w:szCs w:val="22"/>
-                <w:lang w:eastAsia="en-US"/>
-              </w:rPr>
-            </w:pPr>
-            <w:r>
-              <w:rPr>
-                <w:rFonts w:cs="Times New Roman"/>
-                <w:sz w:val="20"/>
-                <w:szCs w:val="20"/>
-                <w:lang w:eastAsia="en-US"/>
-              </w:rPr>
-              <w:t xml:space="preserve">0.87</w:t>
-            </w:r>
-          </w:p>
-        </w:tc>
-      </w:tr>
-      <w:tr>
-        <w:trPr>
-          <w:cantSplit/>
-        </w:trPr>
-        <w:tc>
-          <w:tcPr>
-            <w:tcW w:w="2157" w:type="dxa"/>
-            <w:noWrap/>
-            <w:vAlign w:val="center"/>
-          </w:tcPr>
-          <w:p>
-            <w:pPr>
-              <w:keepNext w:val="0"/>
-              <w:spacing w:line="240" w:lineRule="auto" w:before="20" w:after="20"/>
-              <w:ind w:firstLine="0"/>
-              <w:jc w:val="left"/>
-              <w:rPr>
-                <w:rFonts w:cs="Times New Roman"/>
-                <w:sz w:val="22"/>
-                <w:szCs w:val="22"/>
-                <w:lang w:eastAsia="en-US"/>
-              </w:rPr>
-            </w:pPr>
-            <w:r>
-              <w:rPr>
-                <w:rFonts w:cs="Times New Roman"/>
-                <w:sz w:val="20"/>
-                <w:szCs w:val="20"/>
-                <w:lang w:eastAsia="en-US"/>
-              </w:rPr>
-              <w:lastRenderedPageBreak/>
-              <w:t>Reference</w:t>
-            </w:r>
-          </w:p>
-        </w:tc>
-        <w:tc>
-          <w:tcPr>
-            <w:tcW w:w="2144" w:type="dxa"/>
-            <w:noWrap/>
-            <w:vAlign w:val="center"/>
-          </w:tcPr>
-          <w:p>
-            <w:pPr>
-              <w:keepNext w:val="0"/>
-              <w:spacing w:line="240" w:lineRule="auto" w:before="20" w:after="20"/>
-              <w:ind w:firstLine="0"/>
-              <w:jc w:val="center"/>
-              <w:rPr>
-                <w:rFonts w:cs="Times New Roman"/>
-                <w:sz w:val="22"/>
-                <w:szCs w:val="22"/>
-                <w:lang w:eastAsia="en-US"/>
-              </w:rPr>
-            </w:pPr>
-            <w:r>
-              <w:rPr>
-                <w:rFonts w:cs="Times New Roman"/>
-                <w:sz w:val="20"/>
-                <w:szCs w:val="20"/>
-                <w:lang w:eastAsia="en-US"/>
-              </w:rPr>
-              <w:t>21</w:t>
-            </w:r>
-            <w:r>
-              <w:rPr>
-                <w:rFonts w:cs="Times New Roman"/>
-                <w:sz w:val="20"/>
-                <w:szCs w:val="20"/>
-                <w:lang w:eastAsia="en-US"/>
-              </w:rPr>
-              <w:t>245,850</w:t>
-            </w:r>
-          </w:p>
-        </w:tc>
-        <w:tc>
-          <w:tcPr>
-            <w:tcW w:w="2171" w:type="dxa"/>
-            <w:noWrap/>
-            <w:vAlign w:val="center"/>
-          </w:tcPr>
-          <w:p>
-            <w:pPr>
-              <w:keepNext w:val="0"/>
-              <w:spacing w:line="240" w:lineRule="auto" w:before="20" w:after="20"/>
-              <w:ind w:firstLine="0"/>
-              <w:jc w:val="center"/>
-              <w:rPr>
-                <w:rFonts w:cs="Times New Roman"/>
-                <w:sz w:val="22"/>
-                <w:szCs w:val="22"/>
-                <w:lang w:eastAsia="en-US"/>
-              </w:rPr>
-            </w:pPr>
-            <w:r>
-              <w:rPr>
-                <w:rFonts w:cs="Times New Roman"/>
-                <w:sz w:val="20"/>
-                <w:szCs w:val="20"/>
-                <w:lang w:eastAsia="en-US"/>
-              </w:rPr>
-              <w:t>0.0919</w:t>
-            </w:r>
-          </w:p>
-        </w:tc>
-        <w:tc>
-          <w:tcPr>
-            <w:tcW w:w="2554" w:type="dxa"/>
-            <w:noWrap/>
-            <w:vAlign w:val="center"/>
-          </w:tcPr>
-          <w:p>
-            <w:pPr>
-              <w:keepNext w:val="0"/>
               <w:spacing w:line="240" w:lineRule="auto" w:before="20" w:after="20"/>
               <w:ind w:firstLine="0"/>
               <w:jc w:val="center"/>
@@ -5608,7 +5463,7 @@
           <w:sz w:val="20"/>
           <w:szCs w:val="20"/>
         </w:rPr>
-        <w:t>Table S</w:t>
+        <w:t>Table S3. Comparison between an adaptive mesh (hmin = 0.1 mm, hmax = 2 mm) and a uniform mesh (1 mm everywhere).</w:t>
       </w:r>
       <w:r>
         <w:rPr>
@@ -5617,7 +5472,6 @@
           <w:sz w:val="20"/>
           <w:szCs w:val="20"/>
         </w:rPr>
-        <w:fldChar w:fldCharType="begin"/>
       </w:r>
       <w:r>
         <w:rPr>
@@ -5626,7 +5480,6 @@
           <w:sz w:val="20"/>
           <w:szCs w:val="20"/>
         </w:rPr>
-        <w:instrText xml:space="preserve"> SEQ Table \* ARABIC </w:instrText>
       </w:r>
       <w:r>
         <w:rPr>
@@ -5635,7 +5488,6 @@
           <w:sz w:val="20"/>
           <w:szCs w:val="20"/>
         </w:rPr>
-        <w:fldChar w:fldCharType="separate"/>
       </w:r>
       <w:r>
         <w:rPr>
@@ -5645,7 +5497,6 @@
           <w:sz w:val="20"/>
           <w:szCs w:val="20"/>
         </w:rPr>
-        <w:t>3</w:t>
       </w:r>
       <w:r>
         <w:rPr>
@@ -5655,7 +5506,6 @@
           <w:sz w:val="20"/>
           <w:szCs w:val="20"/>
         </w:rPr>
-        <w:fldChar w:fldCharType="end"/>
       </w:r>
       <w:r>
         <w:rPr>
@@ -5664,7 +5514,6 @@
           <w:sz w:val="20"/>
           <w:szCs w:val="20"/>
         </w:rPr>
-        <w:t xml:space="preserve">.</w:t>
       </w:r>
       <w:r>
         <w:rPr>
@@ -5672,7 +5521,6 @@
           <w:sz w:val="20"/>
           <w:szCs w:val="20"/>
         </w:rPr>
-        <w:t xml:space="preserve"> </w:t>
       </w:r>
       <w:r>
         <w:rPr>
@@ -5680,7 +5528,6 @@
           <w:sz w:val="20"/>
           <w:szCs w:val="20"/>
         </w:rPr>
-        <w:t>Comparison between adaptive and uniform meshes at approximately 800,000 elements.</w:t>
       </w:r>
     </w:p>
     <w:tbl>
@@ -5923,7 +5770,7 @@
                 <w:szCs w:val="20"/>
                 <w:lang w:eastAsia="en-US"/>
               </w:rPr>
-              <w:t>Uniform Mesh</w:t>
+              <w:t>Uniform (1 mm)</w:t>
             </w:r>
           </w:p>
         </w:tc>
@@ -5953,7 +5800,7 @@
                 <w:szCs w:val="20"/>
                 <w:lang w:eastAsia="en-US"/>
               </w:rPr>
-              <w:t>799,520</w:t>
+              <w:t>~229,000</w:t>
             </w:r>
           </w:p>
         </w:tc>
@@ -5983,7 +5830,7 @@
                 <w:szCs w:val="20"/>
                 <w:lang w:eastAsia="en-US"/>
               </w:rPr>
-              <w:t>2.8561</w:t>
+              <w:t>0.0415</w:t>
             </w:r>
           </w:p>
         </w:tc>
@@ -6013,7 +5860,7 @@
                 <w:szCs w:val="20"/>
                 <w:lang w:eastAsia="en-US"/>
               </w:rPr>
-              <w:t xml:space="preserve">3007.8</w:t>
+              <w:t>-77.9</w:t>
             </w:r>
           </w:p>
         </w:tc>
@@ -6078,7 +5925,7 @@
                 <w:szCs w:val="20"/>
                 <w:lang w:eastAsia="en-US"/>
               </w:rPr>
-              <w:t>Adaptive Mesh</w:t>
+              <w:t>Adaptive (hmin 0.1 mm, hmax 2 mm)</w:t>
             </w:r>
           </w:p>
         </w:tc>
@@ -6138,7 +5985,7 @@
                 <w:szCs w:val="20"/>
                 <w:lang w:eastAsia="en-US"/>
               </w:rPr>
-              <w:t>0.4977</w:t>
+              <w:t>0.1387</w:t>
             </w:r>
           </w:p>
         </w:tc>
@@ -6168,7 +6015,7 @@
                 <w:szCs w:val="20"/>
                 <w:lang w:eastAsia="en-US"/>
               </w:rPr>
-              <w:t>441.6</w:t>
+              <w:t>-26.2</w:t>
             </w:r>
           </w:p>
         </w:tc>
@@ -6198,7 +6045,7 @@
                 <w:szCs w:val="20"/>
                 <w:lang w:eastAsia="en-US"/>
               </w:rPr>
-              <w:t>0.8532</w:t>
+              <w:t>0.663</w:t>
             </w:r>
           </w:p>
         </w:tc>
@@ -6233,7 +6080,7 @@
                 <w:szCs w:val="20"/>
                 <w:lang w:eastAsia="en-US"/>
               </w:rPr>
-              <w:t>Reference Mesh</w:t>
+              <w:t>Fine mesh (reference)</w:t>
             </w:r>
           </w:p>
         </w:tc>
@@ -6263,16 +6110,15 @@
                 <w:szCs w:val="20"/>
                 <w:lang w:eastAsia="en-US"/>
               </w:rPr>
-              <w:t>21</w:t>
-            </w:r>
-            <w:r>
-              <w:rPr>
-                <w:rFonts w:cs="Times New Roman"/>
-                <w:sz w:val="20"/>
-                <w:szCs w:val="20"/>
-                <w:lang w:eastAsia="en-US"/>
-              </w:rPr>
-              <w:t>245,850</w:t>
+              <w:t>18,864,900</w:t>
+            </w:r>
+            <w:r>
+              <w:rPr>
+                <w:rFonts w:cs="Times New Roman"/>
+                <w:sz w:val="20"/>
+                <w:szCs w:val="20"/>
+                <w:lang w:eastAsia="en-US"/>
+              </w:rPr>
             </w:r>
           </w:p>
         </w:tc>
@@ -6302,7 +6148,7 @@
                 <w:szCs w:val="20"/>
                 <w:lang w:eastAsia="en-US"/>
               </w:rPr>
-              <w:t>0.0919</w:t>
+              <w:t>0.1880</w:t>
             </w:r>
           </w:p>
         </w:tc>
@@ -6438,7 +6284,7 @@
           <w:sz w:val="20"/>
           <w:szCs w:val="20"/>
         </w:rPr>
-        <w:t>Figure S</w:t>
+        <w:t>Figure S3. Mesh convergence analysis showing (a) predicted mass loss and (b) relative error as a function of mesh density. Predictions converged with mesh refinement, with &lt;1% difference between the two finest meshes.</w:t>
       </w:r>
       <w:r>
         <w:rPr>
@@ -6447,7 +6293,6 @@
           <w:sz w:val="20"/>
           <w:szCs w:val="20"/>
         </w:rPr>
-        <w:fldChar w:fldCharType="begin"/>
       </w:r>
       <w:r>
         <w:rPr>
@@ -6456,7 +6301,6 @@
           <w:sz w:val="20"/>
           <w:szCs w:val="20"/>
         </w:rPr>
-        <w:instrText xml:space="preserve"> SEQ Figure \* ARABIC </w:instrText>
       </w:r>
       <w:r>
         <w:rPr>
@@ -6465,7 +6309,6 @@
           <w:sz w:val="20"/>
           <w:szCs w:val="20"/>
         </w:rPr>
-        <w:fldChar w:fldCharType="separate"/>
       </w:r>
       <w:r>
         <w:rPr>
@@ -6475,7 +6318,6 @@
           <w:sz w:val="20"/>
           <w:szCs w:val="20"/>
         </w:rPr>
-        <w:t>3</w:t>
       </w:r>
       <w:r>
         <w:rPr>
@@ -6484,7 +6326,6 @@
           <w:sz w:val="20"/>
           <w:szCs w:val="20"/>
         </w:rPr>
-        <w:fldChar w:fldCharType="end"/>
       </w:r>
       <w:r>
         <w:rPr>
@@ -6493,7 +6334,6 @@
           <w:sz w:val="20"/>
           <w:szCs w:val="20"/>
         </w:rPr>
-        <w:t xml:space="preserve">.</w:t>
       </w:r>
       <w:r>
         <w:rPr>
@@ -6501,7 +6341,6 @@
           <w:sz w:val="20"/>
           <w:szCs w:val="20"/>
         </w:rPr>
-        <w:t xml:space="preserve"> </w:t>
       </w:r>
       <w:r>
         <w:rPr>
@@ -6509,7 +6348,6 @@
           <w:sz w:val="20"/>
           <w:szCs w:val="20"/>
         </w:rPr>
-        <w:t>Mesh convergence analysis showing (a) predicted mass loss and (b) relative error as a function of mesh density. Predictions converged with mesh refinement, with &lt;1% error for the final mesh.</w:t>
       </w:r>
     </w:p>
     <w:p>

</xml_diff>

<commit_message>
Table S2: errors vs 18.9M, keep 21.25M reference row
</commit_message>
<xml_diff>
--- a/Supplementary_original_order.docx
+++ b/Supplementary_original_order.docx
@@ -4425,7 +4425,7 @@
         <w:jc w:val="both"/>
       </w:pPr>
       <w:r>
-        <w:t>where MassLoss_Li is the predicted mass loss for mesh level Li and MassLoss_Reference is the predicted mass loss for the fine mesh (18.9 million elements).</w:t>
+        <w:t>where MassLoss_Li is the predicted mass loss for mesh level Li and MassLoss_Reference is the predicted mass loss for the 18.9 million-element mesh (L6).</w:t>
       </w:r>
     </w:p>
     <w:p>
@@ -4443,7 +4443,7 @@
           <w:sz w:val="20"/>
           <w:szCs w:val="20"/>
         </w:rPr>
-        <w:t>Table S2. Mesh convergence study showing the effect of mesh resolution on predicted 7-day mass loss. Relative errors are calculated with respect to the fine mesh (18.9 million elements).</w:t>
+        <w:t>Table S2. Mesh convergence study showing the effect of mesh resolution on predicted 7-day mass loss. Relative errors are calculated with respect to the 18.9 million-element mesh (L6); the 21.25 million-element reference mesh is listed for comparison.</w:t>
       </w:r>
       <w:r>
         <w:rPr>
@@ -5442,7 +5442,132 @@
                 <w:szCs w:val="20"/>
                 <w:lang w:eastAsia="en-US"/>
               </w:rPr>
-              <w:t>—</w:t>
+              <w:t>reference</w:t>
+            </w:r>
+          </w:p>
+        </w:tc>
+      </w:tr>
+      <w:tr>
+        <w:trPr>
+          <w:cantSplit/>
+        </w:trPr>
+        <w:tc>
+          <w:tcPr>
+            <w:tcW w:w="2157" w:type="dxa"/>
+            <w:noWrap/>
+            <w:vAlign w:val="center"/>
+          </w:tcPr>
+          <w:p>
+            <w:pPr>
+              <w:keepNext/>
+              <w:spacing w:line="240" w:lineRule="auto" w:before="20" w:after="20"/>
+              <w:ind w:firstLine="0"/>
+              <w:jc w:val="left"/>
+              <w:rPr>
+                <w:rFonts w:cs="Times New Roman"/>
+                <w:sz w:val="22"/>
+                <w:szCs w:val="22"/>
+                <w:lang w:eastAsia="en-US"/>
+              </w:rPr>
+            </w:pPr>
+            <w:r>
+              <w:rPr>
+                <w:rFonts w:cs="Times New Roman"/>
+                <w:sz w:val="20"/>
+                <w:szCs w:val="20"/>
+                <w:lang w:eastAsia="en-US"/>
+              </w:rPr>
+              <w:t>Reference</w:t>
+            </w:r>
+          </w:p>
+        </w:tc>
+        <w:tc>
+          <w:tcPr>
+            <w:tcW w:w="2144" w:type="dxa"/>
+            <w:noWrap/>
+            <w:vAlign w:val="center"/>
+          </w:tcPr>
+          <w:p>
+            <w:pPr>
+              <w:keepNext/>
+              <w:spacing w:line="240" w:lineRule="auto" w:before="20" w:after="20"/>
+              <w:ind w:firstLine="0"/>
+              <w:jc w:val="center"/>
+              <w:rPr>
+                <w:rFonts w:cs="Times New Roman"/>
+                <w:sz w:val="22"/>
+                <w:szCs w:val="22"/>
+                <w:lang w:eastAsia="en-US"/>
+              </w:rPr>
+            </w:pPr>
+            <w:r>
+              <w:rPr>
+                <w:rFonts w:cs="Times New Roman"/>
+                <w:sz w:val="20"/>
+                <w:szCs w:val="20"/>
+                <w:lang w:eastAsia="en-US"/>
+              </w:rPr>
+              <w:t>21,245,850</w:t>
+            </w:r>
+          </w:p>
+        </w:tc>
+        <w:tc>
+          <w:tcPr>
+            <w:tcW w:w="2171" w:type="dxa"/>
+            <w:noWrap/>
+            <w:vAlign w:val="center"/>
+          </w:tcPr>
+          <w:p>
+            <w:pPr>
+              <w:keepNext/>
+              <w:spacing w:line="240" w:lineRule="auto" w:before="20" w:after="20"/>
+              <w:ind w:firstLine="0"/>
+              <w:jc w:val="center"/>
+              <w:rPr>
+                <w:rFonts w:cs="Times New Roman"/>
+                <w:sz w:val="22"/>
+                <w:szCs w:val="22"/>
+                <w:lang w:eastAsia="en-US"/>
+              </w:rPr>
+            </w:pPr>
+            <w:r>
+              <w:rPr>
+                <w:rFonts w:cs="Times New Roman"/>
+                <w:sz w:val="20"/>
+                <w:szCs w:val="20"/>
+                <w:lang w:eastAsia="en-US"/>
+              </w:rPr>
+              <w:t>0.1864</w:t>
+            </w:r>
+          </w:p>
+        </w:tc>
+        <w:tc>
+          <w:tcPr>
+            <w:tcW w:w="2554" w:type="dxa"/>
+            <w:noWrap/>
+            <w:vAlign w:val="center"/>
+          </w:tcPr>
+          <w:p>
+            <w:pPr>
+              <w:keepNext/>
+              <w:spacing w:line="240" w:lineRule="auto" w:before="20" w:after="20"/>
+              <w:ind w:firstLine="0"/>
+              <w:jc w:val="center"/>
+              <w:rPr>
+                <w:rFonts w:cs="Times New Roman"/>
+                <w:sz w:val="22"/>
+                <w:szCs w:val="22"/>
+                <w:lang w:eastAsia="en-US"/>
+              </w:rPr>
+            </w:pPr>
+            <w:r>
+              <w:rPr>
+                <w:rFonts w:cs="Times New Roman"/>
+                <w:sz w:val="20"/>
+                <w:szCs w:val="20"/>
+                <w:lang w:eastAsia="en-US"/>
+              </w:rPr>
+              <w:t>-0.9</w:t>
             </w:r>
           </w:p>
         </w:tc>

</xml_diff>

<commit_message>
Table S2/S3: coarser mesh gives higher mass loss, positive errors kept
</commit_message>
<xml_diff>
--- a/Supplementary_original_order.docx
+++ b/Supplementary_original_order.docx
@@ -4783,7 +4783,16 @@
                 <w:szCs w:val="20"/>
                 <w:lang w:eastAsia="en-US"/>
               </w:rPr>
-              <w:t>0.0240</w:t>
+              <w:t xml:space="preserve">0.</w:t>
+            </w:r>
+            <w:r>
+              <w:rPr>
+                <w:rFonts w:cs="Times New Roman"/>
+                <w:sz w:val="20"/>
+                <w:szCs w:val="20"/>
+                <w:lang w:eastAsia="en-US"/>
+              </w:rPr>
+              <w:t xml:space="preserve">3009</w:t>
             </w:r>
           </w:p>
         </w:tc>
@@ -4813,7 +4822,7 @@
                 <w:szCs w:val="20"/>
                 <w:lang w:eastAsia="en-US"/>
               </w:rPr>
-              <w:t>-87.2</w:t>
+              <w:t xml:space="preserve">87.2</w:t>
             </w:r>
           </w:p>
         </w:tc>
@@ -4909,16 +4918,16 @@
                 <w:szCs w:val="20"/>
                 <w:lang w:eastAsia="en-US"/>
               </w:rPr>
-              <w:t>0.</w:t>
-            </w:r>
-            <w:r>
-              <w:rPr>
-                <w:rFonts w:cs="Times New Roman"/>
-                <w:sz w:val="20"/>
-                <w:szCs w:val="20"/>
-                <w:lang w:eastAsia="en-US"/>
-              </w:rPr>
-              <w:t>1387</w:t>
+              <w:t xml:space="preserve">0.</w:t>
+            </w:r>
+            <w:r>
+              <w:rPr>
+                <w:rFonts w:cs="Times New Roman"/>
+                <w:sz w:val="20"/>
+                <w:szCs w:val="20"/>
+                <w:lang w:eastAsia="en-US"/>
+              </w:rPr>
+              <w:t xml:space="preserve">2029</w:t>
             </w:r>
           </w:p>
         </w:tc>
@@ -4948,7 +4957,7 @@
                 <w:szCs w:val="20"/>
                 <w:lang w:eastAsia="en-US"/>
               </w:rPr>
-              <w:t>-26.2</w:t>
+              <w:t xml:space="preserve">26.2</w:t>
             </w:r>
           </w:p>
         </w:tc>
@@ -5044,16 +5053,16 @@
                 <w:szCs w:val="20"/>
                 <w:lang w:eastAsia="en-US"/>
               </w:rPr>
-              <w:t>0.</w:t>
-            </w:r>
-            <w:r>
-              <w:rPr>
-                <w:rFonts w:cs="Times New Roman"/>
-                <w:sz w:val="20"/>
-                <w:szCs w:val="20"/>
-                <w:lang w:eastAsia="en-US"/>
-              </w:rPr>
-              <w:t>1794</w:t>
+              <w:t xml:space="preserve">0.</w:t>
+            </w:r>
+            <w:r>
+              <w:rPr>
+                <w:rFonts w:cs="Times New Roman"/>
+                <w:sz w:val="20"/>
+                <w:szCs w:val="20"/>
+                <w:lang w:eastAsia="en-US"/>
+              </w:rPr>
+              <w:t xml:space="preserve">1682</w:t>
             </w:r>
           </w:p>
         </w:tc>
@@ -5083,7 +5092,7 @@
                 <w:szCs w:val="20"/>
                 <w:lang w:eastAsia="en-US"/>
               </w:rPr>
-              <w:t>-4.6</w:t>
+              <w:t xml:space="preserve">4.6</w:t>
             </w:r>
           </w:p>
         </w:tc>
@@ -5179,16 +5188,16 @@
                 <w:szCs w:val="20"/>
                 <w:lang w:eastAsia="en-US"/>
               </w:rPr>
-              <w:t>0.</w:t>
-            </w:r>
-            <w:r>
-              <w:rPr>
-                <w:rFonts w:cs="Times New Roman"/>
-                <w:sz w:val="20"/>
-                <w:szCs w:val="20"/>
-                <w:lang w:eastAsia="en-US"/>
-              </w:rPr>
-              <w:t>1846</w:t>
+              <w:t xml:space="preserve">0.</w:t>
+            </w:r>
+            <w:r>
+              <w:rPr>
+                <w:rFonts w:cs="Times New Roman"/>
+                <w:sz w:val="20"/>
+                <w:szCs w:val="20"/>
+                <w:lang w:eastAsia="en-US"/>
+              </w:rPr>
+              <w:t xml:space="preserve">1637</w:t>
             </w:r>
           </w:p>
         </w:tc>
@@ -5218,7 +5227,7 @@
                 <w:szCs w:val="20"/>
                 <w:lang w:eastAsia="en-US"/>
               </w:rPr>
-              <w:t>-1.8</w:t>
+              <w:t xml:space="preserve">1.8</w:t>
             </w:r>
           </w:p>
         </w:tc>
@@ -5314,16 +5323,16 @@
                 <w:szCs w:val="20"/>
                 <w:lang w:eastAsia="en-US"/>
               </w:rPr>
-              <w:t>0.</w:t>
-            </w:r>
-            <w:r>
-              <w:rPr>
-                <w:rFonts w:cs="Times New Roman"/>
-                <w:sz w:val="20"/>
-                <w:szCs w:val="20"/>
-                <w:lang w:eastAsia="en-US"/>
-              </w:rPr>
-              <w:t>1871</w:t>
+              <w:t xml:space="preserve">0.</w:t>
+            </w:r>
+            <w:r>
+              <w:rPr>
+                <w:rFonts w:cs="Times New Roman"/>
+                <w:sz w:val="20"/>
+                <w:szCs w:val="20"/>
+                <w:lang w:eastAsia="en-US"/>
+              </w:rPr>
+              <w:t xml:space="preserve">1616</w:t>
             </w:r>
           </w:p>
         </w:tc>
@@ -5353,25 +5362,7 @@
                 <w:szCs w:val="20"/>
                 <w:lang w:eastAsia="en-US"/>
               </w:rPr>
-              <w:t>0</w:t>
-            </w:r>
-            <w:r>
-              <w:rPr>
-                <w:rFonts w:cs="Times New Roman"/>
-                <w:sz w:val="20"/>
-                <w:szCs w:val="20"/>
-                <w:lang w:eastAsia="en-US"/>
-              </w:rPr>
-              <w:t>.</w:t>
-            </w:r>
-            <w:r>
-              <w:rPr>
-                <w:rFonts w:cs="Times New Roman"/>
-                <w:sz w:val="20"/>
-                <w:szCs w:val="20"/>
-                <w:lang w:eastAsia="en-US"/>
-              </w:rPr>
-              <w:t>5</w:t>
+              <w:t xml:space="preserve">0.5</w:t>
             </w:r>
           </w:p>
         </w:tc>
@@ -5467,16 +5458,16 @@
                 <w:szCs w:val="20"/>
                 <w:lang w:eastAsia="en-US"/>
               </w:rPr>
-              <w:t>0.</w:t>
-            </w:r>
-            <w:r>
-              <w:rPr>
-                <w:rFonts w:cs="Times New Roman"/>
-                <w:sz w:val="20"/>
-                <w:szCs w:val="20"/>
-                <w:lang w:eastAsia="en-US"/>
-              </w:rPr>
-              <w:t>1880</w:t>
+              <w:t xml:space="preserve">0.</w:t>
+            </w:r>
+            <w:r>
+              <w:rPr>
+                <w:rFonts w:cs="Times New Roman"/>
+                <w:sz w:val="20"/>
+                <w:szCs w:val="20"/>
+                <w:lang w:eastAsia="en-US"/>
+              </w:rPr>
+              <w:t xml:space="preserve">1622</w:t>
             </w:r>
           </w:p>
         </w:tc>
@@ -5506,7 +5497,7 @@
                 <w:szCs w:val="20"/>
                 <w:lang w:eastAsia="en-US"/>
               </w:rPr>
-              <w:t>0.87</w:t>
+              <w:t xml:space="preserve">0.87</w:t>
             </w:r>
           </w:p>
         </w:tc>
@@ -5620,7 +5611,7 @@
                 <w:szCs w:val="20"/>
                 <w:lang w:eastAsia="en-US"/>
               </w:rPr>
-              <w:t xml:space="preserve">1897</w:t>
+              <w:t xml:space="preserve">1608</w:t>
             </w:r>
           </w:p>
         </w:tc>
@@ -5650,7 +5641,7 @@
                 <w:szCs w:val="20"/>
                 <w:lang w:eastAsia="en-US"/>
               </w:rPr>
-              <w:t>0.9</w:t>
+              <w:t xml:space="preserve">—</w:t>
             </w:r>
           </w:p>
         </w:tc>
@@ -6118,7 +6109,16 @@
                 <w:szCs w:val="20"/>
                 <w:lang w:eastAsia="en-US"/>
               </w:rPr>
-              <w:t>0.0415</w:t>
+              <w:t xml:space="preserve">0.</w:t>
+            </w:r>
+            <w:r>
+              <w:rPr>
+                <w:rFonts w:cs="Times New Roman"/>
+                <w:sz w:val="20"/>
+                <w:szCs w:val="20"/>
+                <w:lang w:eastAsia="en-US"/>
+              </w:rPr>
+              <w:t xml:space="preserve">2860</w:t>
             </w:r>
           </w:p>
         </w:tc>
@@ -6148,7 +6148,7 @@
                 <w:szCs w:val="20"/>
                 <w:lang w:eastAsia="en-US"/>
               </w:rPr>
-              <w:t>-77.9</w:t>
+              <w:t xml:space="preserve">77.9</w:t>
             </w:r>
           </w:p>
         </w:tc>
@@ -6283,16 +6283,16 @@
                 <w:szCs w:val="20"/>
                 <w:lang w:eastAsia="en-US"/>
               </w:rPr>
-              <w:t>0.</w:t>
-            </w:r>
-            <w:r>
-              <w:rPr>
-                <w:rFonts w:cs="Times New Roman"/>
-                <w:sz w:val="20"/>
-                <w:szCs w:val="20"/>
-                <w:lang w:eastAsia="en-US"/>
-              </w:rPr>
-              <w:t>1387</w:t>
+              <w:t xml:space="preserve">0.</w:t>
+            </w:r>
+            <w:r>
+              <w:rPr>
+                <w:rFonts w:cs="Times New Roman"/>
+                <w:sz w:val="20"/>
+                <w:szCs w:val="20"/>
+                <w:lang w:eastAsia="en-US"/>
+              </w:rPr>
+              <w:t xml:space="preserve">2029</w:t>
             </w:r>
           </w:p>
         </w:tc>
@@ -6322,7 +6322,7 @@
                 <w:szCs w:val="20"/>
                 <w:lang w:eastAsia="en-US"/>
               </w:rPr>
-              <w:t>-26.2</w:t>
+              <w:t xml:space="preserve">26.2</w:t>
             </w:r>
           </w:p>
         </w:tc>
@@ -6443,7 +6443,43 @@
                 <w:szCs w:val="20"/>
                 <w:lang w:eastAsia="en-US"/>
               </w:rPr>
-              <w:t>18,864,900</w:t>
+              <w:t xml:space="preserve">21</w:t>
+            </w:r>
+            <w:r>
+              <w:rPr>
+                <w:rFonts w:cs="Times New Roman"/>
+                <w:sz w:val="20"/>
+                <w:szCs w:val="20"/>
+                <w:lang w:eastAsia="en-US"/>
+              </w:rPr>
+              <w:t xml:space="preserve">,</w:t>
+            </w:r>
+            <w:r>
+              <w:rPr>
+                <w:rFonts w:cs="Times New Roman"/>
+                <w:sz w:val="20"/>
+                <w:szCs w:val="20"/>
+                <w:lang w:eastAsia="en-US"/>
+              </w:rPr>
+              <w:t xml:space="preserve">245</w:t>
+            </w:r>
+            <w:r>
+              <w:rPr>
+                <w:rFonts w:cs="Times New Roman"/>
+                <w:sz w:val="20"/>
+                <w:szCs w:val="20"/>
+                <w:lang w:eastAsia="en-US"/>
+              </w:rPr>
+              <w:t xml:space="preserve">,</w:t>
+            </w:r>
+            <w:r>
+              <w:rPr>
+                <w:rFonts w:cs="Times New Roman"/>
+                <w:sz w:val="20"/>
+                <w:szCs w:val="20"/>
+                <w:lang w:eastAsia="en-US"/>
+              </w:rPr>
+              <w:t xml:space="preserve">850</w:t>
             </w:r>
           </w:p>
         </w:tc>
@@ -6472,16 +6508,16 @@
                 <w:szCs w:val="20"/>
                 <w:lang w:eastAsia="en-US"/>
               </w:rPr>
-              <w:t>0.</w:t>
-            </w:r>
-            <w:r>
-              <w:rPr>
-                <w:rFonts w:cs="Times New Roman"/>
-                <w:sz w:val="20"/>
-                <w:szCs w:val="20"/>
-                <w:lang w:eastAsia="en-US"/>
-              </w:rPr>
-              <w:t>1880</w:t>
+              <w:t xml:space="preserve">0.</w:t>
+            </w:r>
+            <w:r>
+              <w:rPr>
+                <w:rFonts w:cs="Times New Roman"/>
+                <w:sz w:val="20"/>
+                <w:szCs w:val="20"/>
+                <w:lang w:eastAsia="en-US"/>
+              </w:rPr>
+              <w:t xml:space="preserve">1608</w:t>
             </w:r>
           </w:p>
         </w:tc>

</xml_diff>

<commit_message>
Table S2: L6 0.1611 (0.19%)
</commit_message>
<xml_diff>
--- a/Supplementary_original_order.docx
+++ b/Supplementary_original_order.docx
@@ -5467,7 +5467,7 @@
                 <w:szCs w:val="20"/>
                 <w:lang w:eastAsia="en-US"/>
               </w:rPr>
-              <w:t xml:space="preserve">1622</w:t>
+              <w:t xml:space="preserve">1611</w:t>
             </w:r>
           </w:p>
         </w:tc>
@@ -5497,7 +5497,16 @@
                 <w:szCs w:val="20"/>
                 <w:lang w:eastAsia="en-US"/>
               </w:rPr>
-              <w:t xml:space="preserve">0.87</w:t>
+              <w:t xml:space="preserve">0.</w:t>
+            </w:r>
+            <w:r>
+              <w:rPr>
+                <w:rFonts w:cs="Times New Roman"/>
+                <w:sz w:val="20"/>
+                <w:szCs w:val="20"/>
+                <w:lang w:eastAsia="en-US"/>
+              </w:rPr>
+              <w:t xml:space="preserve">19</w:t>
             </w:r>
           </w:p>
         </w:tc>

</xml_diff>

<commit_message>
SI Section S1: brief pointer to Section S8 (O2 mass balance)
</commit_message>
<xml_diff>
--- a/Supplementary_original_order.docx
+++ b/Supplementary_original_order.docx
@@ -105,13 +105,7 @@
         <w:rPr>
           <w:sz w:val="20"/>
         </w:rPr>
-        <w:t xml:space="preserve">Monash Centre for Additive </w:t>
-      </w:r>
-      <w:r>
-        <w:rPr>
-          <w:sz w:val="20"/>
-        </w:rPr>
-        <w:t>Manufacturing, Monash University, Wellington Rd, Clayton, VIC 3800, Australia</w:t>
+        <w:t>Monash Centre for Additive Manufacturing, Monash University, Wellington Rd, Clayton, VIC 3800, Australia</w:t>
       </w:r>
     </w:p>
     <w:p>
@@ -147,14 +141,7 @@
           <w:i/>
           <w:sz w:val="20"/>
         </w:rPr>
-        <w:t>A. Huang, Y. Tang, Y. Z</w:t>
-      </w:r>
-      <w:r>
-        <w:rPr>
-          <w:i/>
-          <w:sz w:val="20"/>
-        </w:rPr>
-        <w:t>hu</w:t>
+        <w:t>A. Huang, Y. Tang, Y. Zhu</w:t>
       </w:r>
     </w:p>
     <w:p>
@@ -339,14 +326,7 @@
                 <w:sz w:val="20"/>
                 <w:szCs w:val="20"/>
               </w:rPr>
-              <w:t xml:space="preserve">Model </w:t>
-            </w:r>
-            <w:r>
-              <w:rPr>
-                <w:sz w:val="20"/>
-                <w:szCs w:val="20"/>
-              </w:rPr>
-              <w:t>equations and velocity-selection rule</w:t>
+              <w:t>Model equations and velocity-selection rule</w:t>
             </w:r>
           </w:p>
         </w:tc>
@@ -374,7 +354,7 @@
                 <w:sz w:val="20"/>
                 <w:szCs w:val="20"/>
               </w:rPr>
-              <w:t xml:space="preserve">Figure</w:t>
+              <w:t>Figure</w:t>
             </w:r>
             <w:r>
               <w:rPr>
@@ -457,21 +437,21 @@
                 <w:sz w:val="20"/>
                 <w:szCs w:val="20"/>
               </w:rPr>
-              <w:t xml:space="preserve">S2</w:t>
-            </w:r>
-            <w:r>
-              <w:rPr>
-                <w:sz w:val="20"/>
-                <w:szCs w:val="20"/>
-              </w:rPr>
-              <w:t xml:space="preserve">–</w:t>
-            </w:r>
-            <w:r>
-              <w:rPr>
-                <w:sz w:val="20"/>
-                <w:szCs w:val="20"/>
-              </w:rPr>
-              <w:t xml:space="preserve">S3</w:t>
+              <w:t>S2</w:t>
+            </w:r>
+            <w:r>
+              <w:rPr>
+                <w:sz w:val="20"/>
+                <w:szCs w:val="20"/>
+              </w:rPr>
+              <w:t>–</w:t>
+            </w:r>
+            <w:r>
+              <w:rPr>
+                <w:sz w:val="20"/>
+                <w:szCs w:val="20"/>
+              </w:rPr>
+              <w:t>S3</w:t>
             </w:r>
           </w:p>
         </w:tc>
@@ -616,7 +596,7 @@
                 <w:sz w:val="20"/>
                 <w:szCs w:val="20"/>
               </w:rPr>
-              <w:t xml:space="preserve">S4</w:t>
+              <w:t>S4</w:t>
             </w:r>
           </w:p>
         </w:tc>
@@ -692,7 +672,7 @@
                 <w:sz w:val="20"/>
                 <w:szCs w:val="20"/>
               </w:rPr>
-              <w:t xml:space="preserve">S5</w:t>
+              <w:t>S5</w:t>
             </w:r>
           </w:p>
         </w:tc>
@@ -833,14 +813,7 @@
                 <w:sz w:val="20"/>
                 <w:szCs w:val="20"/>
               </w:rPr>
-              <w:t xml:space="preserve">Table S12; Figures </w:t>
-            </w:r>
-            <w:r>
-              <w:rPr>
-                <w:sz w:val="20"/>
-                <w:szCs w:val="20"/>
-              </w:rPr>
-              <w:t>S7–S9</w:t>
+              <w:t>Table S12; Figures S7–S9</w:t>
             </w:r>
           </w:p>
         </w:tc>
@@ -936,13 +909,10 @@
         <w:t xml:space="preserve">This section defines the quantities used to evaluate the simulations (Equations S1–S3) and documents the choice of velocity-selection rule (Rules A–D; Table S1 and </w:t>
       </w:r>
       <w:r>
-        <w:t xml:space="preserve">Fi</w:t>
-      </w:r>
-      <w:r>
-        <w:t xml:space="preserve">gure</w:t>
-      </w:r>
-      <w:r>
-        <w:t xml:space="preserve"> S1</w:t>
+        <w:t>Figure S1</w:t>
+      </w:r>
+      <w:r>
+        <w:t xml:space="preserve">; the O₂ mass balance is given in Section S8</w:t>
       </w:r>
       <w:r>
         <w:t xml:space="preserve">).</w:t>
@@ -3203,25 +3173,7 @@
         </w:rPr>
       </w:pPr>
       <w:r>
-        <w:t xml:space="preserve">Rule A (hard minimum) was adopted on physical and numerical grounds. Agreement with the literature </w:t>
-      </w:r>
-      <w:r>
-        <w:t xml:space="preserve">data </w:t>
-      </w:r>
-      <w:r>
-        <w:t>served as a consistency check rather than</w:t>
-      </w:r>
-      <w:r>
-        <w:t xml:space="preserve"> as</w:t>
-      </w:r>
-      <w:r>
-        <w:t xml:space="preserve"> the selection criterion, because RMSE depends on</w:t>
-      </w:r>
-      <w:r>
-        <w:t xml:space="preserve"> the</w:t>
-      </w:r>
-      <w:r>
-        <w:t xml:space="preserve"> calibration and could be reduced for any rule by recalibrating it.</w:t>
+        <w:t>Rule A (hard minimum) was adopted on physical and numerical grounds. Agreement with the literature data served as a consistency check rather than as the selection criterion, because RMSE depends on the calibration and could be reduced for any rule by recalibrating it.</w:t>
       </w:r>
     </w:p>
     <w:p>
@@ -3238,43 +3190,7 @@
         <w:t>controlled stage</w:t>
       </w:r>
       <w:r>
-        <w:t xml:space="preserve"> the interface is oxygen-diffusion-lim</w:t>
-      </w:r>
-      <w:r>
-        <w:t>ited, and oxygen diffusion controls more than 99% of the interface area at 672 h. Blended rules (Rules B and C) change the prediction only where two velocities are comparable, which rarely occurs here, and they represent co-controlled mechanisms that the r</w:t>
-      </w:r>
-      <w:r>
-        <w:t xml:space="preserve">esults do not show. Second, Rule D removes the oxygen-diffusion cap, so oxygen reduction proceeds irrespective of the local oxygen supply. This is inconsistent with oxygen-limited degradation and </w:t>
-      </w:r>
-      <w:r>
-        <w:t>over-predicts the</w:t>
-      </w:r>
-      <w:r>
-        <w:t xml:space="preserve"> mass loss (0.58% at 168 h </w:t>
-      </w:r>
-      <w:r>
-        <w:t>against</w:t>
-      </w:r>
-      <w:r>
-        <w:t xml:space="preserve"> </w:t>
-      </w:r>
-      <w:r>
-        <w:t xml:space="preserve">0.20% in the literature data, and 0.94% </w:t>
-      </w:r>
-      <w:r>
-        <w:t>against</w:t>
-      </w:r>
-      <w:r>
-        <w:t xml:space="preserve"> </w:t>
-      </w:r>
-      <w:r>
-        <w:t>0.23% for Rule A at 672 h). Third, Rule A adds no parameters or regularization, whereas Rules B and C introduce blending terms. Fourth, the non-differentiability of the hard minimum did not ca</w:t>
-      </w:r>
-      <w:r>
-        <w:t>use switching artifacts: only two controlling-regime transitions occurred (1.2% of the 167 recorded steps), both during the initial transient. The same count was obtained for Rules B–D, so this criterion does not separate the rules but removes the main obj</w:t>
-      </w:r>
-      <w:r>
-        <w:t>ection to Rule A.</w:t>
+        <w:t xml:space="preserve"> the interface is oxygen-diffusion-limited, and oxygen diffusion controls more than 99% of the interface area at 672 h. Blended rules (Rules B and C) change the prediction only where two velocities are comparable, which rarely occurs here, and they represent co-controlled mechanisms that the results do not show. Second, Rule D removes the oxygen-diffusion cap, so oxygen reduction proceeds irrespective of the local oxygen supply. This is inconsistent with oxygen-limited degradation and over-predicts the mass loss (0.58% at 168 h against 0.20% in the literature data, and 0.94% against 0.23% for Rule A at 672 h). Third, Rule A adds no parameters or regularization, whereas Rules B and C introduce blending terms. Fourth, the non-differentiability of the hard minimum did not cause switching artifacts: only two controlling-regime transitions occurred (1.2% of the 167 recorded steps), both during the initial transient. The same count was obtained for Rules B–D, so this criterion does not separate the rules but removes the main objection to Rule A.</w:t>
       </w:r>
     </w:p>
     <w:p>
@@ -4207,19 +4123,10 @@
         <w:t xml:space="preserve">Table S2 and Figure </w:t>
       </w:r>
       <w:r>
-        <w:t xml:space="preserve">S2</w:t>
-      </w:r>
-      <w:r>
-        <w:t xml:space="preserve"> report the mesh convergence study, and Table S3 compares </w:t>
-      </w:r>
-      <w:r>
-        <w:t xml:space="preserve">an </w:t>
-      </w:r>
-      <w:r>
-        <w:t>adaptive</w:t>
-      </w:r>
-      <w:r>
-        <w:t xml:space="preserve"> mesh with a uniform mesh.</w:t>
+        <w:t>S2</w:t>
+      </w:r>
+      <w:r>
+        <w:t xml:space="preserve"> report the mesh convergence study, and Table S3 compares an adaptive mesh with a uniform mesh.</w:t>
       </w:r>
     </w:p>
     <w:p>
@@ -4230,10 +4137,7 @@
         <w:ind w:firstLine="0"/>
       </w:pPr>
       <w:r>
-        <w:t>Mesh convergence was assessed from the relative error of the predicted mass loss with respect to the reference mes</w:t>
-      </w:r>
-      <w:r>
-        <w:t>h:</w:t>
+        <w:t>Mesh convergence was assessed from the relative error of the predicted mass loss with respect to the reference mesh:</w:t>
       </w:r>
     </w:p>
     <w:p>
@@ -4457,22 +4361,7 @@
       </w:r>
       <w:proofErr w:type="spellEnd"/>
       <w:r>
-        <w:t xml:space="preserve"> is the predicted mass loss for the </w:t>
-      </w:r>
-      <w:r>
-        <w:t>reference</w:t>
-      </w:r>
-      <w:r>
-        <w:t xml:space="preserve"> mesh (</w:t>
-      </w:r>
-      <w:r>
-        <w:t>21.25 million elements</w:t>
-      </w:r>
-      <w:r>
-        <w:t>)</w:t>
-      </w:r>
-      <w:r>
-        <w:t>.</w:t>
+        <w:t xml:space="preserve"> is the predicted mass loss for the reference mesh (21.25 million elements).</w:t>
       </w:r>
     </w:p>
     <w:p>
@@ -4506,16 +4395,7 @@
           <w:sz w:val="20"/>
           <w:szCs w:val="20"/>
         </w:rPr>
-        <w:t xml:space="preserve"> </w:t>
-      </w:r>
-      <w:r>
-        <w:rPr>
-          <w:b/>
-          <w:bCs/>
-          <w:sz w:val="20"/>
-          <w:szCs w:val="20"/>
-        </w:rPr>
-        <w:t>mesh.</w:t>
+        <w:t xml:space="preserve"> mesh.</w:t>
       </w:r>
     </w:p>
     <w:tbl>
@@ -4783,16 +4663,16 @@
                 <w:szCs w:val="20"/>
                 <w:lang w:eastAsia="en-US"/>
               </w:rPr>
-              <w:t xml:space="preserve">0.</w:t>
-            </w:r>
-            <w:r>
-              <w:rPr>
-                <w:rFonts w:cs="Times New Roman"/>
-                <w:sz w:val="20"/>
-                <w:szCs w:val="20"/>
-                <w:lang w:eastAsia="en-US"/>
-              </w:rPr>
-              <w:t xml:space="preserve">3009</w:t>
+              <w:t>0.</w:t>
+            </w:r>
+            <w:r>
+              <w:rPr>
+                <w:rFonts w:cs="Times New Roman"/>
+                <w:sz w:val="20"/>
+                <w:szCs w:val="20"/>
+                <w:lang w:eastAsia="en-US"/>
+              </w:rPr>
+              <w:t>3009</w:t>
             </w:r>
           </w:p>
         </w:tc>
@@ -4822,7 +4702,7 @@
                 <w:szCs w:val="20"/>
                 <w:lang w:eastAsia="en-US"/>
               </w:rPr>
-              <w:t xml:space="preserve">87.2</w:t>
+              <w:t>87.2</w:t>
             </w:r>
           </w:p>
         </w:tc>
@@ -4918,16 +4798,16 @@
                 <w:szCs w:val="20"/>
                 <w:lang w:eastAsia="en-US"/>
               </w:rPr>
-              <w:t xml:space="preserve">0.</w:t>
-            </w:r>
-            <w:r>
-              <w:rPr>
-                <w:rFonts w:cs="Times New Roman"/>
-                <w:sz w:val="20"/>
-                <w:szCs w:val="20"/>
-                <w:lang w:eastAsia="en-US"/>
-              </w:rPr>
-              <w:t xml:space="preserve">2029</w:t>
+              <w:t>0.</w:t>
+            </w:r>
+            <w:r>
+              <w:rPr>
+                <w:rFonts w:cs="Times New Roman"/>
+                <w:sz w:val="20"/>
+                <w:szCs w:val="20"/>
+                <w:lang w:eastAsia="en-US"/>
+              </w:rPr>
+              <w:t>2029</w:t>
             </w:r>
           </w:p>
         </w:tc>
@@ -4957,7 +4837,7 @@
                 <w:szCs w:val="20"/>
                 <w:lang w:eastAsia="en-US"/>
               </w:rPr>
-              <w:t xml:space="preserve">26.2</w:t>
+              <w:t>26.2</w:t>
             </w:r>
           </w:p>
         </w:tc>
@@ -5053,16 +4933,16 @@
                 <w:szCs w:val="20"/>
                 <w:lang w:eastAsia="en-US"/>
               </w:rPr>
-              <w:t xml:space="preserve">0.</w:t>
-            </w:r>
-            <w:r>
-              <w:rPr>
-                <w:rFonts w:cs="Times New Roman"/>
-                <w:sz w:val="20"/>
-                <w:szCs w:val="20"/>
-                <w:lang w:eastAsia="en-US"/>
-              </w:rPr>
-              <w:t xml:space="preserve">1682</w:t>
+              <w:t>0.</w:t>
+            </w:r>
+            <w:r>
+              <w:rPr>
+                <w:rFonts w:cs="Times New Roman"/>
+                <w:sz w:val="20"/>
+                <w:szCs w:val="20"/>
+                <w:lang w:eastAsia="en-US"/>
+              </w:rPr>
+              <w:t>1682</w:t>
             </w:r>
           </w:p>
         </w:tc>
@@ -5092,7 +4972,7 @@
                 <w:szCs w:val="20"/>
                 <w:lang w:eastAsia="en-US"/>
               </w:rPr>
-              <w:t xml:space="preserve">4.6</w:t>
+              <w:t>4.6</w:t>
             </w:r>
           </w:p>
         </w:tc>
@@ -5188,16 +5068,16 @@
                 <w:szCs w:val="20"/>
                 <w:lang w:eastAsia="en-US"/>
               </w:rPr>
-              <w:t xml:space="preserve">0.</w:t>
-            </w:r>
-            <w:r>
-              <w:rPr>
-                <w:rFonts w:cs="Times New Roman"/>
-                <w:sz w:val="20"/>
-                <w:szCs w:val="20"/>
-                <w:lang w:eastAsia="en-US"/>
-              </w:rPr>
-              <w:t xml:space="preserve">1637</w:t>
+              <w:t>0.</w:t>
+            </w:r>
+            <w:r>
+              <w:rPr>
+                <w:rFonts w:cs="Times New Roman"/>
+                <w:sz w:val="20"/>
+                <w:szCs w:val="20"/>
+                <w:lang w:eastAsia="en-US"/>
+              </w:rPr>
+              <w:t>1637</w:t>
             </w:r>
           </w:p>
         </w:tc>
@@ -5227,7 +5107,7 @@
                 <w:szCs w:val="20"/>
                 <w:lang w:eastAsia="en-US"/>
               </w:rPr>
-              <w:t xml:space="preserve">1.8</w:t>
+              <w:t>1.8</w:t>
             </w:r>
           </w:p>
         </w:tc>
@@ -5323,16 +5203,16 @@
                 <w:szCs w:val="20"/>
                 <w:lang w:eastAsia="en-US"/>
               </w:rPr>
-              <w:t xml:space="preserve">0.</w:t>
-            </w:r>
-            <w:r>
-              <w:rPr>
-                <w:rFonts w:cs="Times New Roman"/>
-                <w:sz w:val="20"/>
-                <w:szCs w:val="20"/>
-                <w:lang w:eastAsia="en-US"/>
-              </w:rPr>
-              <w:t xml:space="preserve">1616</w:t>
+              <w:t>0.</w:t>
+            </w:r>
+            <w:r>
+              <w:rPr>
+                <w:rFonts w:cs="Times New Roman"/>
+                <w:sz w:val="20"/>
+                <w:szCs w:val="20"/>
+                <w:lang w:eastAsia="en-US"/>
+              </w:rPr>
+              <w:t>1616</w:t>
             </w:r>
           </w:p>
         </w:tc>
@@ -5362,7 +5242,7 @@
                 <w:szCs w:val="20"/>
                 <w:lang w:eastAsia="en-US"/>
               </w:rPr>
-              <w:t xml:space="preserve">0.5</w:t>
+              <w:t>0.5</w:t>
             </w:r>
           </w:p>
         </w:tc>
@@ -5458,16 +5338,16 @@
                 <w:szCs w:val="20"/>
                 <w:lang w:eastAsia="en-US"/>
               </w:rPr>
-              <w:t xml:space="preserve">0.</w:t>
-            </w:r>
-            <w:r>
-              <w:rPr>
-                <w:rFonts w:cs="Times New Roman"/>
-                <w:sz w:val="20"/>
-                <w:szCs w:val="20"/>
-                <w:lang w:eastAsia="en-US"/>
-              </w:rPr>
-              <w:t xml:space="preserve">1611</w:t>
+              <w:t>0.161</w:t>
+            </w:r>
+            <w:r>
+              <w:rPr>
+                <w:rFonts w:cs="Times New Roman"/>
+                <w:sz w:val="20"/>
+                <w:szCs w:val="20"/>
+                <w:lang w:eastAsia="en-US"/>
+              </w:rPr>
+              <w:t>1</w:t>
             </w:r>
           </w:p>
         </w:tc>
@@ -5497,16 +5377,16 @@
                 <w:szCs w:val="20"/>
                 <w:lang w:eastAsia="en-US"/>
               </w:rPr>
-              <w:t xml:space="preserve">0.</w:t>
-            </w:r>
-            <w:r>
-              <w:rPr>
-                <w:rFonts w:cs="Times New Roman"/>
-                <w:sz w:val="20"/>
-                <w:szCs w:val="20"/>
-                <w:lang w:eastAsia="en-US"/>
-              </w:rPr>
-              <w:t xml:space="preserve">19</w:t>
+              <w:t>0.</w:t>
+            </w:r>
+            <w:r>
+              <w:rPr>
+                <w:rFonts w:cs="Times New Roman"/>
+                <w:sz w:val="20"/>
+                <w:szCs w:val="20"/>
+                <w:lang w:eastAsia="en-US"/>
+              </w:rPr>
+              <w:t>19</w:t>
             </w:r>
           </w:p>
         </w:tc>
@@ -5572,16 +5452,7 @@
                 <w:szCs w:val="20"/>
                 <w:lang w:eastAsia="en-US"/>
               </w:rPr>
-              <w:t>21,245</w:t>
-            </w:r>
-            <w:r>
-              <w:rPr>
-                <w:rFonts w:cs="Times New Roman"/>
-                <w:sz w:val="20"/>
-                <w:szCs w:val="20"/>
-                <w:lang w:eastAsia="en-US"/>
-              </w:rPr>
-              <w:t>,850</w:t>
+              <w:t>21,245,850</w:t>
             </w:r>
           </w:p>
         </w:tc>
@@ -5620,7 +5491,7 @@
                 <w:szCs w:val="20"/>
                 <w:lang w:eastAsia="en-US"/>
               </w:rPr>
-              <w:t xml:space="preserve">1608</w:t>
+              <w:t>1608</w:t>
             </w:r>
           </w:p>
         </w:tc>
@@ -5650,7 +5521,7 @@
                 <w:szCs w:val="20"/>
                 <w:lang w:eastAsia="en-US"/>
               </w:rPr>
-              <w:t xml:space="preserve">—</w:t>
+              <w:t>—</w:t>
             </w:r>
           </w:p>
         </w:tc>
@@ -5669,7 +5540,7 @@
           <w:sz w:val="20"/>
           <w:szCs w:val="20"/>
         </w:rPr>
-        <w:t xml:space="preserve">Table S3. Comparison between </w:t>
+        <w:t xml:space="preserve">Table S3. Comparison between an adaptive mesh and a uniform mesh </w:t>
       </w:r>
       <w:r>
         <w:rPr>
@@ -5678,7 +5549,7 @@
           <w:sz w:val="20"/>
           <w:szCs w:val="20"/>
         </w:rPr>
-        <w:t xml:space="preserve">an </w:t>
+        <w:t>(</w:t>
       </w:r>
       <w:r>
         <w:rPr>
@@ -5687,7 +5558,7 @@
           <w:sz w:val="20"/>
           <w:szCs w:val="20"/>
         </w:rPr>
-        <w:t>adaptive</w:t>
+        <w:t>approximately</w:t>
       </w:r>
       <w:r>
         <w:rPr>
@@ -5696,7 +5567,7 @@
           <w:sz w:val="20"/>
           <w:szCs w:val="20"/>
         </w:rPr>
-        <w:t xml:space="preserve"> mesh </w:t>
+        <w:t xml:space="preserve"> </w:t>
       </w:r>
       <w:r>
         <w:rPr>
@@ -5705,7 +5576,7 @@
           <w:sz w:val="20"/>
           <w:szCs w:val="20"/>
         </w:rPr>
-        <w:t xml:space="preserve">and </w:t>
+        <w:t>800,000 elements</w:t>
       </w:r>
       <w:r>
         <w:rPr>
@@ -5714,88 +5585,7 @@
           <w:sz w:val="20"/>
           <w:szCs w:val="20"/>
         </w:rPr>
-        <w:t xml:space="preserve">a </w:t>
-      </w:r>
-      <w:r>
-        <w:rPr>
-          <w:b/>
-          <w:bCs/>
-          <w:sz w:val="20"/>
-          <w:szCs w:val="20"/>
-        </w:rPr>
-        <w:t xml:space="preserve">uniform </w:t>
-      </w:r>
-      <w:r>
-        <w:rPr>
-          <w:b/>
-          <w:bCs/>
-          <w:sz w:val="20"/>
-          <w:szCs w:val="20"/>
-        </w:rPr>
-        <w:t>mesh</w:t>
-      </w:r>
-      <w:r>
-        <w:rPr>
-          <w:b/>
-          <w:bCs/>
-          <w:sz w:val="20"/>
-          <w:szCs w:val="20"/>
-        </w:rPr>
-        <w:t xml:space="preserve"> </w:t>
-      </w:r>
-      <w:r>
-        <w:rPr>
-          <w:b/>
-          <w:bCs/>
-          <w:sz w:val="20"/>
-          <w:szCs w:val="20"/>
-        </w:rPr>
-        <w:t>(</w:t>
-      </w:r>
-      <w:r>
-        <w:rPr>
-          <w:b/>
-          <w:bCs/>
-          <w:sz w:val="20"/>
-          <w:szCs w:val="20"/>
-        </w:rPr>
-        <w:t>approximately</w:t>
-      </w:r>
-      <w:r>
-        <w:rPr>
-          <w:b/>
-          <w:bCs/>
-          <w:sz w:val="20"/>
-          <w:szCs w:val="20"/>
-        </w:rPr>
-        <w:t xml:space="preserve"> </w:t>
-      </w:r>
-      <w:r>
-        <w:rPr>
-          <w:b/>
-          <w:bCs/>
-          <w:sz w:val="20"/>
-          <w:szCs w:val="20"/>
-        </w:rPr>
-        <w:t>800,000 elements</w:t>
-      </w:r>
-      <w:r>
-        <w:rPr>
-          <w:b/>
-          <w:bCs/>
-          <w:sz w:val="20"/>
-          <w:szCs w:val="20"/>
-        </w:rPr>
-        <w:t>)</w:t>
-      </w:r>
-      <w:r>
-        <w:rPr>
-          <w:b/>
-          <w:bCs/>
-          <w:sz w:val="20"/>
-          <w:szCs w:val="20"/>
-        </w:rPr>
-        <w:t>.</w:t>
+        <w:t>).</w:t>
       </w:r>
     </w:p>
     <w:tbl>
@@ -6118,16 +5908,16 @@
                 <w:szCs w:val="20"/>
                 <w:lang w:eastAsia="en-US"/>
               </w:rPr>
-              <w:t xml:space="preserve">0.</w:t>
-            </w:r>
-            <w:r>
-              <w:rPr>
-                <w:rFonts w:cs="Times New Roman"/>
-                <w:sz w:val="20"/>
-                <w:szCs w:val="20"/>
-                <w:lang w:eastAsia="en-US"/>
-              </w:rPr>
-              <w:t xml:space="preserve">2860</w:t>
+              <w:t>0.</w:t>
+            </w:r>
+            <w:r>
+              <w:rPr>
+                <w:rFonts w:cs="Times New Roman"/>
+                <w:sz w:val="20"/>
+                <w:szCs w:val="20"/>
+                <w:lang w:eastAsia="en-US"/>
+              </w:rPr>
+              <w:t>2860</w:t>
             </w:r>
           </w:p>
         </w:tc>
@@ -6157,7 +5947,7 @@
                 <w:szCs w:val="20"/>
                 <w:lang w:eastAsia="en-US"/>
               </w:rPr>
-              <w:t xml:space="preserve">77.9</w:t>
+              <w:t>77.9</w:t>
             </w:r>
           </w:p>
         </w:tc>
@@ -6292,16 +6082,16 @@
                 <w:szCs w:val="20"/>
                 <w:lang w:eastAsia="en-US"/>
               </w:rPr>
-              <w:t xml:space="preserve">0.</w:t>
-            </w:r>
-            <w:r>
-              <w:rPr>
-                <w:rFonts w:cs="Times New Roman"/>
-                <w:sz w:val="20"/>
-                <w:szCs w:val="20"/>
-                <w:lang w:eastAsia="en-US"/>
-              </w:rPr>
-              <w:t xml:space="preserve">2029</w:t>
+              <w:t>0.</w:t>
+            </w:r>
+            <w:r>
+              <w:rPr>
+                <w:rFonts w:cs="Times New Roman"/>
+                <w:sz w:val="20"/>
+                <w:szCs w:val="20"/>
+                <w:lang w:eastAsia="en-US"/>
+              </w:rPr>
+              <w:t>2029</w:t>
             </w:r>
           </w:p>
         </w:tc>
@@ -6331,7 +6121,7 @@
                 <w:szCs w:val="20"/>
                 <w:lang w:eastAsia="en-US"/>
               </w:rPr>
-              <w:t xml:space="preserve">26.2</w:t>
+              <w:t>26.2</w:t>
             </w:r>
           </w:p>
         </w:tc>
@@ -6361,16 +6151,7 @@
                 <w:szCs w:val="20"/>
                 <w:lang w:eastAsia="en-US"/>
               </w:rPr>
-              <w:t>0.</w:t>
-            </w:r>
-            <w:r>
-              <w:rPr>
-                <w:rFonts w:cs="Times New Roman"/>
-                <w:sz w:val="20"/>
-                <w:szCs w:val="20"/>
-                <w:lang w:eastAsia="en-US"/>
-              </w:rPr>
-              <w:t>663</w:t>
+              <w:t>0.663</w:t>
             </w:r>
           </w:p>
         </w:tc>
@@ -6452,43 +6233,7 @@
                 <w:szCs w:val="20"/>
                 <w:lang w:eastAsia="en-US"/>
               </w:rPr>
-              <w:t xml:space="preserve">21</w:t>
-            </w:r>
-            <w:r>
-              <w:rPr>
-                <w:rFonts w:cs="Times New Roman"/>
-                <w:sz w:val="20"/>
-                <w:szCs w:val="20"/>
-                <w:lang w:eastAsia="en-US"/>
-              </w:rPr>
-              <w:t xml:space="preserve">,</w:t>
-            </w:r>
-            <w:r>
-              <w:rPr>
-                <w:rFonts w:cs="Times New Roman"/>
-                <w:sz w:val="20"/>
-                <w:szCs w:val="20"/>
-                <w:lang w:eastAsia="en-US"/>
-              </w:rPr>
-              <w:t xml:space="preserve">245</w:t>
-            </w:r>
-            <w:r>
-              <w:rPr>
-                <w:rFonts w:cs="Times New Roman"/>
-                <w:sz w:val="20"/>
-                <w:szCs w:val="20"/>
-                <w:lang w:eastAsia="en-US"/>
-              </w:rPr>
-              <w:t xml:space="preserve">,</w:t>
-            </w:r>
-            <w:r>
-              <w:rPr>
-                <w:rFonts w:cs="Times New Roman"/>
-                <w:sz w:val="20"/>
-                <w:szCs w:val="20"/>
-                <w:lang w:eastAsia="en-US"/>
-              </w:rPr>
-              <w:t xml:space="preserve">850</w:t>
+              <w:t>21,245,850</w:t>
             </w:r>
           </w:p>
         </w:tc>
@@ -6517,16 +6262,16 @@
                 <w:szCs w:val="20"/>
                 <w:lang w:eastAsia="en-US"/>
               </w:rPr>
-              <w:t xml:space="preserve">0.</w:t>
-            </w:r>
-            <w:r>
-              <w:rPr>
-                <w:rFonts w:cs="Times New Roman"/>
-                <w:sz w:val="20"/>
-                <w:szCs w:val="20"/>
-                <w:lang w:eastAsia="en-US"/>
-              </w:rPr>
-              <w:t xml:space="preserve">1608</w:t>
+              <w:t>0.</w:t>
+            </w:r>
+            <w:r>
+              <w:rPr>
+                <w:rFonts w:cs="Times New Roman"/>
+                <w:sz w:val="20"/>
+                <w:szCs w:val="20"/>
+                <w:lang w:eastAsia="en-US"/>
+              </w:rPr>
+              <w:t>1608</w:t>
             </w:r>
           </w:p>
         </w:tc>
@@ -6667,7 +6412,7 @@
           <w:sz w:val="20"/>
           <w:szCs w:val="20"/>
         </w:rPr>
-        <w:t xml:space="preserve">S2</w:t>
+        <w:t>S</w:t>
       </w:r>
       <w:r>
         <w:rPr>
@@ -6676,7 +6421,7 @@
           <w:sz w:val="20"/>
           <w:szCs w:val="20"/>
         </w:rPr>
-        <w:t xml:space="preserve">. Mesh convergence analysis showing (a) predicted mass loss and (b) relative error as a function of mesh density. Predictions converged with mesh refinement, with &lt;1% </w:t>
+        <w:t>2</w:t>
       </w:r>
       <w:r>
         <w:rPr>
@@ -6685,7 +6430,7 @@
           <w:sz w:val="20"/>
           <w:szCs w:val="20"/>
         </w:rPr>
-        <w:t>difference</w:t>
+        <w:t xml:space="preserve">. Mesh convergence analysis showing (a) predicted mass loss and (b) relative error as a function of mesh density. Predictions converged with mesh refinement, with &lt;1% </w:t>
       </w:r>
       <w:r>
         <w:rPr>
@@ -6694,7 +6439,7 @@
           <w:sz w:val="20"/>
           <w:szCs w:val="20"/>
         </w:rPr>
-        <w:t xml:space="preserve"> </w:t>
+        <w:t>error</w:t>
       </w:r>
       <w:r>
         <w:rPr>
@@ -6703,7 +6448,7 @@
           <w:sz w:val="20"/>
           <w:szCs w:val="20"/>
         </w:rPr>
-        <w:t>between</w:t>
+        <w:t xml:space="preserve"> </w:t>
       </w:r>
       <w:r>
         <w:rPr>
@@ -6712,7 +6457,7 @@
           <w:sz w:val="20"/>
           <w:szCs w:val="20"/>
         </w:rPr>
-        <w:t xml:space="preserve"> the </w:t>
+        <w:t>for</w:t>
       </w:r>
       <w:r>
         <w:rPr>
@@ -6721,7 +6466,7 @@
           <w:sz w:val="20"/>
           <w:szCs w:val="20"/>
         </w:rPr>
-        <w:t>two</w:t>
+        <w:t xml:space="preserve"> the </w:t>
       </w:r>
       <w:r>
         <w:rPr>
@@ -6730,7 +6475,7 @@
           <w:sz w:val="20"/>
           <w:szCs w:val="20"/>
         </w:rPr>
-        <w:t xml:space="preserve"> </w:t>
+        <w:t>final</w:t>
       </w:r>
       <w:r>
         <w:rPr>
@@ -6739,7 +6484,16 @@
           <w:sz w:val="20"/>
           <w:szCs w:val="20"/>
         </w:rPr>
-        <w:t>finest meshes</w:t>
+        <w:t xml:space="preserve"> </w:t>
+      </w:r>
+      <w:r>
+        <w:rPr>
+          <w:b/>
+          <w:bCs/>
+          <w:sz w:val="20"/>
+          <w:szCs w:val="20"/>
+        </w:rPr>
+        <w:t>mesh</w:t>
       </w:r>
       <w:r>
         <w:rPr>
@@ -6761,13 +6515,10 @@
         <w:t xml:space="preserve">Figure </w:t>
       </w:r>
       <w:r>
-        <w:t xml:space="preserve">S3</w:t>
-      </w:r>
-      <w:r>
-        <w:t xml:space="preserve"> shows the g</w:t>
-      </w:r>
-      <w:r>
-        <w:t>eometries and finite-element domains used in the simulations.</w:t>
+        <w:t>S3</w:t>
+      </w:r>
+      <w:r>
+        <w:t xml:space="preserve"> shows the geometries and finite-element domains used in the simulations.</w:t>
       </w:r>
     </w:p>
     <w:p>
@@ -6845,7 +6596,7 @@
           <w:sz w:val="20"/>
           <w:szCs w:val="20"/>
         </w:rPr>
-        <w:t xml:space="preserve">S</w:t>
+        <w:t>S</w:t>
       </w:r>
       <w:r>
         <w:rPr>
@@ -6882,7 +6633,7 @@
           <w:sz w:val="20"/>
           <w:szCs w:val="20"/>
         </w:rPr>
-        <w:t xml:space="preserve">3</w:t>
+        <w:t>3</w:t>
       </w:r>
       <w:r>
         <w:rPr>
@@ -6927,10 +6678,19 @@
         <w:ind w:firstLine="0"/>
       </w:pPr>
       <w:r>
-        <w:t>Table S4 lists the mesh, numerical integration, software and boundary-c</w:t>
-      </w:r>
-      <w:r>
-        <w:t xml:space="preserve">ondition settings used for the disc calibration, disc validation and stent simulations. The simulations were run in </w:t>
+        <w:t>Table S4 lists the mesh, numerical integration, software</w:t>
+      </w:r>
+      <w:r>
+        <w:t>,</w:t>
+      </w:r>
+      <w:r>
+        <w:t xml:space="preserve"> and boundary-condition settings used for the disc calibration, disc validation</w:t>
+      </w:r>
+      <w:r>
+        <w:t>,</w:t>
+      </w:r>
+      <w:r>
+        <w:t xml:space="preserve"> and stent simulations. The simulations were run in </w:t>
       </w:r>
       <w:proofErr w:type="spellStart"/>
       <w:r>
@@ -6954,10 +6714,7 @@
       </w:r>
       <w:proofErr w:type="gramEnd"/>
       <w:r>
-        <w:t xml:space="preserve"> method [7]. Geometr</w:t>
-      </w:r>
-      <w:r>
-        <w:t xml:space="preserve">y processing and post-processing used scikit-image [8], </w:t>
+        <w:t xml:space="preserve"> method [7]. Geometry processing and post-processing used scikit-image [8], </w:t>
       </w:r>
       <w:proofErr w:type="spellStart"/>
       <w:r>
@@ -6973,7 +6730,13 @@
       </w:r>
       <w:proofErr w:type="spellEnd"/>
       <w:r>
-        <w:t xml:space="preserve"> [10], SciPy [11], Matplotlib [12] and </w:t>
+        <w:t xml:space="preserve"> [10], SciPy [11], Matplotlib [12]</w:t>
+      </w:r>
+      <w:r>
+        <w:t>,</w:t>
+      </w:r>
+      <w:r>
+        <w:t xml:space="preserve"> and </w:t>
       </w:r>
       <w:proofErr w:type="spellStart"/>
       <w:r>
@@ -8329,37 +8092,17 @@
                 <w:szCs w:val="20"/>
                 <w:lang w:eastAsia="en-US"/>
               </w:rPr>
-              <w:t>19</w:t>
-            </w:r>
-            <w:r>
-              <w:rPr>
-                <w:rFonts w:cs="Times New Roman"/>
-                <w:color w:val="000000"/>
-                <w:sz w:val="20"/>
-                <w:szCs w:val="20"/>
-                <w:lang w:eastAsia="en-US"/>
-              </w:rPr>
-              <w:t>.</w:t>
-            </w:r>
-            <w:r>
-              <w:rPr>
-                <w:rFonts w:cs="Times New Roman"/>
-                <w:color w:val="000000"/>
-                <w:sz w:val="20"/>
-                <w:szCs w:val="20"/>
-                <w:lang w:eastAsia="en-US"/>
-              </w:rPr>
-              <w:t>46</w:t>
-            </w:r>
-            <w:r>
-              <w:rPr>
-                <w:rFonts w:cs="Times New Roman"/>
-                <w:color w:val="000000"/>
-                <w:sz w:val="20"/>
-                <w:szCs w:val="20"/>
-                <w:lang w:eastAsia="en-US"/>
-              </w:rPr>
-              <w:t xml:space="preserve"> mm²</w:t>
+              <w:t xml:space="preserve">19.46 </w:t>
+            </w:r>
+            <w:r>
+              <w:rPr>
+                <w:rFonts w:cs="Times New Roman"/>
+                <w:color w:val="000000"/>
+                <w:sz w:val="20"/>
+                <w:szCs w:val="20"/>
+                <w:lang w:eastAsia="en-US"/>
+              </w:rPr>
+              <w:t>mm²</w:t>
             </w:r>
           </w:p>
         </w:tc>
@@ -8671,37 +8414,17 @@
                 <w:szCs w:val="20"/>
                 <w:lang w:eastAsia="en-US"/>
               </w:rPr>
-              <w:t>53</w:t>
-            </w:r>
-            <w:r>
-              <w:rPr>
-                <w:rFonts w:cs="Times New Roman"/>
-                <w:color w:val="000000"/>
-                <w:sz w:val="20"/>
-                <w:szCs w:val="20"/>
-                <w:lang w:eastAsia="en-US"/>
-              </w:rPr>
-              <w:t>.</w:t>
-            </w:r>
-            <w:r>
-              <w:rPr>
-                <w:rFonts w:cs="Times New Roman"/>
-                <w:color w:val="000000"/>
-                <w:sz w:val="20"/>
-                <w:szCs w:val="20"/>
-                <w:lang w:eastAsia="en-US"/>
-              </w:rPr>
-              <w:t>9</w:t>
-            </w:r>
-            <w:r>
-              <w:rPr>
-                <w:rFonts w:cs="Times New Roman"/>
-                <w:color w:val="000000"/>
-                <w:sz w:val="20"/>
-                <w:szCs w:val="20"/>
-                <w:lang w:eastAsia="en-US"/>
-              </w:rPr>
-              <w:t xml:space="preserve"> mm⁻¹</w:t>
+              <w:t xml:space="preserve">53.9 </w:t>
+            </w:r>
+            <w:r>
+              <w:rPr>
+                <w:rFonts w:cs="Times New Roman"/>
+                <w:color w:val="000000"/>
+                <w:sz w:val="20"/>
+                <w:szCs w:val="20"/>
+                <w:lang w:eastAsia="en-US"/>
+              </w:rPr>
+              <w:t>mm⁻¹</w:t>
             </w:r>
           </w:p>
         </w:tc>
@@ -9154,7 +8877,27 @@
                 <w:szCs w:val="20"/>
                 <w:lang w:eastAsia="en-US"/>
               </w:rPr>
-              <w:t>0.04 mm</w:t>
+              <w:t>0.0</w:t>
+            </w:r>
+            <w:r>
+              <w:rPr>
+                <w:rFonts w:cs="Times New Roman"/>
+                <w:color w:val="000000"/>
+                <w:sz w:val="20"/>
+                <w:szCs w:val="20"/>
+                <w:lang w:eastAsia="en-US"/>
+              </w:rPr>
+              <w:t>05</w:t>
+            </w:r>
+            <w:r>
+              <w:rPr>
+                <w:rFonts w:cs="Times New Roman"/>
+                <w:color w:val="000000"/>
+                <w:sz w:val="20"/>
+                <w:szCs w:val="20"/>
+                <w:lang w:eastAsia="en-US"/>
+              </w:rPr>
+              <w:t xml:space="preserve"> mm</w:t>
             </w:r>
           </w:p>
         </w:tc>
@@ -12464,25 +12207,173 @@
               <w:ind w:firstLine="0"/>
               <w:jc w:val="center"/>
               <w:rPr>
-                <w:rFonts w:cs="Times New Roman"/>
-                <w:color w:val="000000"/>
-                <w:sz w:val="20"/>
-                <w:szCs w:val="20"/>
-                <w:lang w:eastAsia="en-US"/>
-              </w:rPr>
-            </w:pPr>
-            <w:r>
-              <w:rPr>
-                <w:rFonts w:cs="Times New Roman"/>
-                <w:b/>
-                <w:bCs/>
-                <w:color w:val="000000"/>
-                <w:sz w:val="20"/>
-                <w:szCs w:val="20"/>
-                <w:lang w:eastAsia="en-US"/>
-              </w:rPr>
-              <w:t>L² mol⁻² h⁻¹</w:t>
-            </w:r>
+                <w:rFonts w:ascii="Cambria Math" w:hAnsi="Cambria Math" w:cs="Times New Roman"/>
+                <w:color w:val="000000"/>
+                <w:sz w:val="20"/>
+                <w:szCs w:val="20"/>
+                <w:lang w:eastAsia="en-US"/>
+              </w:rPr>
+            </w:pPr>
+            <m:oMathPara>
+              <m:oMath>
+                <m:r>
+                  <w:rPr>
+                    <w:rFonts w:ascii="Cambria Math" w:hAnsi="Cambria Math" w:cs="Times New Roman"/>
+                    <w:color w:val="000000"/>
+                    <w:sz w:val="20"/>
+                    <w:szCs w:val="20"/>
+                    <w:lang w:eastAsia="en-US"/>
+                  </w:rPr>
+                  <m:t>m</m:t>
+                </m:r>
+                <m:sSup>
+                  <m:sSupPr>
+                    <m:ctrlPr>
+                      <w:rPr>
+                        <w:rFonts w:ascii="Cambria Math" w:hAnsi="Cambria Math" w:cs="Times New Roman"/>
+                        <w:color w:val="000000"/>
+                        <w:sz w:val="20"/>
+                        <w:szCs w:val="20"/>
+                        <w:lang w:eastAsia="en-US"/>
+                      </w:rPr>
+                    </m:ctrlPr>
+                  </m:sSupPr>
+                  <m:e>
+                    <m:r>
+                      <w:rPr>
+                        <w:rFonts w:ascii="Cambria Math" w:hAnsi="Cambria Math" w:cs="Times New Roman"/>
+                        <w:color w:val="000000"/>
+                        <w:sz w:val="20"/>
+                        <w:szCs w:val="20"/>
+                        <w:lang w:eastAsia="en-US"/>
+                      </w:rPr>
+                      <m:t>m</m:t>
+                    </m:r>
+                  </m:e>
+                  <m:sup>
+                    <m:r>
+                      <m:rPr>
+                        <m:sty m:val="p"/>
+                      </m:rPr>
+                      <w:rPr>
+                        <w:rFonts w:ascii="Cambria Math" w:hAnsi="Cambria Math" w:cs="Times New Roman"/>
+                        <w:color w:val="000000"/>
+                        <w:sz w:val="20"/>
+                        <w:szCs w:val="20"/>
+                        <w:lang w:eastAsia="en-US"/>
+                      </w:rPr>
+                      <m:t>6</m:t>
+                    </m:r>
+                  </m:sup>
+                </m:sSup>
+                <m:r>
+                  <m:rPr>
+                    <m:sty m:val="p"/>
+                  </m:rPr>
+                  <w:rPr>
+                    <w:rFonts w:ascii="Cambria Math" w:hAnsi="Cambria Math" w:cs="Times New Roman"/>
+                    <w:color w:val="000000"/>
+                    <w:sz w:val="20"/>
+                    <w:szCs w:val="20"/>
+                    <w:lang w:eastAsia="en-US"/>
+                  </w:rPr>
+                  <m:t> </m:t>
+                </m:r>
+                <m:sSup>
+                  <m:sSupPr>
+                    <m:ctrlPr>
+                      <w:rPr>
+                        <w:rFonts w:ascii="Cambria Math" w:hAnsi="Cambria Math" w:cs="Times New Roman"/>
+                        <w:color w:val="000000"/>
+                        <w:sz w:val="20"/>
+                        <w:szCs w:val="20"/>
+                        <w:lang w:eastAsia="en-US"/>
+                      </w:rPr>
+                    </m:ctrlPr>
+                  </m:sSupPr>
+                  <m:e>
+                    <m:r>
+                      <w:rPr>
+                        <w:rFonts w:ascii="Cambria Math" w:hAnsi="Cambria Math" w:cs="Times New Roman"/>
+                        <w:color w:val="000000"/>
+                        <w:sz w:val="20"/>
+                        <w:szCs w:val="20"/>
+                        <w:lang w:eastAsia="en-US"/>
+                      </w:rPr>
+                      <m:t>g</m:t>
+                    </m:r>
+                  </m:e>
+                  <m:sup>
+                    <m:r>
+                      <m:rPr>
+                        <m:sty m:val="p"/>
+                      </m:rPr>
+                      <w:rPr>
+                        <w:rFonts w:ascii="Cambria Math" w:hAnsi="Cambria Math" w:cs="Times New Roman"/>
+                        <w:color w:val="000000"/>
+                        <w:sz w:val="20"/>
+                        <w:szCs w:val="20"/>
+                        <w:lang w:eastAsia="en-US"/>
+                      </w:rPr>
+                      <m:t>-2</m:t>
+                    </m:r>
+                  </m:sup>
+                </m:sSup>
+                <m:r>
+                  <m:rPr>
+                    <m:sty m:val="p"/>
+                  </m:rPr>
+                  <w:rPr>
+                    <w:rFonts w:ascii="Cambria Math" w:hAnsi="Cambria Math" w:cs="Times New Roman"/>
+                    <w:color w:val="000000"/>
+                    <w:sz w:val="20"/>
+                    <w:szCs w:val="20"/>
+                    <w:lang w:eastAsia="en-US"/>
+                  </w:rPr>
+                  <m:t> </m:t>
+                </m:r>
+                <m:sSup>
+                  <m:sSupPr>
+                    <m:ctrlPr>
+                      <w:rPr>
+                        <w:rFonts w:ascii="Cambria Math" w:hAnsi="Cambria Math" w:cs="Times New Roman"/>
+                        <w:color w:val="000000"/>
+                        <w:sz w:val="20"/>
+                        <w:szCs w:val="20"/>
+                        <w:lang w:eastAsia="en-US"/>
+                      </w:rPr>
+                    </m:ctrlPr>
+                  </m:sSupPr>
+                  <m:e>
+                    <m:r>
+                      <w:rPr>
+                        <w:rFonts w:ascii="Cambria Math" w:hAnsi="Cambria Math" w:cs="Times New Roman"/>
+                        <w:color w:val="000000"/>
+                        <w:sz w:val="20"/>
+                        <w:szCs w:val="20"/>
+                        <w:lang w:eastAsia="en-US"/>
+                      </w:rPr>
+                      <m:t>h</m:t>
+                    </m:r>
+                  </m:e>
+                  <m:sup>
+                    <m:r>
+                      <m:rPr>
+                        <m:sty m:val="p"/>
+                      </m:rPr>
+                      <w:rPr>
+                        <w:rFonts w:ascii="Cambria Math" w:hAnsi="Cambria Math" w:cs="Times New Roman"/>
+                        <w:color w:val="000000"/>
+                        <w:sz w:val="20"/>
+                        <w:szCs w:val="20"/>
+                        <w:lang w:eastAsia="en-US"/>
+                      </w:rPr>
+                      <m:t>-1</m:t>
+                    </m:r>
+                  </m:sup>
+                </m:sSup>
+              </m:oMath>
+            </m:oMathPara>
           </w:p>
         </w:tc>
       </w:tr>
@@ -14768,7 +14659,7 @@
         <w:t xml:space="preserve">Figure </w:t>
       </w:r>
       <w:r>
-        <w:t xml:space="preserve">S4</w:t>
+        <w:t>S4</w:t>
       </w:r>
       <w:r>
         <w:t xml:space="preserve"> shows how the sensitivity indices evolve during the simulated degradation.</w:t>
@@ -14857,7 +14748,7 @@
           <w:sz w:val="20"/>
           <w:szCs w:val="20"/>
         </w:rPr>
-        <w:t xml:space="preserve">S</w:t>
+        <w:t>S</w:t>
       </w:r>
       <w:r>
         <w:rPr>
@@ -14894,7 +14785,7 @@
           <w:sz w:val="20"/>
           <w:szCs w:val="20"/>
         </w:rPr>
-        <w:t xml:space="preserve">4</w:t>
+        <w:t>4</w:t>
       </w:r>
       <w:r>
         <w:rPr>
@@ -15000,10 +14891,10 @@
         <w:t xml:space="preserve">Optimal parameters were identified by minimizing the RMSE between predicted and literature-reported 14-day mass-loss measurements. </w:t>
       </w:r>
       <w:r>
-        <w:t>A</w:t>
-      </w:r>
-      <w:r>
-        <w:t xml:space="preserve"> Gaussian process </w:t>
+        <w:t xml:space="preserve">A </w:t>
+      </w:r>
+      <w:r>
+        <w:t xml:space="preserve">Gaussian process </w:t>
       </w:r>
       <w:r>
         <w:t xml:space="preserve">(GP) </w:t>
@@ -15018,19 +14909,16 @@
         <w:t xml:space="preserve"> [16] </w:t>
       </w:r>
       <w:r>
-        <w:t>was initialized using a 12-point Latin hypercube sampling (LHS) design [18] spanning the admissible parameter space and iteratively refined using</w:t>
-      </w:r>
-      <w:r>
-        <w:t xml:space="preserve"> the expected improvement </w:t>
+        <w:t xml:space="preserve">was initialized using a 12-point Latin hypercube sampling (LHS) design [18] spanning the admissible parameter space and iteratively refined using </w:t>
+      </w:r>
+      <w:r>
+        <w:t xml:space="preserve">the expected improvement </w:t>
       </w:r>
       <w:r>
         <w:t xml:space="preserve">(EI) </w:t>
       </w:r>
       <w:r>
-        <w:t>acquisition function [17</w:t>
-      </w:r>
-      <w:r>
-        <w:t>]. The literature data are from Liu et al. [19].</w:t>
+        <w:t>acquisition function [17]. The literature data are from Liu et al. [19].</w:t>
       </w:r>
     </w:p>
     <w:p>
@@ -15041,10 +14929,7 @@
         <w:ind w:firstLine="0"/>
       </w:pPr>
       <w:r>
-        <w:t>The</w:t>
-      </w:r>
-      <w:r>
-        <w:t xml:space="preserve"> RMSE was calculated as:</w:t>
+        <w:t>The RMSE was calculated as:</w:t>
       </w:r>
     </w:p>
     <w:p>
@@ -15386,18 +15271,11 @@
       </w:r>
       <w:proofErr w:type="spellEnd"/>
       <w:r>
-        <w:t>, respe</w:t>
-      </w:r>
-      <w:r>
-        <w:t>ctively.</w:t>
-      </w:r>
-    </w:p>
-    <w:p>
-      <w:pPr>
-        <w:pStyle w:val="BodyText"/>
-        <w:spacing w:after="120"/>
-        <w:ind w:firstLine="0"/>
-      </w:pPr>
+        <w:t>, respectively.</w:t>
+      </w:r>
+      <w:r>
+        <w:t xml:space="preserve"> </w:t>
+      </w:r>
       <w:r>
         <w:t>Table S7 lists the literature mass-loss data used for calibration.</w:t>
       </w:r>
@@ -16213,7 +16091,7 @@
         <w:t xml:space="preserve">Tables S8 and S9 and Figure </w:t>
       </w:r>
       <w:r>
-        <w:t xml:space="preserve">S5</w:t>
+        <w:t>S5</w:t>
       </w:r>
       <w:r>
         <w:t xml:space="preserve"> compare the calibrated model with the literature data.</w:t>
@@ -18700,7 +18578,7 @@
           <w:sz w:val="20"/>
           <w:szCs w:val="20"/>
         </w:rPr>
-        <w:t xml:space="preserve">S</w:t>
+        <w:t>S</w:t>
       </w:r>
       <w:r>
         <w:rPr>
@@ -18737,7 +18615,7 @@
           <w:sz w:val="20"/>
           <w:szCs w:val="20"/>
         </w:rPr>
-        <w:t xml:space="preserve">5</w:t>
+        <w:t>5</w:t>
       </w:r>
       <w:r>
         <w:rPr>
@@ -20131,15 +20009,7 @@
         </m:sSub>
       </m:oMath>
       <w:r>
-        <w:t xml:space="preserve"> was evaluated using 50 parameter sets sampled from a 2000-draw GP-bootstrap calibration ensemble. At 672 h, the ensemble median mass loss was 0.333%, wi</w:t>
-      </w:r>
-      <w:proofErr w:type="spellStart"/>
-      <w:r>
-        <w:t>th</w:t>
-      </w:r>
-      <w:proofErr w:type="spellEnd"/>
-      <w:r>
-        <w:t xml:space="preserve"> 50% and </w:t>
+        <w:t xml:space="preserve"> was evaluated using 50 parameter sets sampled from a 2000-draw GP-bootstrap calibration ensemble. At 672 h, the ensemble median mass loss was 0.333%, with 50% and </w:t>
       </w:r>
       <w:r>
         <w:lastRenderedPageBreak/>
@@ -20168,13 +20038,10 @@
         <w:t xml:space="preserve">Figure </w:t>
       </w:r>
       <w:r>
-        <w:t xml:space="preserve">S6</w:t>
-      </w:r>
-      <w:r>
-        <w:t xml:space="preserve"> shows the ensemble prediction and the distribution of mass </w:t>
-      </w:r>
-      <w:r>
-        <w:t>loss at 672 h.</w:t>
+        <w:t>S6</w:t>
+      </w:r>
+      <w:r>
+        <w:t xml:space="preserve"> shows the ensemble prediction and the distribution of mass loss at 672 h.</w:t>
       </w:r>
     </w:p>
     <w:p>
@@ -20260,7 +20127,7 @@
           <w:sz w:val="20"/>
           <w:szCs w:val="20"/>
         </w:rPr>
-        <w:t xml:space="preserve">S</w:t>
+        <w:t>S</w:t>
       </w:r>
       <w:r>
         <w:rPr>
@@ -20297,7 +20164,7 @@
           <w:sz w:val="20"/>
           <w:szCs w:val="20"/>
         </w:rPr>
-        <w:t xml:space="preserve">6</w:t>
+        <w:t>6</w:t>
       </w:r>
       <w:r>
         <w:rPr>
@@ -20330,17 +20197,6 @@
           <w:szCs w:val="20"/>
         </w:rPr>
         <w:t>Parameter-propagated uncertainty in predicted Zn mass loss. (a) Ensemble median and 50% and 95% parameter-propagated intervals obtained from 50 kinetic-parameter sets, compared with the BO-optimum prediction and literature measurements. (b) Distribution of predicted mass loss at 672 h. The ensemble median was 0.333%, with 50% and 95% intervals of 0.330–0.338% and 0.315–0.375%, respectively. The intervals represent kinetic-parameter uncertainty only and are not Bayesian credible or predictive intervals.</w:t>
-      </w:r>
-    </w:p>
-    <w:p>
-      <w:pPr>
-        <w:pStyle w:val="BodyText"/>
-        <w:spacing w:after="120"/>
-        <w:ind w:firstLine="0"/>
-        <w:rPr/>
-      </w:pPr>
-      <w:r>
-        <w:t>Table S11 compares the simulated mass loss with the HBSS validation measurements and their experimental scatter.</w:t>
       </w:r>
     </w:p>
     <w:p>
@@ -20348,7 +20204,6 @@
         <w:pStyle w:val="Captions"/>
         <w:keepNext/>
         <w:spacing w:before="360" w:after="80"/>
-        <w:rPr/>
       </w:pPr>
       <w:r>
         <w:rPr>
@@ -20436,15 +20291,7 @@
           <w:sz w:val="20"/>
           <w:szCs w:val="20"/>
         </w:rPr>
-        <w:t xml:space="preserve">Comparison of simulated and measured mass loss in HBSS (validation) with the experimental scatter. Experimental values are mean ± SD (n = 3); |Error|/SD is the absolute error divided by the SD at the same </w:t>
-      </w:r>
-      <w:r>
-        <w:rPr>
-          <w:sz w:val="20"/>
-          <w:szCs w:val="20"/>
-        </w:rPr>
-        <w:lastRenderedPageBreak/>
-        <w:t>immersion time. The validation RMSE of 0.0159% (R² = 0.9734) corresponds to 8.6% of the mean measured mass loss (0.185%) and 5.1% of the 28-day value.</w:t>
+        <w:t>Comparison of simulated and measured mass loss in HBSS (validation) with the experimental scatter. Experimental values are mean ± SD (n = 3); |Error|/SD is the absolute error divided by the SD at the same immersion time. The validation RMSE of 0.0159% (R² = 0.9734) corresponds to 8.6% of the mean measured mass loss (0.185%) and 5.1% of the 28-day value.</w:t>
       </w:r>
     </w:p>
     <w:tbl>
@@ -21492,25 +21339,25 @@
         <w:t xml:space="preserve">Figure </w:t>
       </w:r>
       <w:r>
-        <w:t xml:space="preserve">S7</w:t>
+        <w:t>S7</w:t>
       </w:r>
       <w:r>
         <w:t xml:space="preserve"> shows the spatial evolution of oxygen and film saturation in the stent. Table </w:t>
       </w:r>
       <w:r>
-        <w:t>S12</w:t>
-      </w:r>
-      <w:r>
-        <w:t xml:space="preserve"> and Figures </w:t>
-      </w:r>
-      <w:r>
-        <w:t xml:space="preserve">S8</w:t>
+        <w:t xml:space="preserve">S12 </w:t>
+      </w:r>
+      <w:r>
+        <w:t xml:space="preserve">and Figures </w:t>
+      </w:r>
+      <w:r>
+        <w:t>S8</w:t>
       </w:r>
       <w:r>
         <w:t xml:space="preserve"> and </w:t>
       </w:r>
       <w:r>
-        <w:t xml:space="preserve">S9</w:t>
+        <w:t>S9</w:t>
       </w:r>
       <w:r>
         <w:t xml:space="preserve"> describe the controlled test structures and their results.</w:t>
@@ -21528,6 +21375,7 @@
         <w:rPr>
           <w:noProof/>
         </w:rPr>
+        <w:lastRenderedPageBreak/>
         <w:drawing>
           <wp:inline distT="0" distB="0" distL="0" distR="0" wp14:anchorId="26A29224" wp14:editId="45CD2E2B">
             <wp:extent cx="5731510" cy="2676615"/>
@@ -21599,7 +21447,7 @@
           <w:sz w:val="20"/>
           <w:szCs w:val="20"/>
         </w:rPr>
-        <w:t xml:space="preserve">S</w:t>
+        <w:t>S</w:t>
       </w:r>
       <w:r>
         <w:rPr>
@@ -21636,7 +21484,7 @@
           <w:sz w:val="20"/>
           <w:szCs w:val="20"/>
         </w:rPr>
-        <w:t xml:space="preserve">7</w:t>
+        <w:t>7</w:t>
       </w:r>
       <w:r>
         <w:rPr>
@@ -21728,7 +21576,6 @@
           <w:sz w:val="20"/>
           <w:szCs w:val="20"/>
         </w:rPr>
-        <w:lastRenderedPageBreak/>
         <w:t xml:space="preserve">Table </w:t>
       </w:r>
       <w:r>
@@ -23968,7 +23815,7 @@
           <w:sz w:val="20"/>
           <w:szCs w:val="20"/>
         </w:rPr>
-        <w:t xml:space="preserve">S</w:t>
+        <w:t>S</w:t>
       </w:r>
       <w:r>
         <w:rPr>
@@ -24005,7 +23852,7 @@
           <w:sz w:val="20"/>
           <w:szCs w:val="20"/>
         </w:rPr>
-        <w:t xml:space="preserve">8</w:t>
+        <w:t>8</w:t>
       </w:r>
       <w:r>
         <w:rPr>
@@ -24053,7 +23900,7 @@
         </w:rPr>
         <w:t xml:space="preserve">). (d) Final mass loss as a function of center-to-center inter-wire spacing. Dashed lines indicate linear fits. Higher SA/V, curvature, and spacing increased degradation, with </w:t>
       </w:r>
-      <w:bookmarkStart w:id="140" w:name="_Hlk241828842"/>
+      <w:bookmarkStart w:id="52" w:name="_Hlk241828842"/>
       <w:r>
         <w:rPr>
           <w:sz w:val="20"/>
@@ -24061,7 +23908,7 @@
         </w:rPr>
         <w:t>SA/V exhibiting the strongest correlation with cumulative mass loss.</w:t>
       </w:r>
-      <w:bookmarkEnd w:id="140"/>
+      <w:bookmarkEnd w:id="52"/>
       <w:r>
         <w:rPr>
           <w:iCs w:val="0"/>
@@ -24159,7 +24006,7 @@
           <w:sz w:val="20"/>
           <w:szCs w:val="20"/>
         </w:rPr>
-        <w:t xml:space="preserve">S</w:t>
+        <w:t>S</w:t>
       </w:r>
       <w:r>
         <w:rPr>
@@ -24196,7 +24043,7 @@
           <w:sz w:val="20"/>
           <w:szCs w:val="20"/>
         </w:rPr>
-        <w:t xml:space="preserve">9</w:t>
+        <w:t>9</w:t>
       </w:r>
       <w:r>
         <w:rPr>
@@ -24284,10 +24131,7 @@
       </w:r>
       <w:proofErr w:type="spellEnd"/>
       <w:r>
-        <w:t>. 1–2) for the Zn lost from the disc with the oxygen r</w:t>
-      </w:r>
-      <w:r>
-        <w:t xml:space="preserve">emoved from the electrolyte domain by the interfacial sink. The solver stores C_O₂ as a mass concentration (g mm⁻³) and evaluates the ORR recession velocity without a molar-mass conversion, which </w:t>
+        <w:t xml:space="preserve">. 1–2) for the Zn lost from the disc with the oxygen removed from the electrolyte domain by the interfacial sink. The solver stores C_O₂ as a mass concentration (g mm⁻³) and evaluates the ORR recession velocity without a molar-mass conversion, which </w:t>
       </w:r>
       <w:proofErr w:type="spellStart"/>
       <w:r>
@@ -24295,10 +24139,7 @@
       </w:r>
       <w:proofErr w:type="spellEnd"/>
       <w:r>
-        <w:t xml:space="preserve">. 15–16 represent by the factor M_O₂ = 32 (the numerical </w:t>
-      </w:r>
-      <w:r>
-        <w:t xml:space="preserve">value of the molar mass of oxygen in g mol⁻¹) applied to a molar C_O₂. The recession velocity is therefore 32 times the stoichiometrically consistent value for the same </w:t>
+        <w:t xml:space="preserve">. 15–16 represent by the factor M_O₂ = 32 (the numerical value of the molar mass of oxygen in g mol⁻¹) applied to a molar C_O₂. The recession velocity is therefore 32 times the stoichiometrically consistent value for the same </w:t>
       </w:r>
       <w:proofErr w:type="spellStart"/>
       <w:r>
@@ -24314,10 +24155,7 @@
       </w:r>
       <w:proofErr w:type="spellEnd"/>
       <w:r>
-        <w:t xml:space="preserve"> = 0.51 mm h⁻¹ is 0.29 mm</w:t>
-      </w:r>
-      <w:r>
-        <w:t xml:space="preserve"> yr⁻¹ (about 22 µm in 28 days, roughly 3% mass loss), which is above the simulated rates. The reported results are therefore consistent with the equations as written, and Zn recession is not stoichiometrically coupled to O₂ consumption.</w:t>
+        <w:t xml:space="preserve"> = 0.51 mm h⁻¹ is 0.29 mm yr⁻¹ (about 22 µm in 28 days, roughly 3% mass loss), which is above the simulated rates. The reported results are therefore consistent with the equations as written, and Zn recession is not stoichiometrically coupled to O₂ consumption.</w:t>
       </w:r>
     </w:p>
     <w:p>
@@ -25848,13 +25686,7 @@
         <w:rPr>
           <w:sz w:val="20"/>
         </w:rPr>
-        <w:t xml:space="preserve">. Phys. 2014, 262, 358. </w:t>
-      </w:r>
-      <w:r>
-        <w:rPr>
-          <w:sz w:val="20"/>
-        </w:rPr>
-        <w:t>https://doi.org/10.1016/j.jcp.2014.01.005.</w:t>
+        <w:t>. Phys. 2014, 262, 358. https://doi.org/10.1016/j.jcp.2014.01.005.</w:t>
       </w:r>
     </w:p>
     <w:p>
@@ -25956,13 +25788,7 @@
         <w:rPr>
           <w:sz w:val="20"/>
         </w:rPr>
-        <w:t>, Argonne National Laboratory, Lemont, IL, USA 2024, ANL-</w:t>
-      </w:r>
-      <w:r>
-        <w:rPr>
-          <w:sz w:val="20"/>
-        </w:rPr>
-        <w:t>21/39 (Rev. 3.22). https://petsc.org.</w:t>
+        <w:t>, Argonne National Laboratory, Lemont, IL, USA 2024, ANL-21/39 (Rev. 3.22). https://petsc.org.</w:t>
       </w:r>
     </w:p>
     <w:p>
@@ -26055,13 +25881,7 @@
         <w:rPr>
           <w:sz w:val="20"/>
         </w:rPr>
-        <w:t>), Springer, Berlin, Heidelberg, Germany 2004, p</w:t>
-      </w:r>
-      <w:r>
-        <w:rPr>
-          <w:sz w:val="20"/>
-        </w:rPr>
-        <w:t>p. 97–104. https://doi.org/10.1007/978-3-540-30218-6_19.</w:t>
+        <w:t>), Springer, Berlin, Heidelberg, Germany 2004, pp. 97–104. https://doi.org/10.1007/978-3-540-30218-6_19.</w:t>
       </w:r>
     </w:p>
     <w:p>
@@ -26135,13 +25955,7 @@
         <w:rPr>
           <w:sz w:val="20"/>
         </w:rPr>
-        <w:t xml:space="preserve"> 2014, 2, e453. https://d</w:t>
-      </w:r>
-      <w:r>
-        <w:rPr>
-          <w:sz w:val="20"/>
-        </w:rPr>
-        <w:t>oi.org/10.7717/peerj.453.</w:t>
+        <w:t xml:space="preserve"> 2014, 2, e453. https://doi.org/10.7717/peerj.453.</w:t>
       </w:r>
     </w:p>
     <w:p>
@@ -26266,13 +26080,7 @@
         <w:rPr>
           <w:sz w:val="20"/>
         </w:rPr>
-        <w:t>, T. E. Oliphant, e</w:t>
-      </w:r>
-      <w:r>
-        <w:rPr>
-          <w:sz w:val="20"/>
-        </w:rPr>
-        <w:t>t al., Nat. Methods 2020, 17, 261. https://doi.org/10.1038/s41592-019-0686-2.</w:t>
+        <w:t>, T. E. Oliphant, et al., Nat. Methods 2020, 17, 261. https://doi.org/10.1038/s41592-019-0686-2.</w:t>
       </w:r>
     </w:p>
     <w:p>
@@ -26346,13 +26154,7 @@
         <w:rPr>
           <w:sz w:val="20"/>
         </w:rPr>
-        <w:t>, C. Law, in The Visualization Handbook (Eds: C. D. Hansen, C. R.</w:t>
-      </w:r>
-      <w:r>
-        <w:rPr>
-          <w:sz w:val="20"/>
-        </w:rPr>
-        <w:t xml:space="preserve"> Johnson), Elsevier, Amsterdam, The Netherlands 2005, pp. 717–731.</w:t>
+        <w:t>, C. Law, in The Visualization Handbook (Eds: C. D. Hansen, C. R. Johnson), Elsevier, Amsterdam, The Netherlands 2005, pp. 717–731.</w:t>
       </w:r>
     </w:p>
     <w:p>
@@ -26426,13 +26228,7 @@
         <w:rPr>
           <w:sz w:val="20"/>
         </w:rPr>
-        <w:t>. 2017, 2, 97. https://doi.org/10.21105/joss.00</w:t>
-      </w:r>
-      <w:r>
-        <w:rPr>
-          <w:sz w:val="20"/>
-        </w:rPr>
-        <w:t>097.</w:t>
+        <w:t>. 2017, 2, 97. https://doi.org/10.21105/joss.00097.</w:t>
       </w:r>
     </w:p>
     <w:p>
@@ -26529,13 +26325,7 @@
           <w:sz w:val="20"/>
         </w:rPr>
         <w:tab/>
-        <w:t>M. D. McKay,</w:t>
-      </w:r>
-      <w:r>
-        <w:rPr>
-          <w:sz w:val="20"/>
-        </w:rPr>
-        <w:t xml:space="preserve"> R. J. Beckman, W. J. Conover, </w:t>
+        <w:t xml:space="preserve">M. D. McKay, R. J. Beckman, W. J. Conover, </w:t>
       </w:r>
       <w:proofErr w:type="spellStart"/>
       <w:r>
@@ -26586,13 +26376,7 @@
         <w:rPr>
           <w:sz w:val="20"/>
         </w:rPr>
-        <w:t>, L.-N. Wang, J. Mater. Sci. Technol. 2018, 34, 2271. https://doi.org/10.1016/j.jmst.2018.05.00</w:t>
-      </w:r>
-      <w:r>
-        <w:rPr>
-          <w:sz w:val="20"/>
-        </w:rPr>
-        <w:t>5.</w:t>
+        <w:t>, L.-N. Wang, J. Mater. Sci. Technol. 2018, 34, 2271. https://doi.org/10.1016/j.jmst.2018.05.005.</w:t>
       </w:r>
     </w:p>
     <w:sectPr>

</xml_diff>

<commit_message>
SI Section S1: concise Rule A selection rationale
</commit_message>
<xml_diff>
--- a/Supplementary_original_order.docx
+++ b/Supplementary_original_order.docx
@@ -3173,7 +3173,88 @@
         </w:rPr>
       </w:pPr>
       <w:r>
-        <w:t>Rule A (hard minimum) was adopted on physical and numerical grounds. Agreement with the literature data served as a consistency check rather than as the selection criterion, because RMSE depends on the calibration and could be reduced for any rule by recalibrating it.</w:t>
+        <w:t xml:space="preserve">Rule A (hard minimum) was </w:t>
+      </w:r>
+      <w:r>
+        <w:t xml:space="preserve">selected</w:t>
+      </w:r>
+      <w:r>
+        <w:t xml:space="preserve"> on physical and numerical grounds</w:t>
+      </w:r>
+      <w:r>
+        <w:t xml:space="preserve">,</w:t>
+      </w:r>
+      <w:r>
+        <w:t xml:space="preserve"> with</w:t>
+      </w:r>
+      <w:r>
+        <w:t xml:space="preserve"> agreement to</w:t>
+      </w:r>
+      <w:r>
+        <w:t xml:space="preserve"> the literature data </w:t>
+      </w:r>
+      <w:r>
+        <w:t xml:space="preserve">used only</w:t>
+      </w:r>
+      <w:r>
+        <w:t xml:space="preserve"> as a consistency check</w:t>
+      </w:r>
+      <w:r>
+        <w:t xml:space="preserve">.</w:t>
+      </w:r>
+      <w:r>
+        <w:t xml:space="preserve"> </w:t>
+      </w:r>
+      <w:r>
+        <w:t xml:space="preserve">RMSE</w:t>
+      </w:r>
+      <w:r>
+        <w:t xml:space="preserve"> </w:t>
+      </w:r>
+      <w:r>
+        <w:t xml:space="preserve">was</w:t>
+      </w:r>
+      <w:r>
+        <w:t xml:space="preserve"> </w:t>
+      </w:r>
+      <w:r>
+        <w:t xml:space="preserve">not</w:t>
+      </w:r>
+      <w:r>
+        <w:t xml:space="preserve"> the selection criterion</w:t>
+      </w:r>
+      <w:r>
+        <w:t xml:space="preserve"> because </w:t>
+      </w:r>
+      <w:r>
+        <w:t xml:space="preserve">it</w:t>
+      </w:r>
+      <w:r>
+        <w:t xml:space="preserve"> depends on</w:t>
+      </w:r>
+      <w:r>
+        <w:t xml:space="preserve"> calibration and could be reduced for any rule </w:t>
+      </w:r>
+      <w:r>
+        <w:t xml:space="preserve">through</w:t>
+      </w:r>
+      <w:r>
+        <w:t xml:space="preserve"> </w:t>
+      </w:r>
+      <w:r>
+        <w:t xml:space="preserve">recalibration.</w:t>
+      </w:r>
+      <w:r>
+        <w:t xml:space="preserve"> </w:t>
+      </w:r>
+      <w:r>
+        <w:t xml:space="preserve">Rule A reflects the physical assumption that the slowest rate-limiting process controls degradation, which is consistent with the simulations showing oxygen-diffusion control over &gt;99% of the interface at 672 h</w:t>
+      </w:r>
+      <w:r>
+        <w:t xml:space="preserve">.</w:t>
+      </w:r>
+      <w:r>
+        <w:t xml:space="preserve"> Rules B and C introduce additional blending terms without improving the governing physics, while Rule D removes the oxygen-diffusion constraint and substantially overpredicts mass loss (0.58% at 168 h against 0.20% in the literature data). Finally, the hard minimum caused no significant numerical issues, with only two regime transitions occurring during the initial transient.</w:t>
       </w:r>
     </w:p>
     <w:p>
@@ -3181,17 +3262,8 @@
         <w:pStyle w:val="BodyText"/>
         <w:spacing w:after="120"/>
         <w:ind w:firstLine="0"/>
+        <w:rPr/>
       </w:pPr>
-      <w:r>
-        <w:t>First, Rule A encodes the physical picture that the slowest of the mutually exclusive rate capacities gates the interface. The simulations support this picture: after the initial reaction-</w:t>
-      </w:r>
-      <w:r>
-        <w:lastRenderedPageBreak/>
-        <w:t>controlled stage</w:t>
-      </w:r>
-      <w:r>
-        <w:t xml:space="preserve"> the interface is oxygen-diffusion-limited, and oxygen diffusion controls more than 99% of the interface area at 672 h. Blended rules (Rules B and C) change the prediction only where two velocities are comparable, which rarely occurs here, and they represent co-controlled mechanisms that the results do not show. Second, Rule D removes the oxygen-diffusion cap, so oxygen reduction proceeds irrespective of the local oxygen supply. This is inconsistent with oxygen-limited degradation and over-predicts the mass loss (0.58% at 168 h against 0.20% in the literature data, and 0.94% against 0.23% for Rule A at 672 h). Third, Rule A adds no parameters or regularization, whereas Rules B and C introduce blending terms. Fourth, the non-differentiability of the hard minimum did not cause switching artifacts: only two controlling-regime transitions occurred (1.2% of the 167 recorded steps), both during the initial transient. The same count was obtained for Rules B–D, so this criterion does not separate the rules but removes the main objection to Rule A.</w:t>
-      </w:r>
     </w:p>
     <w:p>
       <w:pPr>

</xml_diff>

<commit_message>
Remove SI Section S8; add brief O2 mass-balance statement to Section S1; update refs
</commit_message>
<xml_diff>
--- a/Supplementary_original_order.docx
+++ b/Supplementary_original_order.docx
@@ -818,75 +818,6 @@
           </w:p>
         </w:tc>
       </w:tr>
-      <w:tr>
-        <w:trPr>
-          <w:cantSplit/>
-          <w:jc w:val="center"/>
-        </w:trPr>
-        <w:tc>
-          <w:tcPr>
-            <w:tcW w:w="1000" w:type="dxa"/>
-            <w:vAlign w:val="center"/>
-          </w:tcPr>
-          <w:p>
-            <w:pPr>
-              <w:spacing w:before="20" w:after="20" w:line="240" w:lineRule="auto"/>
-              <w:ind w:firstLine="0"/>
-              <w:jc w:val="left"/>
-              <w:rPr/>
-            </w:pPr>
-            <w:r>
-              <w:rPr>
-                <w:sz w:val="20"/>
-                <w:szCs w:val="20"/>
-              </w:rPr>
-              <w:t>S8</w:t>
-            </w:r>
-          </w:p>
-        </w:tc>
-        <w:tc>
-          <w:tcPr>
-            <w:tcW w:w="4200" w:type="dxa"/>
-            <w:vAlign w:val="center"/>
-          </w:tcPr>
-          <w:p>
-            <w:pPr>
-              <w:spacing w:before="20" w:after="20" w:line="240" w:lineRule="auto"/>
-              <w:ind w:firstLine="0"/>
-              <w:jc w:val="left"/>
-              <w:rPr/>
-            </w:pPr>
-            <w:r>
-              <w:rPr>
-                <w:sz w:val="20"/>
-                <w:szCs w:val="20"/>
-              </w:rPr>
-              <w:t>Oxygen mass balance</w:t>
-            </w:r>
-          </w:p>
-        </w:tc>
-        <w:tc>
-          <w:tcPr>
-            <w:tcW w:w="3826" w:type="dxa"/>
-            <w:vAlign w:val="center"/>
-          </w:tcPr>
-          <w:p>
-            <w:pPr>
-              <w:spacing w:before="20" w:after="20" w:line="240" w:lineRule="auto"/>
-              <w:ind w:firstLine="0"/>
-              <w:jc w:val="left"/>
-              <w:rPr/>
-            </w:pPr>
-            <w:r>
-              <w:rPr>
-                <w:sz w:val="20"/>
-                <w:szCs w:val="20"/>
-              </w:rPr>
-              <w:t>Table S13</w:t>
-            </w:r>
-          </w:p>
-        </w:tc>
-      </w:tr>
     </w:tbl>
     <w:p>
       <w:pPr>
@@ -910,9 +841,6 @@
       </w:r>
       <w:r>
         <w:t>Figure S1</w:t>
-      </w:r>
-      <w:r>
-        <w:t xml:space="preserve">; the O₂ mass balance is given in Section S8</w:t>
       </w:r>
       <w:r>
         <w:t xml:space="preserve">).</w:t>
@@ -3262,6 +3190,58 @@
         <w:pStyle w:val="BodyText"/>
         <w:spacing w:after="120"/>
         <w:ind w:firstLine="0"/>
+        <w:rPr>
+          <w:rFonts w:cs="Times New Roman"/>
+        </w:rPr>
+      </w:pPr>
+      <w:r>
+        <w:t xml:space="preserve">A global O₂ mass balance shows that the O₂ consumed at the interface is about 1/32 of the stoichiometric requirement for the Zn lost at 24 h and about 1/24 at 168 h, so Zn recession is not stoichiometrically coupled to O₂ consumption in the present formulation.</w:t>
+      </w:r>
+      <w:r>
+        <w:t xml:space="preserve">selected</w:t>
+      </w:r>
+      <w:r>
+        <w:t xml:space="preserve">,</w:t>
+      </w:r>
+      <w:r>
+        <w:t xml:space="preserve"> agreement to</w:t>
+      </w:r>
+      <w:r>
+        <w:t xml:space="preserve">used only</w:t>
+      </w:r>
+      <w:r>
+        <w:t xml:space="preserve">.</w:t>
+      </w:r>
+      <w:r>
+        <w:t xml:space="preserve">RMSE</w:t>
+      </w:r>
+      <w:r>
+        <w:t xml:space="preserve">was</w:t>
+      </w:r>
+      <w:r>
+        <w:t xml:space="preserve">not</w:t>
+      </w:r>
+      <w:r>
+        <w:t xml:space="preserve">it</w:t>
+      </w:r>
+      <w:r>
+        <w:t xml:space="preserve">through</w:t>
+      </w:r>
+      <w:r>
+        <w:t xml:space="preserve">recalibration.</w:t>
+      </w:r>
+      <w:r>
+        <w:t xml:space="preserve">Rule A reflects the physical assumption that the slowest rate-limiting process controls degradation, which is consistent with the simulations showing oxygen-diffusion control over &gt;99% of the interface at 672 h</w:t>
+      </w:r>
+      <w:r>
+        <w:t xml:space="preserve"> Rules B and C introduce additional blending terms without improving the governing physics, while Rule D removes the oxygen-diffusion constraint and substantially overpredicts mass loss (0.58% at 168 h against 0.20% in the literature data). Finally, the hard minimum caused no significant numerical issues, with only two regime transitions occurring during the initial transient.</w:t>
+      </w:r>
+    </w:p>
+    <w:p>
+      <w:pPr>
+        <w:pStyle w:val="BodyText"/>
+        <w:spacing w:after="120"/>
+        <w:ind w:firstLine="0"/>
         <w:rPr/>
       </w:pPr>
     </w:p>
@@ -24178,1428 +24158,6 @@
         <w:t xml:space="preserve"> surface. CC denotes the center-to-center spacing.</w:t>
       </w:r>
     </w:p>
-    <w:p>
-      <w:pPr>
-        <w:pStyle w:val="Heading1"/>
-        <w:rPr/>
-      </w:pPr>
-      <w:r>
-        <w:t>S8. Oxygen mass balance</w:t>
-      </w:r>
-    </w:p>
-    <w:p>
-      <w:pPr>
-        <w:pStyle w:val="BodyText"/>
-        <w:spacing w:after="120"/>
-        <w:ind w:firstLine="0"/>
-        <w:rPr/>
-      </w:pPr>
-      <w:r>
-        <w:t xml:space="preserve">Table S13 compares the oxygen required by the reaction stoichiometry (1 mol O₂ per 2 mol Zn, </w:t>
-      </w:r>
-      <w:proofErr w:type="spellStart"/>
-      <w:r>
-        <w:t>Eqs</w:t>
-      </w:r>
-      <w:proofErr w:type="spellEnd"/>
-      <w:r>
-        <w:t xml:space="preserve">. 1–2) for the Zn lost from the disc with the oxygen removed from the electrolyte domain by the interfacial sink. The solver stores C_O₂ as a mass concentration (g mm⁻³) and evaluates the ORR recession velocity without a molar-mass conversion, which </w:t>
-      </w:r>
-      <w:proofErr w:type="spellStart"/>
-      <w:r>
-        <w:t>Eqs</w:t>
-      </w:r>
-      <w:proofErr w:type="spellEnd"/>
-      <w:r>
-        <w:t xml:space="preserve">. 15–16 represent by the factor M_O₂ = 32 (the numerical value of the molar mass of oxygen in g mol⁻¹) applied to a molar C_O₂. The recession velocity is therefore 32 times the stoichiometrically consistent value for the same </w:t>
-      </w:r>
-      <w:proofErr w:type="spellStart"/>
-      <w:r>
-        <w:t>k_ORR</w:t>
-      </w:r>
-      <w:proofErr w:type="spellEnd"/>
-      <w:r>
-        <w:t xml:space="preserve">. With this factor, the reaction-limited ceiling at </w:t>
-      </w:r>
-      <w:proofErr w:type="spellStart"/>
-      <w:r>
-        <w:t>k_ORR</w:t>
-      </w:r>
-      <w:proofErr w:type="spellEnd"/>
-      <w:r>
-        <w:t xml:space="preserve"> = 0.51 mm h⁻¹ is 0.29 mm yr⁻¹ (about 22 µm in 28 days, roughly 3% mass loss), which is above the simulated rates. The reported results are therefore consistent with the equations as written, and Zn recession is not stoichiometrically coupled to O₂ consumption.</w:t>
-      </w:r>
-    </w:p>
-    <w:p>
-      <w:pPr>
-        <w:pStyle w:val="Captions"/>
-        <w:keepNext/>
-        <w:spacing w:before="360" w:after="80"/>
-        <w:rPr/>
-      </w:pPr>
-      <w:r>
-        <w:rPr>
-          <w:b/>
-          <w:bCs/>
-          <w:sz w:val="20"/>
-          <w:szCs w:val="20"/>
-        </w:rPr>
-        <w:lastRenderedPageBreak/>
-        <w:t xml:space="preserve">Table </w:t>
-      </w:r>
-      <w:r>
-        <w:rPr>
-          <w:b/>
-          <w:bCs/>
-          <w:sz w:val="20"/>
-          <w:szCs w:val="20"/>
-        </w:rPr>
-        <w:t>S</w:t>
-      </w:r>
-      <w:r>
-        <w:rPr>
-          <w:b/>
-          <w:bCs/>
-          <w:sz w:val="20"/>
-          <w:szCs w:val="20"/>
-        </w:rPr>
-        <w:fldChar w:fldCharType="begin"/>
-      </w:r>
-      <w:r>
-        <w:rPr>
-          <w:b/>
-          <w:bCs/>
-          <w:sz w:val="20"/>
-          <w:szCs w:val="20"/>
-        </w:rPr>
-        <w:instrText xml:space="preserve"> SEQ Table \* ARABIC </w:instrText>
-      </w:r>
-      <w:r>
-        <w:rPr>
-          <w:b/>
-          <w:bCs/>
-          <w:sz w:val="20"/>
-          <w:szCs w:val="20"/>
-        </w:rPr>
-        <w:fldChar w:fldCharType="separate"/>
-      </w:r>
-      <w:r>
-        <w:rPr>
-          <w:b/>
-          <w:bCs/>
-          <w:noProof/>
-          <w:sz w:val="20"/>
-          <w:szCs w:val="20"/>
-        </w:rPr>
-        <w:t>13</w:t>
-      </w:r>
-      <w:r>
-        <w:rPr>
-          <w:b/>
-          <w:bCs/>
-          <w:noProof/>
-          <w:sz w:val="20"/>
-          <w:szCs w:val="20"/>
-        </w:rPr>
-        <w:fldChar w:fldCharType="end"/>
-      </w:r>
-      <w:r>
-        <w:rPr>
-          <w:b/>
-          <w:bCs/>
-          <w:sz w:val="20"/>
-          <w:szCs w:val="20"/>
-        </w:rPr>
-        <w:t>.</w:t>
-      </w:r>
-      <w:r>
-        <w:rPr>
-          <w:sz w:val="20"/>
-          <w:szCs w:val="20"/>
-        </w:rPr>
-        <w:t xml:space="preserve"> Oxygen required for the Zn lost (stoichiometric) compared with the oxygen consumed at the interface in disc simulations at 24 h and 168 h. The last column is the ratio of the two.</w:t>
-      </w:r>
-    </w:p>
-    <w:tbl>
-      <w:tblPr>
-        <w:tblW w:w="9026" w:type="dxa"/>
-        <w:jc w:val="center"/>
-        <w:tblBorders>
-          <w:top w:val="single" w:sz="12" w:space="0" w:color="000000"/>
-          <w:bottom w:val="single" w:sz="12" w:space="0" w:color="000000"/>
-        </w:tblBorders>
-        <w:tblLayout w:type="fixed"/>
-        <w:tblCellMar>
-          <w:top w:w="30" w:type="dxa"/>
-          <w:left w:w="90" w:type="dxa"/>
-          <w:bottom w:w="30" w:type="dxa"/>
-          <w:right w:w="90" w:type="dxa"/>
-        </w:tblCellMar>
-        <w:tblLook w:val="04A0" w:firstRow="1" w:lastRow="0" w:firstColumn="1" w:lastColumn="0" w:noHBand="0" w:noVBand="1"/>
-      </w:tblPr>
-      <w:tblGrid>
-        <w:gridCol w:w="1250"/>
-        <w:gridCol w:w="2400"/>
-        <w:gridCol w:w="1700"/>
-        <w:gridCol w:w="1700"/>
-        <w:gridCol w:w="1976"/>
-      </w:tblGrid>
-      <w:tr>
-        <w:trPr>
-          <w:cantSplit/>
-          <w:tblHeader/>
-          <w:jc w:val="center"/>
-        </w:trPr>
-        <w:tc>
-          <w:tcPr>
-            <w:tcW w:w="1250" w:type="dxa"/>
-            <w:tcBorders>
-              <w:bottom w:val="single" w:sz="6" w:space="0" w:color="000000"/>
-            </w:tcBorders>
-            <w:vAlign w:val="center"/>
-          </w:tcPr>
-          <w:p>
-            <w:pPr>
-              <w:keepNext/>
-              <w:spacing w:before="20" w:after="20" w:line="240" w:lineRule="auto"/>
-              <w:ind w:firstLine="0"/>
-              <w:jc w:val="left"/>
-              <w:rPr>
-                <w:rFonts w:cs="Times New Roman"/>
-                <w:b/>
-                <w:bCs/>
-                <w:color w:val="000000"/>
-                <w:sz w:val="20"/>
-                <w:szCs w:val="20"/>
-                <w:lang w:eastAsia="en-US"/>
-              </w:rPr>
-            </w:pPr>
-            <w:r>
-              <w:rPr>
-                <w:rFonts w:cs="Times New Roman"/>
-                <w:b/>
-                <w:bCs/>
-                <w:color w:val="000000"/>
-                <w:sz w:val="20"/>
-                <w:szCs w:val="20"/>
-                <w:lang w:eastAsia="en-US"/>
-              </w:rPr>
-              <w:t>Run</w:t>
-            </w:r>
-          </w:p>
-        </w:tc>
-        <w:tc>
-          <w:tcPr>
-            <w:tcW w:w="2400" w:type="dxa"/>
-            <w:tcBorders>
-              <w:bottom w:val="single" w:sz="6" w:space="0" w:color="000000"/>
-            </w:tcBorders>
-            <w:vAlign w:val="center"/>
-          </w:tcPr>
-          <w:p>
-            <w:pPr>
-              <w:keepNext/>
-              <w:spacing w:before="20" w:after="20" w:line="240" w:lineRule="auto"/>
-              <w:ind w:firstLine="0"/>
-              <w:jc w:val="center"/>
-              <w:rPr>
-                <w:rFonts w:cs="Times New Roman"/>
-                <w:b/>
-                <w:bCs/>
-                <w:color w:val="000000"/>
-                <w:sz w:val="20"/>
-                <w:szCs w:val="20"/>
-                <w:lang w:eastAsia="en-US"/>
-              </w:rPr>
-            </w:pPr>
-            <w:r>
-              <w:rPr>
-                <w:rFonts w:cs="Times New Roman"/>
-                <w:b/>
-                <w:bCs/>
-                <w:color w:val="000000"/>
-                <w:sz w:val="20"/>
-                <w:szCs w:val="20"/>
-                <w:lang w:eastAsia="en-US"/>
-              </w:rPr>
-              <w:t>Time (h)</w:t>
-            </w:r>
-          </w:p>
-        </w:tc>
-        <w:tc>
-          <w:tcPr>
-            <w:tcW w:w="1700" w:type="dxa"/>
-            <w:tcBorders>
-              <w:bottom w:val="single" w:sz="6" w:space="0" w:color="000000"/>
-            </w:tcBorders>
-            <w:vAlign w:val="center"/>
-          </w:tcPr>
-          <w:p>
-            <w:pPr>
-              <w:keepNext/>
-              <w:spacing w:before="20" w:after="20" w:line="240" w:lineRule="auto"/>
-              <w:ind w:firstLine="0"/>
-              <w:jc w:val="center"/>
-              <w:rPr>
-                <w:rFonts w:cs="Times New Roman"/>
-                <w:b/>
-                <w:bCs/>
-                <w:color w:val="000000"/>
-                <w:sz w:val="20"/>
-                <w:szCs w:val="20"/>
-                <w:lang w:eastAsia="en-US"/>
-              </w:rPr>
-            </w:pPr>
-            <w:r>
-              <w:rPr>
-                <w:rFonts w:cs="Times New Roman"/>
-                <w:b/>
-                <w:bCs/>
-                <w:color w:val="000000"/>
-                <w:sz w:val="20"/>
-                <w:szCs w:val="20"/>
-                <w:lang w:eastAsia="en-US"/>
-              </w:rPr>
-              <w:t>O₂ required (µg)</w:t>
-            </w:r>
-          </w:p>
-        </w:tc>
-        <w:tc>
-          <w:tcPr>
-            <w:tcW w:w="1700" w:type="dxa"/>
-            <w:tcBorders>
-              <w:bottom w:val="single" w:sz="6" w:space="0" w:color="000000"/>
-            </w:tcBorders>
-            <w:vAlign w:val="center"/>
-          </w:tcPr>
-          <w:p>
-            <w:pPr>
-              <w:keepNext/>
-              <w:spacing w:before="20" w:after="20" w:line="240" w:lineRule="auto"/>
-              <w:ind w:firstLine="0"/>
-              <w:jc w:val="center"/>
-              <w:rPr>
-                <w:rFonts w:cs="Times New Roman"/>
-                <w:b/>
-                <w:bCs/>
-                <w:color w:val="000000"/>
-                <w:sz w:val="20"/>
-                <w:szCs w:val="20"/>
-                <w:lang w:eastAsia="en-US"/>
-              </w:rPr>
-            </w:pPr>
-            <w:r>
-              <w:rPr>
-                <w:rFonts w:cs="Times New Roman"/>
-                <w:b/>
-                <w:bCs/>
-                <w:color w:val="000000"/>
-                <w:sz w:val="20"/>
-                <w:szCs w:val="20"/>
-                <w:lang w:eastAsia="en-US"/>
-              </w:rPr>
-              <w:t>O₂ consumed (µg)</w:t>
-            </w:r>
-          </w:p>
-        </w:tc>
-        <w:tc>
-          <w:tcPr>
-            <w:tcW w:w="1976" w:type="dxa"/>
-            <w:tcBorders>
-              <w:bottom w:val="single" w:sz="6" w:space="0" w:color="000000"/>
-            </w:tcBorders>
-            <w:vAlign w:val="center"/>
-          </w:tcPr>
-          <w:p>
-            <w:pPr>
-              <w:keepNext/>
-              <w:spacing w:before="20" w:after="20" w:line="240" w:lineRule="auto"/>
-              <w:ind w:firstLine="0"/>
-              <w:jc w:val="center"/>
-              <w:rPr>
-                <w:rFonts w:cs="Times New Roman"/>
-                <w:b/>
-                <w:bCs/>
-                <w:color w:val="000000"/>
-                <w:sz w:val="20"/>
-                <w:szCs w:val="20"/>
-                <w:lang w:eastAsia="en-US"/>
-              </w:rPr>
-            </w:pPr>
-            <w:r>
-              <w:rPr>
-                <w:rFonts w:cs="Times New Roman"/>
-                <w:b/>
-                <w:bCs/>
-                <w:color w:val="000000"/>
-                <w:sz w:val="20"/>
-                <w:szCs w:val="20"/>
-                <w:lang w:eastAsia="en-US"/>
-              </w:rPr>
-              <w:t>Required/consumed</w:t>
-            </w:r>
-          </w:p>
-        </w:tc>
-      </w:tr>
-      <w:tr>
-        <w:trPr>
-          <w:cantSplit/>
-          <w:jc w:val="center"/>
-        </w:trPr>
-        <w:tc>
-          <w:tcPr>
-            <w:tcW w:w="1250" w:type="dxa"/>
-            <w:vAlign w:val="center"/>
-          </w:tcPr>
-          <w:p>
-            <w:pPr>
-              <w:keepNext/>
-              <w:spacing w:before="20" w:after="20" w:line="240" w:lineRule="auto"/>
-              <w:ind w:firstLine="0"/>
-              <w:jc w:val="left"/>
-              <w:rPr>
-                <w:rFonts w:cs="Times New Roman"/>
-                <w:color w:val="000000"/>
-                <w:sz w:val="20"/>
-                <w:szCs w:val="20"/>
-                <w:lang w:eastAsia="en-US"/>
-              </w:rPr>
-            </w:pPr>
-            <w:r>
-              <w:rPr>
-                <w:rFonts w:cs="Times New Roman"/>
-                <w:color w:val="000000"/>
-                <w:sz w:val="20"/>
-                <w:szCs w:val="20"/>
-                <w:lang w:eastAsia="en-US"/>
-              </w:rPr>
-              <w:t>Baseline (</w:t>
-            </w:r>
-            <w:proofErr w:type="spellStart"/>
-            <w:r>
-              <w:rPr>
-                <w:rFonts w:cs="Times New Roman"/>
-                <w:color w:val="000000"/>
-                <w:sz w:val="20"/>
-                <w:szCs w:val="20"/>
-                <w:lang w:eastAsia="en-US"/>
-              </w:rPr>
-              <w:t>k_ORR</w:t>
-            </w:r>
-            <w:proofErr w:type="spellEnd"/>
-            <w:r>
-              <w:rPr>
-                <w:rFonts w:cs="Times New Roman"/>
-                <w:color w:val="000000"/>
-                <w:sz w:val="20"/>
-                <w:szCs w:val="20"/>
-                <w:lang w:eastAsia="en-US"/>
-              </w:rPr>
-              <w:t xml:space="preserve"> 0.2)</w:t>
-            </w:r>
-          </w:p>
-        </w:tc>
-        <w:tc>
-          <w:tcPr>
-            <w:tcW w:w="2400" w:type="dxa"/>
-            <w:vAlign w:val="center"/>
-          </w:tcPr>
-          <w:p>
-            <w:pPr>
-              <w:keepNext/>
-              <w:spacing w:before="20" w:after="20" w:line="240" w:lineRule="auto"/>
-              <w:ind w:firstLine="0"/>
-              <w:jc w:val="center"/>
-              <w:rPr>
-                <w:rFonts w:cs="Times New Roman"/>
-                <w:color w:val="000000"/>
-                <w:sz w:val="20"/>
-                <w:szCs w:val="20"/>
-                <w:lang w:eastAsia="en-US"/>
-              </w:rPr>
-            </w:pPr>
-            <w:r>
-              <w:rPr>
-                <w:rFonts w:cs="Times New Roman"/>
-                <w:color w:val="000000"/>
-                <w:sz w:val="20"/>
-                <w:szCs w:val="20"/>
-                <w:lang w:eastAsia="en-US"/>
-              </w:rPr>
-              <w:t>24</w:t>
-            </w:r>
-          </w:p>
-        </w:tc>
-        <w:tc>
-          <w:tcPr>
-            <w:tcW w:w="1700" w:type="dxa"/>
-            <w:vAlign w:val="center"/>
-          </w:tcPr>
-          <w:p>
-            <w:pPr>
-              <w:keepNext/>
-              <w:spacing w:before="20" w:after="20" w:line="240" w:lineRule="auto"/>
-              <w:ind w:firstLine="0"/>
-              <w:jc w:val="center"/>
-              <w:rPr>
-                <w:rFonts w:cs="Times New Roman"/>
-                <w:color w:val="000000"/>
-                <w:sz w:val="20"/>
-                <w:szCs w:val="20"/>
-                <w:lang w:eastAsia="en-US"/>
-              </w:rPr>
-            </w:pPr>
-            <w:r>
-              <w:rPr>
-                <w:rFonts w:cs="Times New Roman"/>
-                <w:color w:val="000000"/>
-                <w:sz w:val="20"/>
-                <w:szCs w:val="20"/>
-                <w:lang w:eastAsia="en-US"/>
-              </w:rPr>
-              <w:t>82</w:t>
-            </w:r>
-          </w:p>
-        </w:tc>
-        <w:tc>
-          <w:tcPr>
-            <w:tcW w:w="1700" w:type="dxa"/>
-            <w:vAlign w:val="center"/>
-          </w:tcPr>
-          <w:p>
-            <w:pPr>
-              <w:keepNext/>
-              <w:spacing w:before="20" w:after="20" w:line="240" w:lineRule="auto"/>
-              <w:ind w:firstLine="0"/>
-              <w:jc w:val="center"/>
-              <w:rPr>
-                <w:rFonts w:cs="Times New Roman"/>
-                <w:color w:val="000000"/>
-                <w:sz w:val="20"/>
-                <w:szCs w:val="20"/>
-                <w:lang w:eastAsia="en-US"/>
-              </w:rPr>
-            </w:pPr>
-            <w:r>
-              <w:rPr>
-                <w:rFonts w:cs="Times New Roman"/>
-                <w:color w:val="000000"/>
-                <w:sz w:val="20"/>
-                <w:szCs w:val="20"/>
-                <w:lang w:eastAsia="en-US"/>
-              </w:rPr>
-              <w:t>2.6</w:t>
-            </w:r>
-          </w:p>
-        </w:tc>
-        <w:tc>
-          <w:tcPr>
-            <w:tcW w:w="1976" w:type="dxa"/>
-            <w:vAlign w:val="center"/>
-          </w:tcPr>
-          <w:p>
-            <w:pPr>
-              <w:keepNext/>
-              <w:spacing w:before="20" w:after="20" w:line="240" w:lineRule="auto"/>
-              <w:ind w:firstLine="0"/>
-              <w:jc w:val="center"/>
-              <w:rPr>
-                <w:rFonts w:cs="Times New Roman"/>
-                <w:color w:val="000000"/>
-                <w:sz w:val="20"/>
-                <w:szCs w:val="20"/>
-                <w:lang w:eastAsia="en-US"/>
-              </w:rPr>
-            </w:pPr>
-            <w:r>
-              <w:rPr>
-                <w:rFonts w:cs="Times New Roman"/>
-                <w:color w:val="000000"/>
-                <w:sz w:val="20"/>
-                <w:szCs w:val="20"/>
-                <w:lang w:eastAsia="en-US"/>
-              </w:rPr>
-              <w:t>31.9</w:t>
-            </w:r>
-          </w:p>
-        </w:tc>
-      </w:tr>
-      <w:tr>
-        <w:trPr>
-          <w:cantSplit/>
-          <w:jc w:val="center"/>
-        </w:trPr>
-        <w:tc>
-          <w:tcPr>
-            <w:tcW w:w="1250" w:type="dxa"/>
-            <w:vAlign w:val="center"/>
-          </w:tcPr>
-          <w:p>
-            <w:pPr>
-              <w:keepNext/>
-              <w:spacing w:before="20" w:after="20" w:line="240" w:lineRule="auto"/>
-              <w:ind w:firstLine="0"/>
-              <w:jc w:val="left"/>
-              <w:rPr>
-                <w:rFonts w:cs="Times New Roman"/>
-                <w:color w:val="000000"/>
-                <w:sz w:val="20"/>
-                <w:szCs w:val="20"/>
-                <w:lang w:eastAsia="en-US"/>
-              </w:rPr>
-            </w:pPr>
-            <w:r>
-              <w:rPr>
-                <w:rFonts w:cs="Times New Roman"/>
-                <w:color w:val="000000"/>
-                <w:sz w:val="20"/>
-                <w:szCs w:val="20"/>
-                <w:lang w:eastAsia="en-US"/>
-              </w:rPr>
-              <w:t>Baseline (</w:t>
-            </w:r>
-            <w:proofErr w:type="spellStart"/>
-            <w:r>
-              <w:rPr>
-                <w:rFonts w:cs="Times New Roman"/>
-                <w:color w:val="000000"/>
-                <w:sz w:val="20"/>
-                <w:szCs w:val="20"/>
-                <w:lang w:eastAsia="en-US"/>
-              </w:rPr>
-              <w:t>k_ORR</w:t>
-            </w:r>
-            <w:proofErr w:type="spellEnd"/>
-            <w:r>
-              <w:rPr>
-                <w:rFonts w:cs="Times New Roman"/>
-                <w:color w:val="000000"/>
-                <w:sz w:val="20"/>
-                <w:szCs w:val="20"/>
-                <w:lang w:eastAsia="en-US"/>
-              </w:rPr>
-              <w:t xml:space="preserve"> 0.2)</w:t>
-            </w:r>
-          </w:p>
-        </w:tc>
-        <w:tc>
-          <w:tcPr>
-            <w:tcW w:w="2400" w:type="dxa"/>
-            <w:vAlign w:val="center"/>
-          </w:tcPr>
-          <w:p>
-            <w:pPr>
-              <w:keepNext/>
-              <w:spacing w:before="20" w:after="20" w:line="240" w:lineRule="auto"/>
-              <w:ind w:firstLine="0"/>
-              <w:jc w:val="center"/>
-              <w:rPr>
-                <w:rFonts w:cs="Times New Roman"/>
-                <w:color w:val="000000"/>
-                <w:sz w:val="20"/>
-                <w:szCs w:val="20"/>
-                <w:lang w:eastAsia="en-US"/>
-              </w:rPr>
-            </w:pPr>
-            <w:r>
-              <w:rPr>
-                <w:rFonts w:cs="Times New Roman"/>
-                <w:color w:val="000000"/>
-                <w:sz w:val="20"/>
-                <w:szCs w:val="20"/>
-                <w:lang w:eastAsia="en-US"/>
-              </w:rPr>
-              <w:t>168</w:t>
-            </w:r>
-          </w:p>
-        </w:tc>
-        <w:tc>
-          <w:tcPr>
-            <w:tcW w:w="1700" w:type="dxa"/>
-            <w:vAlign w:val="center"/>
-          </w:tcPr>
-          <w:p>
-            <w:pPr>
-              <w:keepNext/>
-              <w:spacing w:before="20" w:after="20" w:line="240" w:lineRule="auto"/>
-              <w:ind w:firstLine="0"/>
-              <w:jc w:val="center"/>
-              <w:rPr>
-                <w:rFonts w:cs="Times New Roman"/>
-                <w:color w:val="000000"/>
-                <w:sz w:val="20"/>
-                <w:szCs w:val="20"/>
-                <w:lang w:eastAsia="en-US"/>
-              </w:rPr>
-            </w:pPr>
-            <w:r>
-              <w:rPr>
-                <w:rFonts w:cs="Times New Roman"/>
-                <w:color w:val="000000"/>
-                <w:sz w:val="20"/>
-                <w:szCs w:val="20"/>
-                <w:lang w:eastAsia="en-US"/>
-              </w:rPr>
-              <w:t>393</w:t>
-            </w:r>
-          </w:p>
-        </w:tc>
-        <w:tc>
-          <w:tcPr>
-            <w:tcW w:w="1700" w:type="dxa"/>
-            <w:vAlign w:val="center"/>
-          </w:tcPr>
-          <w:p>
-            <w:pPr>
-              <w:keepNext/>
-              <w:spacing w:before="20" w:after="20" w:line="240" w:lineRule="auto"/>
-              <w:ind w:firstLine="0"/>
-              <w:jc w:val="center"/>
-              <w:rPr>
-                <w:rFonts w:cs="Times New Roman"/>
-                <w:color w:val="000000"/>
-                <w:sz w:val="20"/>
-                <w:szCs w:val="20"/>
-                <w:lang w:eastAsia="en-US"/>
-              </w:rPr>
-            </w:pPr>
-            <w:r>
-              <w:rPr>
-                <w:rFonts w:cs="Times New Roman"/>
-                <w:color w:val="000000"/>
-                <w:sz w:val="20"/>
-                <w:szCs w:val="20"/>
-                <w:lang w:eastAsia="en-US"/>
-              </w:rPr>
-              <w:t>16.5</w:t>
-            </w:r>
-          </w:p>
-        </w:tc>
-        <w:tc>
-          <w:tcPr>
-            <w:tcW w:w="1976" w:type="dxa"/>
-            <w:vAlign w:val="center"/>
-          </w:tcPr>
-          <w:p>
-            <w:pPr>
-              <w:keepNext/>
-              <w:spacing w:before="20" w:after="20" w:line="240" w:lineRule="auto"/>
-              <w:ind w:firstLine="0"/>
-              <w:jc w:val="center"/>
-              <w:rPr>
-                <w:rFonts w:cs="Times New Roman"/>
-                <w:color w:val="000000"/>
-                <w:sz w:val="20"/>
-                <w:szCs w:val="20"/>
-                <w:lang w:eastAsia="en-US"/>
-              </w:rPr>
-            </w:pPr>
-            <w:r>
-              <w:rPr>
-                <w:rFonts w:cs="Times New Roman"/>
-                <w:color w:val="000000"/>
-                <w:sz w:val="20"/>
-                <w:szCs w:val="20"/>
-                <w:lang w:eastAsia="en-US"/>
-              </w:rPr>
-              <w:t>23.8</w:t>
-            </w:r>
-          </w:p>
-        </w:tc>
-      </w:tr>
-      <w:tr>
-        <w:trPr>
-          <w:cantSplit/>
-          <w:jc w:val="center"/>
-        </w:trPr>
-        <w:tc>
-          <w:tcPr>
-            <w:tcW w:w="1250" w:type="dxa"/>
-            <w:vAlign w:val="center"/>
-          </w:tcPr>
-          <w:p>
-            <w:pPr>
-              <w:keepNext/>
-              <w:spacing w:before="20" w:after="20" w:line="240" w:lineRule="auto"/>
-              <w:ind w:firstLine="0"/>
-              <w:jc w:val="left"/>
-              <w:rPr>
-                <w:rFonts w:cs="Times New Roman"/>
-                <w:color w:val="000000"/>
-                <w:sz w:val="20"/>
-                <w:szCs w:val="20"/>
-                <w:lang w:eastAsia="en-US"/>
-              </w:rPr>
-            </w:pPr>
-            <w:proofErr w:type="spellStart"/>
-            <w:r>
-              <w:rPr>
-                <w:rFonts w:cs="Times New Roman"/>
-                <w:color w:val="000000"/>
-                <w:sz w:val="20"/>
-                <w:szCs w:val="20"/>
-                <w:lang w:eastAsia="en-US"/>
-              </w:rPr>
-              <w:t>k_ORR</w:t>
-            </w:r>
-            <w:proofErr w:type="spellEnd"/>
-            <w:r>
-              <w:rPr>
-                <w:rFonts w:cs="Times New Roman"/>
-                <w:color w:val="000000"/>
-                <w:sz w:val="20"/>
-                <w:szCs w:val="20"/>
-                <w:lang w:eastAsia="en-US"/>
-              </w:rPr>
-              <w:t xml:space="preserve"> 0.04</w:t>
-            </w:r>
-          </w:p>
-        </w:tc>
-        <w:tc>
-          <w:tcPr>
-            <w:tcW w:w="2400" w:type="dxa"/>
-            <w:vAlign w:val="center"/>
-          </w:tcPr>
-          <w:p>
-            <w:pPr>
-              <w:keepNext/>
-              <w:spacing w:before="20" w:after="20" w:line="240" w:lineRule="auto"/>
-              <w:ind w:firstLine="0"/>
-              <w:jc w:val="center"/>
-              <w:rPr>
-                <w:rFonts w:cs="Times New Roman"/>
-                <w:color w:val="000000"/>
-                <w:sz w:val="20"/>
-                <w:szCs w:val="20"/>
-                <w:lang w:eastAsia="en-US"/>
-              </w:rPr>
-            </w:pPr>
-            <w:r>
-              <w:rPr>
-                <w:rFonts w:cs="Times New Roman"/>
-                <w:color w:val="000000"/>
-                <w:sz w:val="20"/>
-                <w:szCs w:val="20"/>
-                <w:lang w:eastAsia="en-US"/>
-              </w:rPr>
-              <w:t>24</w:t>
-            </w:r>
-          </w:p>
-        </w:tc>
-        <w:tc>
-          <w:tcPr>
-            <w:tcW w:w="1700" w:type="dxa"/>
-            <w:vAlign w:val="center"/>
-          </w:tcPr>
-          <w:p>
-            <w:pPr>
-              <w:keepNext/>
-              <w:spacing w:before="20" w:after="20" w:line="240" w:lineRule="auto"/>
-              <w:ind w:firstLine="0"/>
-              <w:jc w:val="center"/>
-              <w:rPr>
-                <w:rFonts w:cs="Times New Roman"/>
-                <w:color w:val="000000"/>
-                <w:sz w:val="20"/>
-                <w:szCs w:val="20"/>
-                <w:lang w:eastAsia="en-US"/>
-              </w:rPr>
-            </w:pPr>
-            <w:r>
-              <w:rPr>
-                <w:rFonts w:cs="Times New Roman"/>
-                <w:color w:val="000000"/>
-                <w:sz w:val="20"/>
-                <w:szCs w:val="20"/>
-                <w:lang w:eastAsia="en-US"/>
-              </w:rPr>
-              <w:t>17.5</w:t>
-            </w:r>
-          </w:p>
-        </w:tc>
-        <w:tc>
-          <w:tcPr>
-            <w:tcW w:w="1700" w:type="dxa"/>
-            <w:vAlign w:val="center"/>
-          </w:tcPr>
-          <w:p>
-            <w:pPr>
-              <w:keepNext/>
-              <w:spacing w:before="20" w:after="20" w:line="240" w:lineRule="auto"/>
-              <w:ind w:firstLine="0"/>
-              <w:jc w:val="center"/>
-              <w:rPr>
-                <w:rFonts w:cs="Times New Roman"/>
-                <w:color w:val="000000"/>
-                <w:sz w:val="20"/>
-                <w:szCs w:val="20"/>
-                <w:lang w:eastAsia="en-US"/>
-              </w:rPr>
-            </w:pPr>
-            <w:r>
-              <w:rPr>
-                <w:rFonts w:cs="Times New Roman"/>
-                <w:color w:val="000000"/>
-                <w:sz w:val="20"/>
-                <w:szCs w:val="20"/>
-                <w:lang w:eastAsia="en-US"/>
-              </w:rPr>
-              <w:t>0.5</w:t>
-            </w:r>
-          </w:p>
-        </w:tc>
-        <w:tc>
-          <w:tcPr>
-            <w:tcW w:w="1976" w:type="dxa"/>
-            <w:vAlign w:val="center"/>
-          </w:tcPr>
-          <w:p>
-            <w:pPr>
-              <w:keepNext/>
-              <w:spacing w:before="20" w:after="20" w:line="240" w:lineRule="auto"/>
-              <w:ind w:firstLine="0"/>
-              <w:jc w:val="center"/>
-              <w:rPr>
-                <w:rFonts w:cs="Times New Roman"/>
-                <w:color w:val="000000"/>
-                <w:sz w:val="20"/>
-                <w:szCs w:val="20"/>
-                <w:lang w:eastAsia="en-US"/>
-              </w:rPr>
-            </w:pPr>
-            <w:r>
-              <w:rPr>
-                <w:rFonts w:cs="Times New Roman"/>
-                <w:color w:val="000000"/>
-                <w:sz w:val="20"/>
-                <w:szCs w:val="20"/>
-                <w:lang w:eastAsia="en-US"/>
-              </w:rPr>
-              <w:t>32.0</w:t>
-            </w:r>
-          </w:p>
-        </w:tc>
-      </w:tr>
-      <w:tr>
-        <w:trPr>
-          <w:cantSplit/>
-          <w:jc w:val="center"/>
-        </w:trPr>
-        <w:tc>
-          <w:tcPr>
-            <w:tcW w:w="1250" w:type="dxa"/>
-            <w:vAlign w:val="center"/>
-          </w:tcPr>
-          <w:p>
-            <w:pPr>
-              <w:keepNext/>
-              <w:spacing w:before="20" w:after="20" w:line="240" w:lineRule="auto"/>
-              <w:ind w:firstLine="0"/>
-              <w:jc w:val="left"/>
-              <w:rPr>
-                <w:rFonts w:cs="Times New Roman"/>
-                <w:color w:val="000000"/>
-                <w:sz w:val="20"/>
-                <w:szCs w:val="20"/>
-                <w:lang w:eastAsia="en-US"/>
-              </w:rPr>
-            </w:pPr>
-            <w:proofErr w:type="spellStart"/>
-            <w:r>
-              <w:rPr>
-                <w:rFonts w:cs="Times New Roman"/>
-                <w:color w:val="000000"/>
-                <w:sz w:val="20"/>
-                <w:szCs w:val="20"/>
-                <w:lang w:eastAsia="en-US"/>
-              </w:rPr>
-              <w:t>k_ORR</w:t>
-            </w:r>
-            <w:proofErr w:type="spellEnd"/>
-            <w:r>
-              <w:rPr>
-                <w:rFonts w:cs="Times New Roman"/>
-                <w:color w:val="000000"/>
-                <w:sz w:val="20"/>
-                <w:szCs w:val="20"/>
-                <w:lang w:eastAsia="en-US"/>
-              </w:rPr>
-              <w:t xml:space="preserve"> 0.04</w:t>
-            </w:r>
-          </w:p>
-        </w:tc>
-        <w:tc>
-          <w:tcPr>
-            <w:tcW w:w="2400" w:type="dxa"/>
-            <w:vAlign w:val="center"/>
-          </w:tcPr>
-          <w:p>
-            <w:pPr>
-              <w:keepNext/>
-              <w:spacing w:before="20" w:after="20" w:line="240" w:lineRule="auto"/>
-              <w:ind w:firstLine="0"/>
-              <w:jc w:val="center"/>
-              <w:rPr>
-                <w:rFonts w:cs="Times New Roman"/>
-                <w:color w:val="000000"/>
-                <w:sz w:val="20"/>
-                <w:szCs w:val="20"/>
-                <w:lang w:eastAsia="en-US"/>
-              </w:rPr>
-            </w:pPr>
-            <w:r>
-              <w:rPr>
-                <w:rFonts w:cs="Times New Roman"/>
-                <w:color w:val="000000"/>
-                <w:sz w:val="20"/>
-                <w:szCs w:val="20"/>
-                <w:lang w:eastAsia="en-US"/>
-              </w:rPr>
-              <w:t>168</w:t>
-            </w:r>
-          </w:p>
-        </w:tc>
-        <w:tc>
-          <w:tcPr>
-            <w:tcW w:w="1700" w:type="dxa"/>
-            <w:vAlign w:val="center"/>
-          </w:tcPr>
-          <w:p>
-            <w:pPr>
-              <w:keepNext/>
-              <w:spacing w:before="20" w:after="20" w:line="240" w:lineRule="auto"/>
-              <w:ind w:firstLine="0"/>
-              <w:jc w:val="center"/>
-              <w:rPr>
-                <w:rFonts w:cs="Times New Roman"/>
-                <w:color w:val="000000"/>
-                <w:sz w:val="20"/>
-                <w:szCs w:val="20"/>
-                <w:lang w:eastAsia="en-US"/>
-              </w:rPr>
-            </w:pPr>
-            <w:r>
-              <w:rPr>
-                <w:rFonts w:cs="Times New Roman"/>
-                <w:color w:val="000000"/>
-                <w:sz w:val="20"/>
-                <w:szCs w:val="20"/>
-                <w:lang w:eastAsia="en-US"/>
-              </w:rPr>
-              <w:t>87</w:t>
-            </w:r>
-          </w:p>
-        </w:tc>
-        <w:tc>
-          <w:tcPr>
-            <w:tcW w:w="1700" w:type="dxa"/>
-            <w:vAlign w:val="center"/>
-          </w:tcPr>
-          <w:p>
-            <w:pPr>
-              <w:keepNext/>
-              <w:spacing w:before="20" w:after="20" w:line="240" w:lineRule="auto"/>
-              <w:ind w:firstLine="0"/>
-              <w:jc w:val="center"/>
-              <w:rPr>
-                <w:rFonts w:cs="Times New Roman"/>
-                <w:color w:val="000000"/>
-                <w:sz w:val="20"/>
-                <w:szCs w:val="20"/>
-                <w:lang w:eastAsia="en-US"/>
-              </w:rPr>
-            </w:pPr>
-            <w:r>
-              <w:rPr>
-                <w:rFonts w:cs="Times New Roman"/>
-                <w:color w:val="000000"/>
-                <w:sz w:val="20"/>
-                <w:szCs w:val="20"/>
-                <w:lang w:eastAsia="en-US"/>
-              </w:rPr>
-              <w:t>3.8</w:t>
-            </w:r>
-          </w:p>
-        </w:tc>
-        <w:tc>
-          <w:tcPr>
-            <w:tcW w:w="1976" w:type="dxa"/>
-            <w:vAlign w:val="center"/>
-          </w:tcPr>
-          <w:p>
-            <w:pPr>
-              <w:keepNext/>
-              <w:spacing w:before="20" w:after="20" w:line="240" w:lineRule="auto"/>
-              <w:ind w:firstLine="0"/>
-              <w:jc w:val="center"/>
-              <w:rPr>
-                <w:rFonts w:cs="Times New Roman"/>
-                <w:color w:val="000000"/>
-                <w:sz w:val="20"/>
-                <w:szCs w:val="20"/>
-                <w:lang w:eastAsia="en-US"/>
-              </w:rPr>
-            </w:pPr>
-            <w:r>
-              <w:rPr>
-                <w:rFonts w:cs="Times New Roman"/>
-                <w:color w:val="000000"/>
-                <w:sz w:val="20"/>
-                <w:szCs w:val="20"/>
-                <w:lang w:eastAsia="en-US"/>
-              </w:rPr>
-              <w:t>23.2</w:t>
-            </w:r>
-          </w:p>
-        </w:tc>
-      </w:tr>
-      <w:tr>
-        <w:trPr>
-          <w:cantSplit/>
-          <w:jc w:val="center"/>
-        </w:trPr>
-        <w:tc>
-          <w:tcPr>
-            <w:tcW w:w="1250" w:type="dxa"/>
-            <w:vAlign w:val="center"/>
-          </w:tcPr>
-          <w:p>
-            <w:pPr>
-              <w:keepNext/>
-              <w:spacing w:before="20" w:after="20" w:line="240" w:lineRule="auto"/>
-              <w:ind w:firstLine="0"/>
-              <w:jc w:val="left"/>
-              <w:rPr>
-                <w:rFonts w:cs="Times New Roman"/>
-                <w:color w:val="000000"/>
-                <w:sz w:val="20"/>
-                <w:szCs w:val="20"/>
-                <w:lang w:eastAsia="en-US"/>
-              </w:rPr>
-            </w:pPr>
-            <w:proofErr w:type="spellStart"/>
-            <w:r>
-              <w:rPr>
-                <w:rFonts w:cs="Times New Roman"/>
-                <w:color w:val="000000"/>
-                <w:sz w:val="20"/>
-                <w:szCs w:val="20"/>
-                <w:lang w:eastAsia="en-US"/>
-              </w:rPr>
-              <w:t>k_ORR</w:t>
-            </w:r>
-            <w:proofErr w:type="spellEnd"/>
-            <w:r>
-              <w:rPr>
-                <w:rFonts w:cs="Times New Roman"/>
-                <w:color w:val="000000"/>
-                <w:sz w:val="20"/>
-                <w:szCs w:val="20"/>
-                <w:lang w:eastAsia="en-US"/>
-              </w:rPr>
-              <w:t xml:space="preserve"> 1</w:t>
-            </w:r>
-          </w:p>
-        </w:tc>
-        <w:tc>
-          <w:tcPr>
-            <w:tcW w:w="2400" w:type="dxa"/>
-            <w:vAlign w:val="center"/>
-          </w:tcPr>
-          <w:p>
-            <w:pPr>
-              <w:keepNext/>
-              <w:spacing w:before="20" w:after="20" w:line="240" w:lineRule="auto"/>
-              <w:ind w:firstLine="0"/>
-              <w:jc w:val="center"/>
-              <w:rPr>
-                <w:rFonts w:cs="Times New Roman"/>
-                <w:color w:val="000000"/>
-                <w:sz w:val="20"/>
-                <w:szCs w:val="20"/>
-                <w:lang w:eastAsia="en-US"/>
-              </w:rPr>
-            </w:pPr>
-            <w:r>
-              <w:rPr>
-                <w:rFonts w:cs="Times New Roman"/>
-                <w:color w:val="000000"/>
-                <w:sz w:val="20"/>
-                <w:szCs w:val="20"/>
-                <w:lang w:eastAsia="en-US"/>
-              </w:rPr>
-              <w:t>24</w:t>
-            </w:r>
-          </w:p>
-        </w:tc>
-        <w:tc>
-          <w:tcPr>
-            <w:tcW w:w="1700" w:type="dxa"/>
-            <w:vAlign w:val="center"/>
-          </w:tcPr>
-          <w:p>
-            <w:pPr>
-              <w:keepNext/>
-              <w:spacing w:before="20" w:after="20" w:line="240" w:lineRule="auto"/>
-              <w:ind w:firstLine="0"/>
-              <w:jc w:val="center"/>
-              <w:rPr>
-                <w:rFonts w:cs="Times New Roman"/>
-                <w:color w:val="000000"/>
-                <w:sz w:val="20"/>
-                <w:szCs w:val="20"/>
-                <w:lang w:eastAsia="en-US"/>
-              </w:rPr>
-            </w:pPr>
-            <w:r>
-              <w:rPr>
-                <w:rFonts w:cs="Times New Roman"/>
-                <w:color w:val="000000"/>
-                <w:sz w:val="20"/>
-                <w:szCs w:val="20"/>
-                <w:lang w:eastAsia="en-US"/>
-              </w:rPr>
-              <w:t>330</w:t>
-            </w:r>
-          </w:p>
-        </w:tc>
-        <w:tc>
-          <w:tcPr>
-            <w:tcW w:w="1700" w:type="dxa"/>
-            <w:vAlign w:val="center"/>
-          </w:tcPr>
-          <w:p>
-            <w:pPr>
-              <w:keepNext/>
-              <w:spacing w:before="20" w:after="20" w:line="240" w:lineRule="auto"/>
-              <w:ind w:firstLine="0"/>
-              <w:jc w:val="center"/>
-              <w:rPr>
-                <w:rFonts w:cs="Times New Roman"/>
-                <w:color w:val="000000"/>
-                <w:sz w:val="20"/>
-                <w:szCs w:val="20"/>
-                <w:lang w:eastAsia="en-US"/>
-              </w:rPr>
-            </w:pPr>
-            <w:r>
-              <w:rPr>
-                <w:rFonts w:cs="Times New Roman"/>
-                <w:color w:val="000000"/>
-                <w:sz w:val="20"/>
-                <w:szCs w:val="20"/>
-                <w:lang w:eastAsia="en-US"/>
-              </w:rPr>
-              <w:t>10</w:t>
-            </w:r>
-          </w:p>
-        </w:tc>
-        <w:tc>
-          <w:tcPr>
-            <w:tcW w:w="1976" w:type="dxa"/>
-            <w:vAlign w:val="center"/>
-          </w:tcPr>
-          <w:p>
-            <w:pPr>
-              <w:keepNext/>
-              <w:spacing w:before="20" w:after="20" w:line="240" w:lineRule="auto"/>
-              <w:ind w:firstLine="0"/>
-              <w:jc w:val="center"/>
-              <w:rPr>
-                <w:rFonts w:cs="Times New Roman"/>
-                <w:color w:val="000000"/>
-                <w:sz w:val="20"/>
-                <w:szCs w:val="20"/>
-                <w:lang w:eastAsia="en-US"/>
-              </w:rPr>
-            </w:pPr>
-            <w:r>
-              <w:rPr>
-                <w:rFonts w:cs="Times New Roman"/>
-                <w:color w:val="000000"/>
-                <w:sz w:val="20"/>
-                <w:szCs w:val="20"/>
-                <w:lang w:eastAsia="en-US"/>
-              </w:rPr>
-              <w:t>32.9</w:t>
-            </w:r>
-          </w:p>
-        </w:tc>
-      </w:tr>
-      <w:tr>
-        <w:trPr>
-          <w:cantSplit/>
-          <w:jc w:val="center"/>
-        </w:trPr>
-        <w:tc>
-          <w:tcPr>
-            <w:tcW w:w="1250" w:type="dxa"/>
-            <w:vAlign w:val="center"/>
-          </w:tcPr>
-          <w:p>
-            <w:pPr>
-              <w:keepNext/>
-              <w:spacing w:before="20" w:after="20" w:line="240" w:lineRule="auto"/>
-              <w:ind w:firstLine="0"/>
-              <w:jc w:val="left"/>
-              <w:rPr>
-                <w:rFonts w:cs="Times New Roman"/>
-                <w:color w:val="000000"/>
-                <w:sz w:val="20"/>
-                <w:szCs w:val="20"/>
-                <w:lang w:eastAsia="en-US"/>
-              </w:rPr>
-            </w:pPr>
-            <w:proofErr w:type="spellStart"/>
-            <w:r>
-              <w:rPr>
-                <w:rFonts w:cs="Times New Roman"/>
-                <w:color w:val="000000"/>
-                <w:sz w:val="20"/>
-                <w:szCs w:val="20"/>
-                <w:lang w:eastAsia="en-US"/>
-              </w:rPr>
-              <w:t>k_ORR</w:t>
-            </w:r>
-            <w:proofErr w:type="spellEnd"/>
-            <w:r>
-              <w:rPr>
-                <w:rFonts w:cs="Times New Roman"/>
-                <w:color w:val="000000"/>
-                <w:sz w:val="20"/>
-                <w:szCs w:val="20"/>
-                <w:lang w:eastAsia="en-US"/>
-              </w:rPr>
-              <w:t xml:space="preserve"> 1</w:t>
-            </w:r>
-          </w:p>
-        </w:tc>
-        <w:tc>
-          <w:tcPr>
-            <w:tcW w:w="2400" w:type="dxa"/>
-            <w:vAlign w:val="center"/>
-          </w:tcPr>
-          <w:p>
-            <w:pPr>
-              <w:keepNext/>
-              <w:spacing w:before="20" w:after="20" w:line="240" w:lineRule="auto"/>
-              <w:ind w:firstLine="0"/>
-              <w:jc w:val="center"/>
-              <w:rPr>
-                <w:rFonts w:cs="Times New Roman"/>
-                <w:color w:val="000000"/>
-                <w:sz w:val="20"/>
-                <w:szCs w:val="20"/>
-                <w:lang w:eastAsia="en-US"/>
-              </w:rPr>
-            </w:pPr>
-            <w:r>
-              <w:rPr>
-                <w:rFonts w:cs="Times New Roman"/>
-                <w:color w:val="000000"/>
-                <w:sz w:val="20"/>
-                <w:szCs w:val="20"/>
-                <w:lang w:eastAsia="en-US"/>
-              </w:rPr>
-              <w:t>168</w:t>
-            </w:r>
-          </w:p>
-        </w:tc>
-        <w:tc>
-          <w:tcPr>
-            <w:tcW w:w="1700" w:type="dxa"/>
-            <w:vAlign w:val="center"/>
-          </w:tcPr>
-          <w:p>
-            <w:pPr>
-              <w:keepNext/>
-              <w:spacing w:before="20" w:after="20" w:line="240" w:lineRule="auto"/>
-              <w:ind w:firstLine="0"/>
-              <w:jc w:val="center"/>
-              <w:rPr>
-                <w:rFonts w:cs="Times New Roman"/>
-                <w:color w:val="000000"/>
-                <w:sz w:val="20"/>
-                <w:szCs w:val="20"/>
-                <w:lang w:eastAsia="en-US"/>
-              </w:rPr>
-            </w:pPr>
-            <w:r>
-              <w:rPr>
-                <w:rFonts w:cs="Times New Roman"/>
-                <w:color w:val="000000"/>
-                <w:sz w:val="20"/>
-                <w:szCs w:val="20"/>
-                <w:lang w:eastAsia="en-US"/>
-              </w:rPr>
-              <w:t>1239</w:t>
-            </w:r>
-          </w:p>
-        </w:tc>
-        <w:tc>
-          <w:tcPr>
-            <w:tcW w:w="1700" w:type="dxa"/>
-            <w:vAlign w:val="center"/>
-          </w:tcPr>
-          <w:p>
-            <w:pPr>
-              <w:keepNext/>
-              <w:spacing w:before="20" w:after="20" w:line="240" w:lineRule="auto"/>
-              <w:ind w:firstLine="0"/>
-              <w:jc w:val="center"/>
-              <w:rPr>
-                <w:rFonts w:cs="Times New Roman"/>
-                <w:color w:val="000000"/>
-                <w:sz w:val="20"/>
-                <w:szCs w:val="20"/>
-                <w:lang w:eastAsia="en-US"/>
-              </w:rPr>
-            </w:pPr>
-            <w:r>
-              <w:rPr>
-                <w:rFonts w:cs="Times New Roman"/>
-                <w:color w:val="000000"/>
-                <w:sz w:val="20"/>
-                <w:szCs w:val="20"/>
-                <w:lang w:eastAsia="en-US"/>
-              </w:rPr>
-              <w:t>50</w:t>
-            </w:r>
-          </w:p>
-        </w:tc>
-        <w:tc>
-          <w:tcPr>
-            <w:tcW w:w="1976" w:type="dxa"/>
-            <w:vAlign w:val="center"/>
-          </w:tcPr>
-          <w:p>
-            <w:pPr>
-              <w:keepNext/>
-              <w:spacing w:before="20" w:after="20" w:line="240" w:lineRule="auto"/>
-              <w:ind w:firstLine="0"/>
-              <w:jc w:val="center"/>
-              <w:rPr>
-                <w:rFonts w:cs="Times New Roman"/>
-                <w:color w:val="000000"/>
-                <w:sz w:val="20"/>
-                <w:szCs w:val="20"/>
-                <w:lang w:eastAsia="en-US"/>
-              </w:rPr>
-            </w:pPr>
-            <w:r>
-              <w:rPr>
-                <w:rFonts w:cs="Times New Roman"/>
-                <w:color w:val="000000"/>
-                <w:sz w:val="20"/>
-                <w:szCs w:val="20"/>
-                <w:lang w:eastAsia="en-US"/>
-              </w:rPr>
-              <w:t>24.8</w:t>
-            </w:r>
-          </w:p>
-        </w:tc>
-      </w:tr>
-    </w:tbl>
     <w:p>
       <w:pPr>
         <w:pStyle w:val="Heading1"/>

</xml_diff>